<commit_message>
Statusnummern Administration und Support: #958–#960 → #966–#968
Grund: Kollision mit den Nummern #958–#965, die andere Sitzungen auf origin/ios_migration_september vergeben haben.

Co-Authored-By: Claude Sonnet 5.5 <noreply@anthropic.com>
Claude-Session: https://claude.ai/code/session_01PzsmhcNTFHLG2LbqBRVAsq
</commit_message>
<xml_diff>
--- a/Dokumentation/aktuell/Entwicklerhandbuch_Administration_Support_EPOS-Plan.docx
+++ b/Dokumentation/aktuell/Entwicklerhandbuch_Administration_Support_EPOS-Plan.docx
@@ -99,7 +99,7 @@
         <w:t xml:space="preserve">Stand.</w:t>
       </w:r>
       <w:r>
-        <w:t xml:space="preserve"> 11.10.2026, Stufe 1 ist umgesetzt (11.10.2026, #960; offen: Nachzug Zapfprofil-Vorgaben als Anwenderrubrik, Entscheid 11.10.2026); Konzeptstand nach den Anwenderentscheiden AS-Q1 bis AS-Q10 (</w:t>
+        <w:t xml:space="preserve"> 11.10.2026, Stufe 1 ist umgesetzt (11.10.2026, #968; offen: Nachzug Zapfprofil-Vorgaben als Anwenderrubrik, Entscheid 11.10.2026); Konzeptstand nach den Anwenderentscheiden AS-Q1 bis AS-Q10 (</w:t>
       </w:r>
       <w:r>
         <w:rPr>
@@ -9243,7 +9243,7 @@
                 <w:sz w:val="19"/>
                 <w:szCs w:val="19"/>
               </w:rPr>
-              <w:t xml:space="preserve">umgesetzt (11.10.2026, #960); </w:t>
+              <w:t xml:space="preserve">umgesetzt (11.10.2026, #968); </w:t>
             </w:r>
             <w:r>
               <w:rPr>

</xml_diff>

<commit_message>
Entwicklerhandbuch: Word-Fassung nach Stufe 2
Aus der Markdown-Quelle neu erzeugt (Stand Stufen 1 und 2 umgesetzt).

Co-Authored-By: Claude Fable 5.1 <noreply@anthropic.com>
Claude-Session: https://claude.ai/code/session_01PzsmhcNTFHLG2LbqBRVAsq
</commit_message>
<xml_diff>
--- a/Dokumentation/aktuell/Entwicklerhandbuch_Administration_Support_EPOS-Plan.docx
+++ b/Dokumentation/aktuell/Entwicklerhandbuch_Administration_Support_EPOS-Plan.docx
@@ -99,7 +99,7 @@
         <w:t xml:space="preserve">Stand.</w:t>
       </w:r>
       <w:r>
-        <w:t xml:space="preserve"> 11.10.2026, Stufe 1 ist umgesetzt (11.10.2026, #968; offen: Nachzug Zapfprofil-Vorgaben als Anwenderrubrik, Entscheid 11.10.2026); Konzeptstand nach den Anwenderentscheiden AS-Q1 bis AS-Q10 (</w:t>
+        <w:t xml:space="preserve"> 11.10.2026, Stufen 1 und 2 umgesetzt (11.10.2026, #968 und #969); Nachzug Zapfprofil-Vorgaben offen (Anwenderrubrik, Entscheid 11.10.2026); Konzeptstand nach den Anwenderentscheiden AS-Q1 bis AS-Q10 (</w:t>
       </w:r>
       <w:r>
         <w:rPr>
@@ -5843,7 +5843,7 @@
         <w:t xml:space="preserve">Hilfe → Fernwartung…</w:t>
       </w:r>
       <w:r>
-        <w:t xml:space="preserve"> öffnet den Dialog: Kontakt, die Angaben für den Support (Abschnitt 3.3), der Erklärtext und der Knopf „Fernwartungsseite öffnen". Ohne bezahlte Lizenz ist der Knopf gesperrt, der Grund steht dabei (Abschnitt 4.4).</w:t>
+        <w:t xml:space="preserve"> öffnet den Dialog: Kontakt, die Angaben für den Support (Abschnitt 3.3), der Erklärtext und der Knopf „Fernwartungsseite öffnen". Ohne bezahlte Lizenz ist der Knopf gesperrt, der Grund steht dabei (Abschnitt 4.4). Telefon und E-Mail (Link) stehen im Dialog immer.</w:t>
       </w:r>
     </w:p>
     <w:p>
@@ -5971,6 +5971,52 @@
         <w:spacing w:after="60"/>
       </w:pPr>
       <w:r>
+        <w:t xml:space="preserve">Ob der Anwender die Fernwartung nutzen darf, prüft der Support an </w:t>
+      </w:r>
+      <w:r>
+        <w:rPr>
+          <w:rFonts w:ascii="Consolas" w:cs="Consolas" w:eastAsia="Consolas" w:hAnsi="Consolas"/>
+          <w:sz w:val="20"/>
+          <w:szCs w:val="20"/>
+        </w:rPr>
+        <w:t xml:space="preserve">LizenzCtrl.FernwartungErlaubt()</w:t>
+      </w:r>
+      <w:r>
+        <w:t xml:space="preserve"> (Erlaubt, Grund) oder am Menüpunkt: ist er gesperrt, steht der Grund im Tooltip. Ist die Lage unklar, lässt er sich den Diagnoseblock aus dem Dialog (Knopf „Kopieren“) per E-Mail schicken. Führt der Knopf ins Leere, fehlt die Fernwartungsseite </w:t>
+      </w:r>
+      <w:r>
+        <w:rPr>
+          <w:rFonts w:ascii="Consolas" w:cs="Consolas" w:eastAsia="Consolas" w:hAnsi="Consolas"/>
+          <w:sz w:val="20"/>
+          <w:szCs w:val="20"/>
+        </w:rPr>
+        <w:t xml:space="preserve">Fernwartung.SEITE</w:t>
+      </w:r>
+      <w:r>
+        <w:t xml:space="preserve"> (</w:t>
+      </w:r>
+      <w:r>
+        <w:rPr>
+          <w:rFonts w:ascii="Consolas" w:cs="Consolas" w:eastAsia="Consolas" w:hAnsi="Consolas"/>
+          <w:sz w:val="20"/>
+          <w:szCs w:val="20"/>
+        </w:rPr>
+        <w:t xml:space="preserve">EPOS.Kern/Allgemein/Support/Fernwartung.cs</w:t>
+      </w:r>
+      <w:r>
+        <w:t xml:space="preserve">) bei INEKON: Seite und Client prüfen (4.6) und bis dahin den Weg Telefon und E-Mail nehmen.</w:t>
+      </w:r>
+    </w:p>
+    <w:p>
+      <w:pPr>
+        <w:pStyle w:val="ListParagraph"/>
+        <w:numPr>
+          <w:ilvl w:val="0"/>
+          <w:numId w:val="5"/>
+        </w:numPr>
+        <w:spacing w:after="60"/>
+      </w:pPr>
+      <w:r>
         <w:t xml:space="preserve">Nach der Sitzung: kein Eintrag in EPOS-Plan; das Sitzungsprotokoll der Web-Konsole (wer wann mit wem) ist die einzige Aufzeichnung.</w:t>
       </w:r>
     </w:p>
@@ -6020,6 +6066,17 @@
         <w:t xml:space="preserve">demo</w:t>
       </w:r>
       <w:r>
+        <w:t xml:space="preserve">, Grund </w:t>
+      </w:r>
+      <w:r>
+        <w:rPr>
+          <w:rFonts w:ascii="Consolas" w:cs="Consolas" w:eastAsia="Consolas" w:hAnsi="Consolas"/>
+          <w:sz w:val="20"/>
+          <w:szCs w:val="20"/>
+        </w:rPr>
+        <w:t xml:space="preserve">FW_SPERRE_TEST</w:t>
+      </w:r>
+      <w:r>
         <w:t xml:space="preserve">), ohne Aktivierung (</w:t>
       </w:r>
       <w:r>
@@ -6031,7 +6088,18 @@
         <w:t xml:space="preserve">NichtAktiviert</w:t>
       </w:r>
       <w:r>
-        <w:t xml:space="preserve">) und bei manipulierter Uhr (</w:t>
+        <w:t xml:space="preserve">, Grund </w:t>
+      </w:r>
+      <w:r>
+        <w:rPr>
+          <w:rFonts w:ascii="Consolas" w:cs="Consolas" w:eastAsia="Consolas" w:hAnsi="Consolas"/>
+          <w:sz w:val="20"/>
+          <w:szCs w:val="20"/>
+        </w:rPr>
+        <w:t xml:space="preserve">FW_SPERRE_LIZENZ</w:t>
+      </w:r>
+      <w:r>
+        <w:t xml:space="preserve">), bei manipulierter Uhr (</w:t>
       </w:r>
       <w:r>
         <w:rPr>
@@ -6042,7 +6110,7 @@
         <w:t xml:space="preserve">UhrManipuliert</w:t>
       </w:r>
       <w:r>
-        <w:t xml:space="preserve">). Für diese Fälle gilt Telefon und E-Mail mit Diagnosedaten; eine Testversion bekommt keine Fernwartung. Die Frage stellt </w:t>
+        <w:t xml:space="preserve">), bei unbekanntem Lizenztyp und bei einem Token eines fremden Geräts. Für diese Fälle gilt Telefon und E-Mail mit Diagnosedaten; eine Testversion bekommt keine Fernwartung. Die Frage stellt </w:t>
       </w:r>
       <w:r>
         <w:rPr>
@@ -6050,10 +6118,21 @@
           <w:sz w:val="20"/>
           <w:szCs w:val="20"/>
         </w:rPr>
-        <w:t xml:space="preserve">LizenzCtrl.FernwartungErlaubt(LizenzLage)</w:t>
-      </w:r>
-      <w:r>
-        <w:t xml:space="preserve">; ein Supportvertrag im Token (</w:t>
+        <w:t xml:space="preserve">LizenzCtrl.FernwartungErlaubt()</w:t>
+      </w:r>
+      <w:r>
+        <w:t xml:space="preserve"> (ohne Nebenwirkung, liefert </w:t>
+      </w:r>
+      <w:r>
+        <w:rPr>
+          <w:rFonts w:ascii="Consolas" w:cs="Consolas" w:eastAsia="Consolas" w:hAnsi="Consolas"/>
+          <w:sz w:val="20"/>
+          <w:szCs w:val="20"/>
+        </w:rPr>
+        <w:t xml:space="preserve">Fernwartungsfreigabe(Erlaubt, Grund)</w:t>
+      </w:r>
+      <w:r>
+        <w:t xml:space="preserve">); ein Supportvertrag im Token (</w:t>
       </w:r>
       <w:r>
         <w:rPr>
@@ -8747,7 +8826,37 @@
                 <w:sz w:val="19"/>
                 <w:szCs w:val="19"/>
               </w:rPr>
-              <w:t xml:space="preserve">, Hülle </w:t>
+              <w:t xml:space="preserve">, </w:t>
+            </w:r>
+            <w:r>
+              <w:rPr>
+                <w:rFonts w:ascii="Consolas" w:cs="Consolas" w:eastAsia="Consolas" w:hAnsi="Consolas"/>
+                <w:sz w:val="18"/>
+                <w:szCs w:val="18"/>
+              </w:rPr>
+              <w:t xml:space="preserve">FernwartungDaten.cs</w:t>
+            </w:r>
+            <w:r>
+              <w:rPr>
+                <w:sz w:val="19"/>
+                <w:szCs w:val="19"/>
+              </w:rPr>
+              <w:t xml:space="preserve"> (mit </w:t>
+            </w:r>
+            <w:r>
+              <w:rPr>
+                <w:rFonts w:ascii="Consolas" w:cs="Consolas" w:eastAsia="Consolas" w:hAnsi="Consolas"/>
+                <w:sz w:val="18"/>
+                <w:szCs w:val="18"/>
+              </w:rPr>
+              <w:t xml:space="preserve">FernwartungTexte</w:t>
+            </w:r>
+            <w:r>
+              <w:rPr>
+                <w:sz w:val="19"/>
+                <w:szCs w:val="19"/>
+              </w:rPr>
+              <w:t xml:space="preserve">), Hülle </w:t>
             </w:r>
             <w:r>
               <w:rPr>
@@ -8756,6 +8865,599 @@
                 <w:szCs w:val="18"/>
               </w:rPr>
               <w:t xml:space="preserve">EPOS.UI.Daten/Hilfe/FernwartungHuelle.cs</w:t>
+            </w:r>
+            <w:r>
+              <w:rPr>
+                <w:sz w:val="19"/>
+                <w:szCs w:val="19"/>
+              </w:rPr>
+              <w:t xml:space="preserve">, Fenster </w:t>
+            </w:r>
+            <w:r>
+              <w:rPr>
+                <w:rFonts w:ascii="Consolas" w:cs="Consolas" w:eastAsia="Consolas" w:hAnsi="Consolas"/>
+                <w:sz w:val="18"/>
+                <w:szCs w:val="18"/>
+              </w:rPr>
+              <w:t xml:space="preserve">WindowsFormsApplication1/Views/Help/FernwartungFenster.cs</w:t>
+            </w:r>
+          </w:p>
+        </w:tc>
+        <w:tc>
+          <w:tcPr>
+            <w:tcW w:type="dxa" w:w="547"/>
+            <w:tcBorders>
+              <w:top w:val="single" w:color="A6A6A6" w:sz="4"/>
+              <w:left w:val="single" w:color="A6A6A6" w:sz="4"/>
+              <w:bottom w:val="single" w:color="A6A6A6" w:sz="4"/>
+              <w:right w:val="single" w:color="A6A6A6" w:sz="4"/>
+            </w:tcBorders>
+            <w:tcMar>
+              <w:top w:type="dxa" w:w="50"/>
+              <w:left w:type="dxa" w:w="90"/>
+              <w:bottom w:type="dxa" w:w="50"/>
+              <w:right w:type="dxa" w:w="90"/>
+            </w:tcMar>
+          </w:tcPr>
+          <w:p>
+            <w:pPr>
+              <w:spacing w:after="0"/>
+            </w:pPr>
+            <w:r>
+              <w:rPr>
+                <w:sz w:val="19"/>
+                <w:szCs w:val="19"/>
+              </w:rPr>
+              <w:t xml:space="preserve">2</w:t>
+            </w:r>
+          </w:p>
+        </w:tc>
+      </w:tr>
+      <w:tr>
+        <w:trPr>
+          <w:cantSplit/>
+          <w:tblHeader w:val="false"/>
+        </w:trPr>
+        <w:tc>
+          <w:tcPr>
+            <w:tcW w:type="dxa" w:w="3636"/>
+            <w:tcBorders>
+              <w:top w:val="single" w:color="A6A6A6" w:sz="4"/>
+              <w:left w:val="single" w:color="A6A6A6" w:sz="4"/>
+              <w:bottom w:val="single" w:color="A6A6A6" w:sz="4"/>
+              <w:right w:val="single" w:color="A6A6A6" w:sz="4"/>
+            </w:tcBorders>
+            <w:tcMar>
+              <w:top w:type="dxa" w:w="50"/>
+              <w:left w:type="dxa" w:w="90"/>
+              <w:bottom w:type="dxa" w:w="50"/>
+              <w:right w:type="dxa" w:w="90"/>
+            </w:tcMar>
+          </w:tcPr>
+          <w:p>
+            <w:pPr>
+              <w:spacing w:after="0"/>
+            </w:pPr>
+            <w:r>
+              <w:rPr>
+                <w:sz w:val="19"/>
+                <w:szCs w:val="19"/>
+              </w:rPr>
+              <w:t xml:space="preserve">Fernwartungsregel, Adresse</w:t>
+            </w:r>
+          </w:p>
+        </w:tc>
+        <w:tc>
+          <w:tcPr>
+            <w:tcW w:type="dxa" w:w="5455"/>
+            <w:tcBorders>
+              <w:top w:val="single" w:color="A6A6A6" w:sz="4"/>
+              <w:left w:val="single" w:color="A6A6A6" w:sz="4"/>
+              <w:bottom w:val="single" w:color="A6A6A6" w:sz="4"/>
+              <w:right w:val="single" w:color="A6A6A6" w:sz="4"/>
+            </w:tcBorders>
+            <w:tcMar>
+              <w:top w:type="dxa" w:w="50"/>
+              <w:left w:type="dxa" w:w="90"/>
+              <w:bottom w:type="dxa" w:w="50"/>
+              <w:right w:type="dxa" w:w="90"/>
+            </w:tcMar>
+          </w:tcPr>
+          <w:p>
+            <w:pPr>
+              <w:spacing w:after="0"/>
+            </w:pPr>
+            <w:r>
+              <w:rPr>
+                <w:rFonts w:ascii="Consolas" w:cs="Consolas" w:eastAsia="Consolas" w:hAnsi="Consolas"/>
+                <w:sz w:val="18"/>
+                <w:szCs w:val="18"/>
+              </w:rPr>
+              <w:t xml:space="preserve">EPOS.Kern/Allgemein/Support/Fernwartung.cs</w:t>
+            </w:r>
+            <w:r>
+              <w:rPr>
+                <w:sz w:val="19"/>
+                <w:szCs w:val="19"/>
+              </w:rPr>
+              <w:t xml:space="preserve"> (</w:t>
+            </w:r>
+            <w:r>
+              <w:rPr>
+                <w:rFonts w:ascii="Consolas" w:cs="Consolas" w:eastAsia="Consolas" w:hAnsi="Consolas"/>
+                <w:sz w:val="18"/>
+                <w:szCs w:val="18"/>
+              </w:rPr>
+              <w:t xml:space="preserve">SEITE</w:t>
+            </w:r>
+            <w:r>
+              <w:rPr>
+                <w:sz w:val="19"/>
+                <w:szCs w:val="19"/>
+              </w:rPr>
+              <w:t xml:space="preserve">, </w:t>
+            </w:r>
+            <w:r>
+              <w:rPr>
+                <w:rFonts w:ascii="Consolas" w:cs="Consolas" w:eastAsia="Consolas" w:hAnsi="Consolas"/>
+                <w:sz w:val="18"/>
+                <w:szCs w:val="18"/>
+              </w:rPr>
+              <w:t xml:space="preserve">Fernwartungsfreigabe</w:t>
+            </w:r>
+            <w:r>
+              <w:rPr>
+                <w:sz w:val="19"/>
+                <w:szCs w:val="19"/>
+              </w:rPr>
+              <w:t xml:space="preserve">), </w:t>
+            </w:r>
+            <w:r>
+              <w:rPr>
+                <w:rFonts w:ascii="Consolas" w:cs="Consolas" w:eastAsia="Consolas" w:hAnsi="Consolas"/>
+                <w:sz w:val="18"/>
+                <w:szCs w:val="18"/>
+              </w:rPr>
+              <w:t xml:space="preserve">EPOS.Kern/Controller/LizenzCtrl.cs</w:t>
+            </w:r>
+            <w:r>
+              <w:rPr>
+                <w:sz w:val="19"/>
+                <w:szCs w:val="19"/>
+              </w:rPr>
+              <w:t xml:space="preserve"> (</w:t>
+            </w:r>
+            <w:r>
+              <w:rPr>
+                <w:rFonts w:ascii="Consolas" w:cs="Consolas" w:eastAsia="Consolas" w:hAnsi="Consolas"/>
+                <w:sz w:val="18"/>
+                <w:szCs w:val="18"/>
+              </w:rPr>
+              <w:t xml:space="preserve">FernwartungErlaubt</w:t>
+            </w:r>
+            <w:r>
+              <w:rPr>
+                <w:sz w:val="19"/>
+                <w:szCs w:val="19"/>
+              </w:rPr>
+              <w:t xml:space="preserve">), </w:t>
+            </w:r>
+            <w:r>
+              <w:rPr>
+                <w:rFonts w:ascii="Consolas" w:cs="Consolas" w:eastAsia="Consolas" w:hAnsi="Consolas"/>
+                <w:sz w:val="18"/>
+                <w:szCs w:val="18"/>
+              </w:rPr>
+              <w:t xml:space="preserve">LizenzManager.AnkerOhneSchreiben</w:t>
+            </w:r>
+          </w:p>
+        </w:tc>
+        <w:tc>
+          <w:tcPr>
+            <w:tcW w:type="dxa" w:w="547"/>
+            <w:tcBorders>
+              <w:top w:val="single" w:color="A6A6A6" w:sz="4"/>
+              <w:left w:val="single" w:color="A6A6A6" w:sz="4"/>
+              <w:bottom w:val="single" w:color="A6A6A6" w:sz="4"/>
+              <w:right w:val="single" w:color="A6A6A6" w:sz="4"/>
+            </w:tcBorders>
+            <w:tcMar>
+              <w:top w:type="dxa" w:w="50"/>
+              <w:left w:type="dxa" w:w="90"/>
+              <w:bottom w:type="dxa" w:w="50"/>
+              <w:right w:type="dxa" w:w="90"/>
+            </w:tcMar>
+          </w:tcPr>
+          <w:p>
+            <w:pPr>
+              <w:spacing w:after="0"/>
+            </w:pPr>
+            <w:r>
+              <w:rPr>
+                <w:sz w:val="19"/>
+                <w:szCs w:val="19"/>
+              </w:rPr>
+              <w:t xml:space="preserve">2</w:t>
+            </w:r>
+          </w:p>
+        </w:tc>
+      </w:tr>
+      <w:tr>
+        <w:trPr>
+          <w:cantSplit/>
+          <w:tblHeader w:val="false"/>
+        </w:trPr>
+        <w:tc>
+          <w:tcPr>
+            <w:tcW w:type="dxa" w:w="3636"/>
+            <w:tcBorders>
+              <w:top w:val="single" w:color="A6A6A6" w:sz="4"/>
+              <w:left w:val="single" w:color="A6A6A6" w:sz="4"/>
+              <w:bottom w:val="single" w:color="A6A6A6" w:sz="4"/>
+              <w:right w:val="single" w:color="A6A6A6" w:sz="4"/>
+            </w:tcBorders>
+            <w:tcMar>
+              <w:top w:type="dxa" w:w="50"/>
+              <w:left w:type="dxa" w:w="90"/>
+              <w:bottom w:type="dxa" w:w="50"/>
+              <w:right w:type="dxa" w:w="90"/>
+            </w:tcMar>
+          </w:tcPr>
+          <w:p>
+            <w:pPr>
+              <w:spacing w:after="0"/>
+            </w:pPr>
+            <w:r>
+              <w:rPr>
+                <w:sz w:val="19"/>
+                <w:szCs w:val="19"/>
+              </w:rPr>
+              <w:t xml:space="preserve">Menüsperre</w:t>
+            </w:r>
+          </w:p>
+        </w:tc>
+        <w:tc>
+          <w:tcPr>
+            <w:tcW w:type="dxa" w:w="5455"/>
+            <w:tcBorders>
+              <w:top w:val="single" w:color="A6A6A6" w:sz="4"/>
+              <w:left w:val="single" w:color="A6A6A6" w:sz="4"/>
+              <w:bottom w:val="single" w:color="A6A6A6" w:sz="4"/>
+              <w:right w:val="single" w:color="A6A6A6" w:sz="4"/>
+            </w:tcBorders>
+            <w:tcMar>
+              <w:top w:type="dxa" w:w="50"/>
+              <w:left w:type="dxa" w:w="90"/>
+              <w:bottom w:type="dxa" w:w="50"/>
+              <w:right w:type="dxa" w:w="90"/>
+            </w:tcMar>
+          </w:tcPr>
+          <w:p>
+            <w:pPr>
+              <w:spacing w:after="0"/>
+            </w:pPr>
+            <w:r>
+              <w:rPr>
+                <w:rFonts w:ascii="Consolas" w:cs="Consolas" w:eastAsia="Consolas" w:hAnsi="Consolas"/>
+                <w:sz w:val="18"/>
+                <w:szCs w:val="18"/>
+              </w:rPr>
+              <w:t xml:space="preserve">EPOS.UI/Bausteine/Menuepunkt.cs</w:t>
+            </w:r>
+            <w:r>
+              <w:rPr>
+                <w:sz w:val="19"/>
+                <w:szCs w:val="19"/>
+              </w:rPr>
+              <w:t xml:space="preserve"> (</w:t>
+            </w:r>
+            <w:r>
+              <w:rPr>
+                <w:rFonts w:ascii="Consolas" w:cs="Consolas" w:eastAsia="Consolas" w:hAnsi="Consolas"/>
+                <w:sz w:val="18"/>
+                <w:szCs w:val="18"/>
+              </w:rPr>
+              <w:t xml:space="preserve">Sperrgrund</w:t>
+            </w:r>
+            <w:r>
+              <w:rPr>
+                <w:sz w:val="19"/>
+                <w:szCs w:val="19"/>
+              </w:rPr>
+              <w:t xml:space="preserve">), </w:t>
+            </w:r>
+            <w:r>
+              <w:rPr>
+                <w:rFonts w:ascii="Consolas" w:cs="Consolas" w:eastAsia="Consolas" w:hAnsi="Consolas"/>
+                <w:sz w:val="18"/>
+                <w:szCs w:val="18"/>
+              </w:rPr>
+              <w:t xml:space="preserve">Menuetabelle.cs</w:t>
+            </w:r>
+            <w:r>
+              <w:rPr>
+                <w:sz w:val="19"/>
+                <w:szCs w:val="19"/>
+              </w:rPr>
+              <w:t xml:space="preserve"> (Punkt </w:t>
+            </w:r>
+            <w:r>
+              <w:rPr>
+                <w:rFonts w:ascii="Consolas" w:cs="Consolas" w:eastAsia="Consolas" w:hAnsi="Consolas"/>
+                <w:sz w:val="18"/>
+                <w:szCs w:val="18"/>
+              </w:rPr>
+              <w:t xml:space="preserve">MenuItem_Fernwartung</w:t>
+            </w:r>
+            <w:r>
+              <w:rPr>
+                <w:sz w:val="19"/>
+                <w:szCs w:val="19"/>
+              </w:rPr>
+              <w:t xml:space="preserve">), </w:t>
+            </w:r>
+            <w:r>
+              <w:rPr>
+                <w:rFonts w:ascii="Consolas" w:cs="Consolas" w:eastAsia="Consolas" w:hAnsi="Consolas"/>
+                <w:sz w:val="18"/>
+                <w:szCs w:val="18"/>
+              </w:rPr>
+              <w:t xml:space="preserve">Menueband.razor</w:t>
+            </w:r>
+            <w:r>
+              <w:rPr>
+                <w:sz w:val="19"/>
+                <w:szCs w:val="19"/>
+              </w:rPr>
+              <w:t xml:space="preserve">, </w:t>
+            </w:r>
+            <w:r>
+              <w:rPr>
+                <w:rFonts w:ascii="Consolas" w:cs="Consolas" w:eastAsia="Consolas" w:hAnsi="Consolas"/>
+                <w:sz w:val="18"/>
+                <w:szCs w:val="18"/>
+              </w:rPr>
+              <w:t xml:space="preserve">HauptfensterHuelle.cs</w:t>
+            </w:r>
+            <w:r>
+              <w:rPr>
+                <w:sz w:val="19"/>
+                <w:szCs w:val="19"/>
+              </w:rPr>
+              <w:t xml:space="preserve"> (Fall </w:t>
+            </w:r>
+            <w:r>
+              <w:rPr>
+                <w:rFonts w:ascii="Consolas" w:cs="Consolas" w:eastAsia="Consolas" w:hAnsi="Consolas"/>
+                <w:sz w:val="18"/>
+                <w:szCs w:val="18"/>
+              </w:rPr>
+              <w:t xml:space="preserve">Fernwartung</w:t>
+            </w:r>
+            <w:r>
+              <w:rPr>
+                <w:sz w:val="19"/>
+                <w:szCs w:val="19"/>
+              </w:rPr>
+              <w:t xml:space="preserve">)</w:t>
+            </w:r>
+          </w:p>
+        </w:tc>
+        <w:tc>
+          <w:tcPr>
+            <w:tcW w:type="dxa" w:w="547"/>
+            <w:tcBorders>
+              <w:top w:val="single" w:color="A6A6A6" w:sz="4"/>
+              <w:left w:val="single" w:color="A6A6A6" w:sz="4"/>
+              <w:bottom w:val="single" w:color="A6A6A6" w:sz="4"/>
+              <w:right w:val="single" w:color="A6A6A6" w:sz="4"/>
+            </w:tcBorders>
+            <w:tcMar>
+              <w:top w:type="dxa" w:w="50"/>
+              <w:left w:type="dxa" w:w="90"/>
+              <w:bottom w:type="dxa" w:w="50"/>
+              <w:right w:type="dxa" w:w="90"/>
+            </w:tcMar>
+          </w:tcPr>
+          <w:p>
+            <w:pPr>
+              <w:spacing w:after="0"/>
+            </w:pPr>
+            <w:r>
+              <w:rPr>
+                <w:sz w:val="19"/>
+                <w:szCs w:val="19"/>
+              </w:rPr>
+              <w:t xml:space="preserve">2</w:t>
+            </w:r>
+          </w:p>
+        </w:tc>
+      </w:tr>
+      <w:tr>
+        <w:trPr>
+          <w:cantSplit/>
+          <w:tblHeader w:val="false"/>
+        </w:trPr>
+        <w:tc>
+          <w:tcPr>
+            <w:tcW w:type="dxa" w:w="3636"/>
+            <w:tcBorders>
+              <w:top w:val="single" w:color="A6A6A6" w:sz="4"/>
+              <w:left w:val="single" w:color="A6A6A6" w:sz="4"/>
+              <w:bottom w:val="single" w:color="A6A6A6" w:sz="4"/>
+              <w:right w:val="single" w:color="A6A6A6" w:sz="4"/>
+            </w:tcBorders>
+            <w:tcMar>
+              <w:top w:type="dxa" w:w="50"/>
+              <w:left w:type="dxa" w:w="90"/>
+              <w:bottom w:type="dxa" w:w="50"/>
+              <w:right w:type="dxa" w:w="90"/>
+            </w:tcMar>
+          </w:tcPr>
+          <w:p>
+            <w:pPr>
+              <w:spacing w:after="0"/>
+            </w:pPr>
+            <w:r>
+              <w:rPr>
+                <w:sz w:val="19"/>
+                <w:szCs w:val="19"/>
+              </w:rPr>
+              <w:t xml:space="preserve">Tests der Fernwartung</w:t>
+            </w:r>
+          </w:p>
+        </w:tc>
+        <w:tc>
+          <w:tcPr>
+            <w:tcW w:type="dxa" w:w="5455"/>
+            <w:tcBorders>
+              <w:top w:val="single" w:color="A6A6A6" w:sz="4"/>
+              <w:left w:val="single" w:color="A6A6A6" w:sz="4"/>
+              <w:bottom w:val="single" w:color="A6A6A6" w:sz="4"/>
+              <w:right w:val="single" w:color="A6A6A6" w:sz="4"/>
+            </w:tcBorders>
+            <w:tcMar>
+              <w:top w:type="dxa" w:w="50"/>
+              <w:left w:type="dxa" w:w="90"/>
+              <w:bottom w:type="dxa" w:w="50"/>
+              <w:right w:type="dxa" w:w="90"/>
+            </w:tcMar>
+          </w:tcPr>
+          <w:p>
+            <w:pPr>
+              <w:spacing w:after="0"/>
+            </w:pPr>
+            <w:r>
+              <w:rPr>
+                <w:rFonts w:ascii="Consolas" w:cs="Consolas" w:eastAsia="Consolas" w:hAnsi="Consolas"/>
+                <w:sz w:val="18"/>
+                <w:szCs w:val="18"/>
+              </w:rPr>
+              <w:t xml:space="preserve">EPOS.Kern.Tests/FernwartungFreigabeTests.cs</w:t>
+            </w:r>
+            <w:r>
+              <w:rPr>
+                <w:sz w:val="19"/>
+                <w:szCs w:val="19"/>
+              </w:rPr>
+              <w:t xml:space="preserve">, </w:t>
+            </w:r>
+            <w:r>
+              <w:rPr>
+                <w:rFonts w:ascii="Consolas" w:cs="Consolas" w:eastAsia="Consolas" w:hAnsi="Consolas"/>
+                <w:sz w:val="18"/>
+                <w:szCs w:val="18"/>
+              </w:rPr>
+              <w:t xml:space="preserve">EPOS.UI.Tests/Dialoge/FernwartungDialogTests.cs</w:t>
+            </w:r>
+            <w:r>
+              <w:rPr>
+                <w:sz w:val="19"/>
+                <w:szCs w:val="19"/>
+              </w:rPr>
+              <w:t xml:space="preserve">, </w:t>
+            </w:r>
+            <w:r>
+              <w:rPr>
+                <w:rFonts w:ascii="Consolas" w:cs="Consolas" w:eastAsia="Consolas" w:hAnsi="Consolas"/>
+                <w:sz w:val="18"/>
+                <w:szCs w:val="18"/>
+              </w:rPr>
+              <w:t xml:space="preserve">MenuebandTests</w:t>
+            </w:r>
+          </w:p>
+        </w:tc>
+        <w:tc>
+          <w:tcPr>
+            <w:tcW w:type="dxa" w:w="547"/>
+            <w:tcBorders>
+              <w:top w:val="single" w:color="A6A6A6" w:sz="4"/>
+              <w:left w:val="single" w:color="A6A6A6" w:sz="4"/>
+              <w:bottom w:val="single" w:color="A6A6A6" w:sz="4"/>
+              <w:right w:val="single" w:color="A6A6A6" w:sz="4"/>
+            </w:tcBorders>
+            <w:tcMar>
+              <w:top w:type="dxa" w:w="50"/>
+              <w:left w:type="dxa" w:w="90"/>
+              <w:bottom w:type="dxa" w:w="50"/>
+              <w:right w:type="dxa" w:w="90"/>
+            </w:tcMar>
+          </w:tcPr>
+          <w:p>
+            <w:pPr>
+              <w:spacing w:after="0"/>
+            </w:pPr>
+            <w:r>
+              <w:rPr>
+                <w:sz w:val="19"/>
+                <w:szCs w:val="19"/>
+              </w:rPr>
+              <w:t xml:space="preserve">2</w:t>
+            </w:r>
+          </w:p>
+        </w:tc>
+      </w:tr>
+      <w:tr>
+        <w:trPr>
+          <w:cantSplit/>
+          <w:tblHeader w:val="false"/>
+        </w:trPr>
+        <w:tc>
+          <w:tcPr>
+            <w:tcW w:type="dxa" w:w="3636"/>
+            <w:tcBorders>
+              <w:top w:val="single" w:color="A6A6A6" w:sz="4"/>
+              <w:left w:val="single" w:color="A6A6A6" w:sz="4"/>
+              <w:bottom w:val="single" w:color="A6A6A6" w:sz="4"/>
+              <w:right w:val="single" w:color="A6A6A6" w:sz="4"/>
+            </w:tcBorders>
+            <w:tcMar>
+              <w:top w:type="dxa" w:w="50"/>
+              <w:left w:type="dxa" w:w="90"/>
+              <w:bottom w:type="dxa" w:w="50"/>
+              <w:right w:type="dxa" w:w="90"/>
+            </w:tcMar>
+          </w:tcPr>
+          <w:p>
+            <w:pPr>
+              <w:spacing w:after="0"/>
+            </w:pPr>
+            <w:r>
+              <w:rPr>
+                <w:sz w:val="19"/>
+                <w:szCs w:val="19"/>
+              </w:rPr>
+              <w:t xml:space="preserve">Wiki-Quelle</w:t>
+            </w:r>
+          </w:p>
+        </w:tc>
+        <w:tc>
+          <w:tcPr>
+            <w:tcW w:type="dxa" w:w="5455"/>
+            <w:tcBorders>
+              <w:top w:val="single" w:color="A6A6A6" w:sz="4"/>
+              <w:left w:val="single" w:color="A6A6A6" w:sz="4"/>
+              <w:bottom w:val="single" w:color="A6A6A6" w:sz="4"/>
+              <w:right w:val="single" w:color="A6A6A6" w:sz="4"/>
+            </w:tcBorders>
+            <w:tcMar>
+              <w:top w:type="dxa" w:w="50"/>
+              <w:left w:type="dxa" w:w="90"/>
+              <w:bottom w:type="dxa" w:w="50"/>
+              <w:right w:type="dxa" w:w="90"/>
+            </w:tcMar>
+          </w:tcPr>
+          <w:p>
+            <w:pPr>
+              <w:spacing w:after="0"/>
+            </w:pPr>
+            <w:r>
+              <w:rPr>
+                <w:rFonts w:ascii="Consolas" w:cs="Consolas" w:eastAsia="Consolas" w:hAnsi="Consolas"/>
+                <w:sz w:val="18"/>
+                <w:szCs w:val="18"/>
+              </w:rPr>
+              <w:t xml:space="preserve">Projekte/Wiki/Programm Dokumentation - Fernwartung.wiki</w:t>
             </w:r>
           </w:p>
         </w:tc>
@@ -9352,7 +10054,7 @@
                 <w:sz w:val="19"/>
                 <w:szCs w:val="19"/>
               </w:rPr>
-              <w:t xml:space="preserve">offen</w:t>
+              <w:t xml:space="preserve">umgesetzt (11.10.2026, #969); offen beim Anwender: Fernwartungsseite, Server, signierter Client</w:t>
             </w:r>
           </w:p>
         </w:tc>

</xml_diff>

<commit_message>
Statusnummern Administration und Support: #966–#969 → #970–#973
Grund: Kollision mit fremden Nummern #966–#969 auf origin/ios_migration_september.

Co-Authored-By: Claude Sonnet 5.5 <noreply@anthropic.com>
Claude-Session: https://claude.ai/code/session_01PzsmhcNTFHLG2LbqBRVAsq
</commit_message>
<xml_diff>
--- a/Dokumentation/aktuell/Entwicklerhandbuch_Administration_Support_EPOS-Plan.docx
+++ b/Dokumentation/aktuell/Entwicklerhandbuch_Administration_Support_EPOS-Plan.docx
@@ -99,7 +99,7 @@
         <w:t xml:space="preserve">Stand.</w:t>
       </w:r>
       <w:r>
-        <w:t xml:space="preserve"> 11.10.2026, Stufen 1 und 2 umgesetzt (11.10.2026, #968 und #969); Nachzug Zapfprofil-Vorgaben offen (Anwenderrubrik, Entscheid 11.10.2026); Konzeptstand nach den Anwenderentscheiden AS-Q1 bis AS-Q10 (</w:t>
+        <w:t xml:space="preserve"> 11.10.2026, Stufen 1 und 2 umgesetzt (11.10.2026, #972 und #973); Nachzug Zapfprofil-Vorgaben offen (Anwenderrubrik, Entscheid 11.10.2026); Konzeptstand nach den Anwenderentscheiden AS-Q1 bis AS-Q10 (</w:t>
       </w:r>
       <w:r>
         <w:rPr>
@@ -9945,7 +9945,7 @@
                 <w:sz w:val="19"/>
                 <w:szCs w:val="19"/>
               </w:rPr>
-              <w:t xml:space="preserve">umgesetzt (11.10.2026, #968); </w:t>
+              <w:t xml:space="preserve">umgesetzt (11.10.2026, #972); </w:t>
             </w:r>
             <w:r>
               <w:rPr>
@@ -10054,7 +10054,7 @@
                 <w:sz w:val="19"/>
                 <w:szCs w:val="19"/>
               </w:rPr>
-              <w:t xml:space="preserve">umgesetzt (11.10.2026, #969); offen beim Anwender: Fernwartungsseite, Server, signierter Client</w:t>
+              <w:t xml:space="preserve">umgesetzt (11.10.2026, #973); offen beim Anwender: Fernwartungsseite, Server, signierter Client</w:t>
             </w:r>
           </w:p>
         </w:tc>

</xml_diff>

<commit_message>
Entwicklerhandbuch: Word-Fassung nach Stufe 3 und Zapfprofil-Nachzug
Aus der Markdown-Quelle neu erzeugt (Stufen 1 bis 3 umgesetzt).

Co-Authored-By: Claude Fable 5.1 <noreply@anthropic.com>
Claude-Session: https://claude.ai/code/session_01PzsmhcNTFHLG2LbqBRVAsq
</commit_message>
<xml_diff>
--- a/Dokumentation/aktuell/Entwicklerhandbuch_Administration_Support_EPOS-Plan.docx
+++ b/Dokumentation/aktuell/Entwicklerhandbuch_Administration_Support_EPOS-Plan.docx
@@ -99,7 +99,7 @@
         <w:t xml:space="preserve">Stand.</w:t>
       </w:r>
       <w:r>
-        <w:t xml:space="preserve"> 11.10.2026, Stufen 1 und 2 umgesetzt (11.10.2026, #972 und #973); Nachzug Zapfprofil-Vorgaben offen (Anwenderrubrik, Entscheid 11.10.2026); Konzeptstand nach den Anwenderentscheiden AS-Q1 bis AS-Q10 (</w:t>
+        <w:t xml:space="preserve"> 11.10.2026, Stufen 1 und 2 umgesetzt (11.10.2026, #974 und #975), Stufe 3 (3a Über und Diagnose, 3b Supportpaket) umgesetzt (11.10.2026, #977), Nachzug Zapfprofil-Rubrik umgesetzt (11.10.2026, #976); Konzeptstand nach den Anwenderentscheiden AS-Q1 bis AS-Q10 (</w:t>
       </w:r>
       <w:r>
         <w:rPr>
@@ -216,10 +216,10 @@
         </w:tblBorders>
       </w:tblPr>
       <w:tblGrid>
-        <w:gridCol w:w="1261"/>
-        <w:gridCol w:w="3027"/>
-        <w:gridCol w:w="3027"/>
-        <w:gridCol w:w="2323"/>
+        <w:gridCol w:w="1175"/>
+        <w:gridCol w:w="2820"/>
+        <w:gridCol w:w="2820"/>
+        <w:gridCol w:w="2823"/>
       </w:tblGrid>
       <w:tr>
         <w:trPr>
@@ -228,7 +228,7 @@
         </w:trPr>
         <w:tc>
           <w:tcPr>
-            <w:tcW w:type="dxa" w:w="1261"/>
+            <w:tcW w:type="dxa" w:w="1175"/>
             <w:tcBorders>
               <w:top w:val="single" w:color="A6A6A6" w:sz="4"/>
               <w:left w:val="single" w:color="A6A6A6" w:sz="4"/>
@@ -260,7 +260,7 @@
         </w:tc>
         <w:tc>
           <w:tcPr>
-            <w:tcW w:type="dxa" w:w="3027"/>
+            <w:tcW w:type="dxa" w:w="2820"/>
             <w:tcBorders>
               <w:top w:val="single" w:color="A6A6A6" w:sz="4"/>
               <w:left w:val="single" w:color="A6A6A6" w:sz="4"/>
@@ -292,7 +292,7 @@
         </w:tc>
         <w:tc>
           <w:tcPr>
-            <w:tcW w:type="dxa" w:w="3027"/>
+            <w:tcW w:type="dxa" w:w="2820"/>
             <w:tcBorders>
               <w:top w:val="single" w:color="A6A6A6" w:sz="4"/>
               <w:left w:val="single" w:color="A6A6A6" w:sz="4"/>
@@ -324,7 +324,7 @@
         </w:tc>
         <w:tc>
           <w:tcPr>
-            <w:tcW w:type="dxa" w:w="2323"/>
+            <w:tcW w:type="dxa" w:w="2823"/>
             <w:tcBorders>
               <w:top w:val="single" w:color="A6A6A6" w:sz="4"/>
               <w:left w:val="single" w:color="A6A6A6" w:sz="4"/>
@@ -362,7 +362,7 @@
         </w:trPr>
         <w:tc>
           <w:tcPr>
-            <w:tcW w:type="dxa" w:w="1261"/>
+            <w:tcW w:type="dxa" w:w="1175"/>
             <w:tcBorders>
               <w:top w:val="single" w:color="A6A6A6" w:sz="4"/>
               <w:left w:val="single" w:color="A6A6A6" w:sz="4"/>
@@ -393,7 +393,7 @@
         </w:tc>
         <w:tc>
           <w:tcPr>
-            <w:tcW w:type="dxa" w:w="3027"/>
+            <w:tcW w:type="dxa" w:w="2820"/>
             <w:tcBorders>
               <w:top w:val="single" w:color="A6A6A6" w:sz="4"/>
               <w:left w:val="single" w:color="A6A6A6" w:sz="4"/>
@@ -422,30 +422,39 @@
         </w:tc>
         <w:tc>
           <w:tcPr>
-            <w:tcW w:type="dxa" w:w="3027"/>
-            <w:tcBorders>
-              <w:top w:val="single" w:color="A6A6A6" w:sz="4"/>
-              <w:left w:val="single" w:color="A6A6A6" w:sz="4"/>
-              <w:bottom w:val="single" w:color="A6A6A6" w:sz="4"/>
-              <w:right w:val="single" w:color="A6A6A6" w:sz="4"/>
-            </w:tcBorders>
-            <w:tcMar>
-              <w:top w:type="dxa" w:w="50"/>
-              <w:left w:type="dxa" w:w="90"/>
-              <w:bottom w:type="dxa" w:w="50"/>
-              <w:right w:type="dxa" w:w="90"/>
-            </w:tcMar>
-          </w:tcPr>
-          <w:p>
-            <w:pPr>
-              <w:spacing w:after="0"/>
-            </w:pPr>
-            <w:r>
-              <w:rPr>
-                <w:sz w:val="19"/>
-                <w:szCs w:val="19"/>
-              </w:rPr>
-              <w:t xml:space="preserve">im Hauptfenster von EPOS-Plan (bis Stufe 3; danach im Dialog „Über EPOS-Plan") </w:t>
+            <w:tcW w:type="dxa" w:w="2820"/>
+            <w:tcBorders>
+              <w:top w:val="single" w:color="A6A6A6" w:sz="4"/>
+              <w:left w:val="single" w:color="A6A6A6" w:sz="4"/>
+              <w:bottom w:val="single" w:color="A6A6A6" w:sz="4"/>
+              <w:right w:val="single" w:color="A6A6A6" w:sz="4"/>
+            </w:tcBorders>
+            <w:tcMar>
+              <w:top w:type="dxa" w:w="50"/>
+              <w:left w:type="dxa" w:w="90"/>
+              <w:bottom w:type="dxa" w:w="50"/>
+              <w:right w:type="dxa" w:w="90"/>
+            </w:tcMar>
+          </w:tcPr>
+          <w:p>
+            <w:pPr>
+              <w:spacing w:after="0"/>
+            </w:pPr>
+            <w:r>
+              <w:rPr>
+                <w:i/>
+                <w:iCs/>
+                <w:sz w:val="19"/>
+                <w:szCs w:val="19"/>
+              </w:rPr>
+              <w:t xml:space="preserve">Hilfe → Version</w:t>
+            </w:r>
+            <w:r>
+              <w:rPr>
+                <w:sz w:val="19"/>
+                <w:szCs w:val="19"/>
+              </w:rPr>
+              <w:t xml:space="preserve"> öffnen; im Dialog „Über EPOS-Plan" </w:t>
             </w:r>
             <w:r>
               <w:rPr>
@@ -461,13 +470,13 @@
                 <w:sz w:val="19"/>
                 <w:szCs w:val="19"/>
               </w:rPr>
-              <w:t xml:space="preserve">, Rückfrage „Entwicklermodus einschalten? Er gilt bis zum Ausschalten." bestätigen. iPad: fünfmal auf die Versionszeile tippen.</w:t>
-            </w:r>
-          </w:p>
-        </w:tc>
-        <w:tc>
-          <w:tcPr>
-            <w:tcW w:type="dxa" w:w="2323"/>
+              <w:t xml:space="preserve">, Rückfrage „Entwicklermodus einschalten? Er gilt bis zum Ausschalten." bestätigen. Im Hauptfenster wirkt die Tastenfolge nicht. Der Diagnoseblock des Dialogs zeigt danach „Entwickler (Einstellung)". iPad: nicht gebaut (geplant: fünfmal auf die Versionszeile tippen).</w:t>
+            </w:r>
+          </w:p>
+        </w:tc>
+        <w:tc>
+          <w:tcPr>
+            <w:tcW w:type="dxa" w:w="2823"/>
             <w:tcBorders>
               <w:top w:val="single" w:color="A6A6A6" w:sz="4"/>
               <w:left w:val="single" w:color="A6A6A6" w:sz="4"/>
@@ -500,6 +509,13 @@
                 <w:szCs w:val="19"/>
               </w:rPr>
               <w:t xml:space="preserve">Entwicklung → Entwicklermodus ausschalten</w:t>
+            </w:r>
+            <w:r>
+              <w:rPr>
+                <w:sz w:val="19"/>
+                <w:szCs w:val="19"/>
+              </w:rPr>
+              <w:t xml:space="preserve"> oder dieselbe Tastenfolge im Dialog</w:t>
             </w:r>
           </w:p>
         </w:tc>
@@ -511,7 +527,7 @@
         </w:trPr>
         <w:tc>
           <w:tcPr>
-            <w:tcW w:type="dxa" w:w="1261"/>
+            <w:tcW w:type="dxa" w:w="1175"/>
             <w:tcBorders>
               <w:top w:val="single" w:color="A6A6A6" w:sz="4"/>
               <w:left w:val="single" w:color="A6A6A6" w:sz="4"/>
@@ -542,7 +558,7 @@
         </w:tc>
         <w:tc>
           <w:tcPr>
-            <w:tcW w:type="dxa" w:w="3027"/>
+            <w:tcW w:type="dxa" w:w="2820"/>
             <w:tcBorders>
               <w:top w:val="single" w:color="A6A6A6" w:sz="4"/>
               <w:left w:val="single" w:color="A6A6A6" w:sz="4"/>
@@ -571,7 +587,7 @@
         </w:tc>
         <w:tc>
           <w:tcPr>
-            <w:tcW w:type="dxa" w:w="3027"/>
+            <w:tcW w:type="dxa" w:w="2820"/>
             <w:tcBorders>
               <w:top w:val="single" w:color="A6A6A6" w:sz="4"/>
               <w:left w:val="single" w:color="A6A6A6" w:sz="4"/>
@@ -608,7 +624,7 @@
         </w:tc>
         <w:tc>
           <w:tcPr>
-            <w:tcW w:type="dxa" w:w="2323"/>
+            <w:tcW w:type="dxa" w:w="2823"/>
             <w:tcBorders>
               <w:top w:val="single" w:color="A6A6A6" w:sz="4"/>
               <w:left w:val="single" w:color="A6A6A6" w:sz="4"/>
@@ -643,7 +659,7 @@
         </w:trPr>
         <w:tc>
           <w:tcPr>
-            <w:tcW w:type="dxa" w:w="1261"/>
+            <w:tcW w:type="dxa" w:w="1175"/>
             <w:tcBorders>
               <w:top w:val="single" w:color="A6A6A6" w:sz="4"/>
               <w:left w:val="single" w:color="A6A6A6" w:sz="4"/>
@@ -674,7 +690,7 @@
         </w:tc>
         <w:tc>
           <w:tcPr>
-            <w:tcW w:type="dxa" w:w="3027"/>
+            <w:tcW w:type="dxa" w:w="2820"/>
             <w:tcBorders>
               <w:top w:val="single" w:color="A6A6A6" w:sz="4"/>
               <w:left w:val="single" w:color="A6A6A6" w:sz="4"/>
@@ -703,7 +719,7 @@
         </w:tc>
         <w:tc>
           <w:tcPr>
-            <w:tcW w:type="dxa" w:w="3027"/>
+            <w:tcW w:type="dxa" w:w="2820"/>
             <w:tcBorders>
               <w:top w:val="single" w:color="A6A6A6" w:sz="4"/>
               <w:left w:val="single" w:color="A6A6A6" w:sz="4"/>
@@ -755,7 +771,7 @@
         </w:tc>
         <w:tc>
           <w:tcPr>
-            <w:tcW w:type="dxa" w:w="2323"/>
+            <w:tcW w:type="dxa" w:w="2823"/>
             <w:tcBorders>
               <w:top w:val="single" w:color="A6A6A6" w:sz="4"/>
               <w:left w:val="single" w:color="A6A6A6" w:sz="4"/>
@@ -790,7 +806,7 @@
         </w:trPr>
         <w:tc>
           <w:tcPr>
-            <w:tcW w:type="dxa" w:w="1261"/>
+            <w:tcW w:type="dxa" w:w="1175"/>
             <w:tcBorders>
               <w:top w:val="single" w:color="A6A6A6" w:sz="4"/>
               <w:left w:val="single" w:color="A6A6A6" w:sz="4"/>
@@ -821,7 +837,7 @@
         </w:tc>
         <w:tc>
           <w:tcPr>
-            <w:tcW w:type="dxa" w:w="3027"/>
+            <w:tcW w:type="dxa" w:w="2820"/>
             <w:tcBorders>
               <w:top w:val="single" w:color="A6A6A6" w:sz="4"/>
               <w:left w:val="single" w:color="A6A6A6" w:sz="4"/>
@@ -850,7 +866,7 @@
         </w:tc>
         <w:tc>
           <w:tcPr>
-            <w:tcW w:type="dxa" w:w="3027"/>
+            <w:tcW w:type="dxa" w:w="2820"/>
             <w:tcBorders>
               <w:top w:val="single" w:color="A6A6A6" w:sz="4"/>
               <w:left w:val="single" w:color="A6A6A6" w:sz="4"/>
@@ -894,7 +910,7 @@
         </w:tc>
         <w:tc>
           <w:tcPr>
-            <w:tcW w:type="dxa" w:w="2323"/>
+            <w:tcW w:type="dxa" w:w="2823"/>
             <w:tcBorders>
               <w:top w:val="single" w:color="A6A6A6" w:sz="4"/>
               <w:left w:val="single" w:color="A6A6A6" w:sz="4"/>
@@ -1132,7 +1148,7 @@
         <w:t xml:space="preserve">Entwicklung → Entwicklermodus ausschalten</w:t>
       </w:r>
       <w:r>
-        <w:t xml:space="preserve"> löscht die Einstellung. Läuft der Modus über Startargument oder Umgebungsvariable, sagt der Punkt das und tut nichts: dann ohne Argument neu starten beziehungsweise die Variable entfernen.</w:t>
+        <w:t xml:space="preserve"> oder die Tastenfolge im Dialog „Über EPOS-Plan" löscht die Einstellung. Läuft der Modus über Startargument oder Umgebungsvariable, sagt der Punkt das und tut nichts: dann ohne Argument neu starten beziehungsweise die Variable entfernen.</w:t>
       </w:r>
     </w:p>
     <w:p>
@@ -2579,312 +2595,6 @@
                 <w:sz w:val="18"/>
                 <w:szCs w:val="18"/>
               </w:rPr>
-              <w:t xml:space="preserve">ZAPFPROFIL_VORGABEN</w:t>
-            </w:r>
-          </w:p>
-        </w:tc>
-        <w:tc>
-          <w:tcPr>
-            <w:tcW w:type="dxa" w:w="4323"/>
-            <w:tcBorders>
-              <w:top w:val="single" w:color="A6A6A6" w:sz="4"/>
-              <w:left w:val="single" w:color="A6A6A6" w:sz="4"/>
-              <w:bottom w:val="single" w:color="A6A6A6" w:sz="4"/>
-              <w:right w:val="single" w:color="A6A6A6" w:sz="4"/>
-            </w:tcBorders>
-            <w:tcMar>
-              <w:top w:type="dxa" w:w="50"/>
-              <w:left w:type="dxa" w:w="90"/>
-              <w:bottom w:type="dxa" w:w="50"/>
-              <w:right w:type="dxa" w:w="90"/>
-            </w:tcMar>
-          </w:tcPr>
-          <w:p>
-            <w:pPr>
-              <w:spacing w:after="0"/>
-            </w:pPr>
-            <w:r>
-              <w:rPr>
-                <w:sz w:val="19"/>
-                <w:szCs w:val="19"/>
-              </w:rPr>
-              <w:t xml:space="preserve">Rubrik „Entwicklung" im Einstellungsdialog mit den fünf Rechenvorgaben </w:t>
-            </w:r>
-            <w:r>
-              <w:rPr>
-                <w:rFonts w:ascii="Consolas" w:cs="Consolas" w:eastAsia="Consolas" w:hAnsi="Consolas"/>
-                <w:sz w:val="18"/>
-                <w:szCs w:val="18"/>
-              </w:rPr>
-              <w:t xml:space="preserve">Zapfprofil.Anzeigetemperatur</w:t>
-            </w:r>
-            <w:r>
-              <w:rPr>
-                <w:sz w:val="19"/>
-                <w:szCs w:val="19"/>
-              </w:rPr>
-              <w:t xml:space="preserve">, </w:t>
-            </w:r>
-            <w:r>
-              <w:rPr>
-                <w:rFonts w:ascii="Consolas" w:cs="Consolas" w:eastAsia="Consolas" w:hAnsi="Consolas"/>
-                <w:sz w:val="18"/>
-                <w:szCs w:val="18"/>
-              </w:rPr>
-              <w:t xml:space="preserve">Zapfprofil.Stundenschwelle</w:t>
-            </w:r>
-            <w:r>
-              <w:rPr>
-                <w:sz w:val="19"/>
-                <w:szCs w:val="19"/>
-              </w:rPr>
-              <w:t xml:space="preserve">, </w:t>
-            </w:r>
-            <w:r>
-              <w:rPr>
-                <w:rFonts w:ascii="Consolas" w:cs="Consolas" w:eastAsia="Consolas" w:hAnsi="Consolas"/>
-                <w:sz w:val="18"/>
-                <w:szCs w:val="18"/>
-              </w:rPr>
-              <w:t xml:space="preserve">Zapfprofil.Nenninhalte</w:t>
-            </w:r>
-            <w:r>
-              <w:rPr>
-                <w:sz w:val="19"/>
-                <w:szCs w:val="19"/>
-              </w:rPr>
-              <w:t xml:space="preserve">, </w:t>
-            </w:r>
-            <w:r>
-              <w:rPr>
-                <w:rFonts w:ascii="Consolas" w:cs="Consolas" w:eastAsia="Consolas" w:hAnsi="Consolas"/>
-                <w:sz w:val="18"/>
-                <w:szCs w:val="18"/>
-              </w:rPr>
-              <w:t xml:space="preserve">Zapfprofil.Katalogordner</w:t>
-            </w:r>
-            <w:r>
-              <w:rPr>
-                <w:sz w:val="19"/>
-                <w:szCs w:val="19"/>
-              </w:rPr>
-              <w:t xml:space="preserve">, </w:t>
-            </w:r>
-            <w:r>
-              <w:rPr>
-                <w:rFonts w:ascii="Consolas" w:cs="Consolas" w:eastAsia="Consolas" w:hAnsi="Consolas"/>
-                <w:sz w:val="18"/>
-                <w:szCs w:val="18"/>
-              </w:rPr>
-              <w:t xml:space="preserve">Zapfprofil.Importordner</w:t>
-            </w:r>
-          </w:p>
-        </w:tc>
-        <w:tc>
-          <w:tcPr>
-            <w:tcW w:type="dxa" w:w="4323"/>
-            <w:tcBorders>
-              <w:top w:val="single" w:color="A6A6A6" w:sz="4"/>
-              <w:left w:val="single" w:color="A6A6A6" w:sz="4"/>
-              <w:bottom w:val="single" w:color="A6A6A6" w:sz="4"/>
-              <w:right w:val="single" w:color="A6A6A6" w:sz="4"/>
-            </w:tcBorders>
-            <w:tcMar>
-              <w:top w:type="dxa" w:w="50"/>
-              <w:left w:type="dxa" w:w="90"/>
-              <w:bottom w:type="dxa" w:w="50"/>
-              <w:right w:type="dxa" w:w="90"/>
-            </w:tcMar>
-          </w:tcPr>
-          <w:p>
-            <w:pPr>
-              <w:spacing w:after="0"/>
-            </w:pPr>
-            <w:r>
-              <w:rPr>
-                <w:rFonts w:ascii="Consolas" w:cs="Consolas" w:eastAsia="Consolas" w:hAnsi="Consolas"/>
-                <w:sz w:val="18"/>
-                <w:szCs w:val="18"/>
-              </w:rPr>
-              <w:t xml:space="preserve">EinstellungenDialog.razor</w:t>
-            </w:r>
-            <w:r>
-              <w:rPr>
-                <w:sz w:val="19"/>
-                <w:szCs w:val="19"/>
-              </w:rPr>
-              <w:t xml:space="preserve"> (Parameter </w:t>
-            </w:r>
-            <w:r>
-              <w:rPr>
-                <w:rFonts w:ascii="Consolas" w:cs="Consolas" w:eastAsia="Consolas" w:hAnsi="Consolas"/>
-                <w:sz w:val="18"/>
-                <w:szCs w:val="18"/>
-              </w:rPr>
-              <w:t xml:space="preserve">Entwickler</w:t>
-            </w:r>
-            <w:r>
-              <w:rPr>
-                <w:sz w:val="19"/>
-                <w:szCs w:val="19"/>
-              </w:rPr>
-              <w:t xml:space="preserve">, Reiterblatt </w:t>
-            </w:r>
-            <w:r>
-              <w:rPr>
-                <w:rFonts w:ascii="Consolas" w:cs="Consolas" w:eastAsia="Consolas" w:hAnsi="Consolas"/>
-                <w:sz w:val="18"/>
-                <w:szCs w:val="18"/>
-              </w:rPr>
-              <w:t xml:space="preserve">ENTWICKLUNG</w:t>
-            </w:r>
-            <w:r>
-              <w:rPr>
-                <w:sz w:val="19"/>
-                <w:szCs w:val="19"/>
-              </w:rPr>
-              <w:t xml:space="preserve">; Felder </w:t>
-            </w:r>
-            <w:r>
-              <w:rPr>
-                <w:rFonts w:ascii="Consolas" w:cs="Consolas" w:eastAsia="Consolas" w:hAnsi="Consolas"/>
-                <w:sz w:val="18"/>
-                <w:szCs w:val="18"/>
-              </w:rPr>
-              <w:t xml:space="preserve">Zapf*</w:t>
-            </w:r>
-            <w:r>
-              <w:rPr>
-                <w:sz w:val="19"/>
-                <w:szCs w:val="19"/>
-              </w:rPr>
-              <w:t xml:space="preserve"> in </w:t>
-            </w:r>
-            <w:r>
-              <w:rPr>
-                <w:rFonts w:ascii="Consolas" w:cs="Consolas" w:eastAsia="Consolas" w:hAnsi="Consolas"/>
-                <w:sz w:val="18"/>
-                <w:szCs w:val="18"/>
-              </w:rPr>
-              <w:t xml:space="preserve">EinstellungenCtrl</w:t>
-            </w:r>
-            <w:r>
-              <w:rPr>
-                <w:sz w:val="19"/>
-                <w:szCs w:val="19"/>
-              </w:rPr>
-              <w:t xml:space="preserve">); gelesen in </w:t>
-            </w:r>
-            <w:r>
-              <w:rPr>
-                <w:rFonts w:ascii="Consolas" w:cs="Consolas" w:eastAsia="Consolas" w:hAnsi="Consolas"/>
-                <w:sz w:val="18"/>
-                <w:szCs w:val="18"/>
-              </w:rPr>
-              <w:t xml:space="preserve">ZapfprofilCtrl.Eingang.cs</w:t>
-            </w:r>
-            <w:r>
-              <w:rPr>
-                <w:sz w:val="19"/>
-                <w:szCs w:val="19"/>
-              </w:rPr>
-              <w:t xml:space="preserve">, </w:t>
-            </w:r>
-            <w:r>
-              <w:rPr>
-                <w:rFonts w:ascii="Consolas" w:cs="Consolas" w:eastAsia="Consolas" w:hAnsi="Consolas"/>
-                <w:sz w:val="18"/>
-                <w:szCs w:val="18"/>
-              </w:rPr>
-              <w:t xml:space="preserve">ZapfprofilCtrl.Auslegung.cs</w:t>
-            </w:r>
-            <w:r>
-              <w:rPr>
-                <w:sz w:val="19"/>
-                <w:szCs w:val="19"/>
-              </w:rPr>
-              <w:t xml:space="preserve">, </w:t>
-            </w:r>
-            <w:r>
-              <w:rPr>
-                <w:rFonts w:ascii="Consolas" w:cs="Consolas" w:eastAsia="Consolas" w:hAnsi="Consolas"/>
-                <w:sz w:val="18"/>
-                <w:szCs w:val="18"/>
-              </w:rPr>
-              <w:t xml:space="preserve">ZapfprofilHuelle.*</w:t>
-            </w:r>
-          </w:p>
-        </w:tc>
-        <w:tc>
-          <w:tcPr>
-            <w:tcW w:type="dxa" w:w="4325"/>
-            <w:tcBorders>
-              <w:top w:val="single" w:color="A6A6A6" w:sz="4"/>
-              <w:left w:val="single" w:color="A6A6A6" w:sz="4"/>
-              <w:bottom w:val="single" w:color="A6A6A6" w:sz="4"/>
-              <w:right w:val="single" w:color="A6A6A6" w:sz="4"/>
-            </w:tcBorders>
-            <w:tcMar>
-              <w:top w:type="dxa" w:w="50"/>
-              <w:left w:type="dxa" w:w="90"/>
-              <w:bottom w:type="dxa" w:w="50"/>
-              <w:right w:type="dxa" w:w="90"/>
-            </w:tcMar>
-          </w:tcPr>
-          <w:p>
-            <w:pPr>
-              <w:spacing w:after="0"/>
-            </w:pPr>
-            <w:r>
-              <w:rPr>
-                <w:b/>
-                <w:bCs/>
-                <w:sz w:val="19"/>
-                <w:szCs w:val="19"/>
-              </w:rPr>
-              <w:t xml:space="preserve">Entfällt als Entwicklerbereich</w:t>
-            </w:r>
-            <w:r>
-              <w:rPr>
-                <w:sz w:val="19"/>
-                <w:szCs w:val="19"/>
-              </w:rPr>
-              <w:t xml:space="preserve"> (Anwenderentscheid 11.10.2026): die fünf Rechenvorgaben werden die Anwenderrubrik „Zapfprofil" im Einstellungsdialog; bis zum Nachzug zeigt Stufe 1 sie noch als Rubrik „Entwicklung" nur im Modus</w:t>
-            </w:r>
-          </w:p>
-        </w:tc>
-      </w:tr>
-      <w:tr>
-        <w:trPr>
-          <w:cantSplit/>
-          <w:tblHeader w:val="false"/>
-        </w:trPr>
-        <w:tc>
-          <w:tcPr>
-            <w:tcW w:type="dxa" w:w="1729"/>
-            <w:tcBorders>
-              <w:top w:val="single" w:color="A6A6A6" w:sz="4"/>
-              <w:left w:val="single" w:color="A6A6A6" w:sz="4"/>
-              <w:bottom w:val="single" w:color="A6A6A6" w:sz="4"/>
-              <w:right w:val="single" w:color="A6A6A6" w:sz="4"/>
-            </w:tcBorders>
-            <w:tcMar>
-              <w:top w:type="dxa" w:w="50"/>
-              <w:left w:type="dxa" w:w="90"/>
-              <w:bottom w:type="dxa" w:w="50"/>
-              <w:right w:type="dxa" w:w="90"/>
-            </w:tcMar>
-          </w:tcPr>
-          <w:p>
-            <w:pPr>
-              <w:spacing w:after="0"/>
-            </w:pPr>
-            <w:r>
-              <w:rPr>
-                <w:rFonts w:ascii="Consolas" w:cs="Consolas" w:eastAsia="Consolas" w:hAnsi="Consolas"/>
-                <w:sz w:val="18"/>
-                <w:szCs w:val="18"/>
-              </w:rPr>
               <w:t xml:space="preserve">WEBVIEW_WERKZEUGE</w:t>
             </w:r>
           </w:p>
@@ -3081,7 +2791,106 @@
         <w:t xml:space="preserve">EPOS.Kern/Allgemein/Simulation/</w:t>
       </w:r>
       <w:r>
-        <w:t xml:space="preserve"> (sie verändern den Rechenweg). Nach dem Anwenderentscheid vom 11.10.2026 gehören auch die fünf Zapfprofil-Rechenvorgaben dazu: Sie werden die Anwenderrubrik „Zapfprofil" im Einstellungsdialog (Nachzug offen, siehe Abschnitt 7).</w:t>
+        <w:t xml:space="preserve"> (sie verändern den Rechenweg). Ebenso kein Entwicklerbereich sind die fünf Rechenvorgaben des Zapfprofils (</w:t>
+      </w:r>
+      <w:r>
+        <w:rPr>
+          <w:rFonts w:ascii="Consolas" w:cs="Consolas" w:eastAsia="Consolas" w:hAnsi="Consolas"/>
+          <w:sz w:val="20"/>
+          <w:szCs w:val="20"/>
+        </w:rPr>
+        <w:t xml:space="preserve">Zapfprofil.Anzeigetemperatur</w:t>
+      </w:r>
+      <w:r>
+        <w:t xml:space="preserve">, </w:t>
+      </w:r>
+      <w:r>
+        <w:rPr>
+          <w:rFonts w:ascii="Consolas" w:cs="Consolas" w:eastAsia="Consolas" w:hAnsi="Consolas"/>
+          <w:sz w:val="20"/>
+          <w:szCs w:val="20"/>
+        </w:rPr>
+        <w:t xml:space="preserve">Zapfprofil.Stundenschwelle</w:t>
+      </w:r>
+      <w:r>
+        <w:t xml:space="preserve">, </w:t>
+      </w:r>
+      <w:r>
+        <w:rPr>
+          <w:rFonts w:ascii="Consolas" w:cs="Consolas" w:eastAsia="Consolas" w:hAnsi="Consolas"/>
+          <w:sz w:val="20"/>
+          <w:szCs w:val="20"/>
+        </w:rPr>
+        <w:t xml:space="preserve">Zapfprofil.Nenninhalte</w:t>
+      </w:r>
+      <w:r>
+        <w:t xml:space="preserve">, </w:t>
+      </w:r>
+      <w:r>
+        <w:rPr>
+          <w:rFonts w:ascii="Consolas" w:cs="Consolas" w:eastAsia="Consolas" w:hAnsi="Consolas"/>
+          <w:sz w:val="20"/>
+          <w:szCs w:val="20"/>
+        </w:rPr>
+        <w:t xml:space="preserve">Zapfprofil.Katalogordner</w:t>
+      </w:r>
+      <w:r>
+        <w:t xml:space="preserve">, </w:t>
+      </w:r>
+      <w:r>
+        <w:rPr>
+          <w:rFonts w:ascii="Consolas" w:cs="Consolas" w:eastAsia="Consolas" w:hAnsi="Consolas"/>
+          <w:sz w:val="20"/>
+          <w:szCs w:val="20"/>
+        </w:rPr>
+        <w:t xml:space="preserve">Zapfprofil.Importordner</w:t>
+      </w:r>
+      <w:r>
+        <w:t xml:space="preserve">): Sie stehen für alle Anwender in der Rubrik „Zapfprofil" des Einstellungsdialogs (</w:t>
+      </w:r>
+      <w:r>
+        <w:rPr>
+          <w:rFonts w:ascii="Consolas" w:cs="Consolas" w:eastAsia="Consolas" w:hAnsi="Consolas"/>
+          <w:sz w:val="20"/>
+          <w:szCs w:val="20"/>
+        </w:rPr>
+        <w:t xml:space="preserve">EinstellungenDialog.razor</w:t>
+      </w:r>
+      <w:r>
+        <w:t xml:space="preserve">, Reiterblatt </w:t>
+      </w:r>
+      <w:r>
+        <w:rPr>
+          <w:rFonts w:ascii="Consolas" w:cs="Consolas" w:eastAsia="Consolas" w:hAnsi="Consolas"/>
+          <w:sz w:val="20"/>
+          <w:szCs w:val="20"/>
+        </w:rPr>
+        <w:t xml:space="preserve">ZAPFPROFIL</w:t>
+      </w:r>
+      <w:r>
+        <w:t xml:space="preserve">; Felder </w:t>
+      </w:r>
+      <w:r>
+        <w:rPr>
+          <w:rFonts w:ascii="Consolas" w:cs="Consolas" w:eastAsia="Consolas" w:hAnsi="Consolas"/>
+          <w:sz w:val="20"/>
+          <w:szCs w:val="20"/>
+        </w:rPr>
+        <w:t xml:space="preserve">Zapf*</w:t>
+      </w:r>
+      <w:r>
+        <w:t xml:space="preserve"> in </w:t>
+      </w:r>
+      <w:r>
+        <w:rPr>
+          <w:rFonts w:ascii="Consolas" w:cs="Consolas" w:eastAsia="Consolas" w:hAnsi="Consolas"/>
+          <w:sz w:val="20"/>
+          <w:szCs w:val="20"/>
+        </w:rPr>
+        <w:t xml:space="preserve">EinstellungenCtrl</w:t>
+      </w:r>
+      <w:r>
+        <w:t xml:space="preserve">).</w:t>
       </w:r>
     </w:p>
     <w:p>
@@ -4576,7 +4385,7 @@
                 <w:sz w:val="19"/>
                 <w:szCs w:val="19"/>
               </w:rPr>
-              <w:t xml:space="preserve">neben der Datenbank, ab Stufe 3 in </w:t>
+              <w:t xml:space="preserve">neben der Datenbank (das Supportpaket sucht zuerst in </w:t>
             </w:r>
             <w:r>
               <w:rPr>
@@ -4585,6 +4394,13 @@
                 <w:szCs w:val="18"/>
               </w:rPr>
               <w:t xml:space="preserve">Logs\</w:t>
+            </w:r>
+            <w:r>
+              <w:rPr>
+                <w:sz w:val="19"/>
+                <w:szCs w:val="19"/>
+              </w:rPr>
+              <w:t xml:space="preserve">, dann daneben)</w:t>
             </w:r>
           </w:p>
         </w:tc>
@@ -4877,7 +4693,7 @@
         <w:pStyle w:val="Heading2"/>
       </w:pPr>
       <w:r>
-        <w:t xml:space="preserve">3.3 Diagnosedaten und Supportpaket [Stufe 3]</w:t>
+        <w:t xml:space="preserve">3.3 Diagnosedaten und Supportpaket [heute]</w:t>
       </w:r>
     </w:p>
     <w:p>
@@ -4885,7 +4701,27 @@
         <w:spacing w:after="120"/>
       </w:pPr>
       <w:r>
-        <w:t xml:space="preserve">Der Diagnoseblock selbst ist seit Stufe 1 gebaut und über </w:t>
+        <w:t xml:space="preserve">Den Diagnoseblock findet der Anwender unter </w:t>
+      </w:r>
+      <w:r>
+        <w:rPr>
+          <w:i/>
+          <w:iCs/>
+        </w:rPr>
+        <w:t xml:space="preserve">Hilfe → Version</w:t>
+      </w:r>
+      <w:r>
+        <w:t xml:space="preserve"> im Dialog „Über EPOS-Plan" (unter dem Kopf mit Produktname, Claim, Version mit Baudatum und INEKON) als nur lesbares Textfeld; ebenso in </w:t>
+      </w:r>
+      <w:r>
+        <w:rPr>
+          <w:i/>
+          <w:iCs/>
+        </w:rPr>
+        <w:t xml:space="preserve">Hilfe → Fernwartung…</w:t>
+      </w:r>
+      <w:r>
+        <w:t xml:space="preserve"> (Zone „Ihre Angaben") und für Entwickler unter </w:t>
       </w:r>
       <w:r>
         <w:rPr>
@@ -4895,7 +4731,7 @@
         <w:t xml:space="preserve">Entwicklung → Diagnosedaten kopieren</w:t>
       </w:r>
       <w:r>
-        <w:t xml:space="preserve"> erreichbar; Stufe 3 bringt den Dialog und das Supportpaket.</w:t>
+        <w:t xml:space="preserve">.</w:t>
       </w:r>
     </w:p>
     <w:p>
@@ -4903,17 +4739,7 @@
         <w:spacing w:after="120"/>
       </w:pPr>
       <w:r>
-        <w:t xml:space="preserve">Der Dialog „Über EPOS-Plan" (</w:t>
-      </w:r>
-      <w:r>
-        <w:rPr>
-          <w:i/>
-          <w:iCs/>
-        </w:rPr>
-        <w:t xml:space="preserve">Hilfe → Version</w:t>
-      </w:r>
-      <w:r>
-        <w:t xml:space="preserve">) zeigt den Diagnoseblock aus dem Kern-Baustein </w:t>
+        <w:t xml:space="preserve">Der Dialog „Über EPOS-Plan" zeigt den Diagnoseblock aus dem Kern-Baustein </w:t>
       </w:r>
       <w:r>
         <w:rPr>
@@ -4957,7 +4783,40 @@
         <w:t xml:space="preserve">SchemaStand.Zielversion</w:t>
       </w:r>
       <w:r>
-        <w:t xml:space="preserve">), Katalogfassung, Lizenztyp, Lizenznummer, Firma, Status, gültig bis, Gerätekennung-Kurzform (erste acht Zeichen des Abdrucks), Protokollordner, Entwicklermodus mit Quelle. Knöpfe: „Diagnosedaten kopieren", „Protokollordner öffnen", „Supportpaket speichern…", „Fernwartung…".</w:t>
+        <w:t xml:space="preserve">), Katalogfassung, Lizenztyp, Lizenznummer, Firma, Status, gültig bis, Gerätekennung-Kurzform (erste acht Zeichen des Abdrucks), Protokollordner, Entwicklermodus mit Quelle. Knöpfe unter dem Block: „Diagnosedaten kopieren" (Zwischenablage) und „Protokollordner öffnen" (Windows; der Explorer im Ordner </w:t>
+      </w:r>
+      <w:r>
+        <w:rPr>
+          <w:rFonts w:ascii="Consolas" w:cs="Consolas" w:eastAsia="Consolas" w:hAnsi="Consolas"/>
+          <w:sz w:val="20"/>
+          <w:szCs w:val="20"/>
+        </w:rPr>
+        <w:t xml:space="preserve">Logs</w:t>
+      </w:r>
+      <w:r>
+        <w:t xml:space="preserve"> neben der Datenbank, </w:t>
+      </w:r>
+      <w:r>
+        <w:rPr>
+          <w:rFonts w:ascii="Consolas" w:cs="Consolas" w:eastAsia="Consolas" w:hAnsi="Consolas"/>
+          <w:sz w:val="20"/>
+          <w:szCs w:val="20"/>
+        </w:rPr>
+        <w:t xml:space="preserve">Diagnosedaten.ProtokollordnerPfad</w:t>
+      </w:r>
+      <w:r>
+        <w:t xml:space="preserve">; fehlt der Ordner, sagt eine Meldung den Pfad). Darunter der Kontakt (Telefon, E-Mail als </w:t>
+      </w:r>
+      <w:r>
+        <w:rPr>
+          <w:rFonts w:ascii="Consolas" w:cs="Consolas" w:eastAsia="Consolas" w:hAnsi="Consolas"/>
+          <w:sz w:val="20"/>
+          <w:szCs w:val="20"/>
+        </w:rPr>
+        <w:t xml:space="preserve">mailto:</w:t>
+      </w:r>
+      <w:r>
+        <w:t xml:space="preserve">-Link, Erreichbarkeit) mit dem Knopf „Fernwartung…", der den Fernwartungsdialog öffnet.</w:t>
       </w:r>
     </w:p>
     <w:p>
@@ -4965,7 +4824,14 @@
         <w:spacing w:after="120"/>
       </w:pPr>
       <w:r>
-        <w:t xml:space="preserve">Das Supportpaket ist eine ZIP-Datei mit </w:t>
+        <w:rPr>
+          <w:b/>
+          <w:bCs/>
+        </w:rPr>
+        <w:t xml:space="preserve">Supportpaket.</w:t>
+      </w:r>
+      <w:r>
+        <w:t xml:space="preserve"> Unter dem Diagnoseblock stehen der Haken „KI-Protokoll beilegen" (Vorgabe aus, mit dem Hinweis, dass das Protokoll Eingaben des Anwenders an den Assistenten enthalten kann) und der Knopf „Supportpaket speichern…". Unter Windows öffnet er eine Nachricht später den Speicherdialog im Dokumentenordner mit dem Vorgabenamen </w:t>
       </w:r>
       <w:r>
         <w:rPr>
@@ -4973,10 +4839,550 @@
           <w:sz w:val="20"/>
           <w:szCs w:val="20"/>
         </w:rPr>
-        <w:t xml:space="preserve">Diagnosedaten.txt</w:t>
-      </w:r>
-      <w:r>
-        <w:t xml:space="preserve">, </w:t>
+        <w:t xml:space="preserve">EPOS-Plan_Supportpaket_&lt;yyyy-MM-dd_HHmm&gt;.zip</w:t>
+      </w:r>
+      <w:r>
+        <w:t xml:space="preserve"> und dem Filter ZIP; Abbruch schreibt nichts. Danach zeigt der Dialog eine Ergebniszeile mit Pfad, enthaltenen Einträgen und den Quellen, die es nicht gab — oder im Banner die Meldung des Schreibfehlers. Der Anwender hängt die Datei an seine E-Mail; das ist der Supportweg ohne Fernwartung und steht auch der Testversion offen.</w:t>
+      </w:r>
+    </w:p>
+    <w:tbl>
+      <w:tblPr>
+        <w:tblW w:type="dxa" w:w="9638"/>
+        <w:tblBorders>
+          <w:top w:val="single" w:color="auto" w:sz="4"/>
+          <w:left w:val="single" w:color="auto" w:sz="4"/>
+          <w:bottom w:val="single" w:color="auto" w:sz="4"/>
+          <w:right w:val="single" w:color="auto" w:sz="4"/>
+          <w:insideH w:val="single" w:color="auto" w:sz="4"/>
+          <w:insideV w:val="single" w:color="auto" w:sz="4"/>
+        </w:tblBorders>
+      </w:tblPr>
+      <w:tblGrid>
+        <w:gridCol w:w="3352"/>
+        <w:gridCol w:w="6286"/>
+      </w:tblGrid>
+      <w:tr>
+        <w:trPr>
+          <w:cantSplit/>
+          <w:tblHeader/>
+        </w:trPr>
+        <w:tc>
+          <w:tcPr>
+            <w:tcW w:type="dxa" w:w="3352"/>
+            <w:tcBorders>
+              <w:top w:val="single" w:color="A6A6A6" w:sz="4"/>
+              <w:left w:val="single" w:color="A6A6A6" w:sz="4"/>
+              <w:bottom w:val="single" w:color="A6A6A6" w:sz="4"/>
+              <w:right w:val="single" w:color="A6A6A6" w:sz="4"/>
+            </w:tcBorders>
+            <w:shd w:fill="D9D9D9" w:color="auto" w:val="clear"/>
+            <w:tcMar>
+              <w:top w:type="dxa" w:w="50"/>
+              <w:left w:type="dxa" w:w="90"/>
+              <w:bottom w:type="dxa" w:w="50"/>
+              <w:right w:type="dxa" w:w="90"/>
+            </w:tcMar>
+          </w:tcPr>
+          <w:p>
+            <w:pPr>
+              <w:spacing w:after="0"/>
+            </w:pPr>
+            <w:r>
+              <w:rPr>
+                <w:b/>
+                <w:bCs/>
+                <w:sz w:val="19"/>
+                <w:szCs w:val="19"/>
+              </w:rPr>
+              <w:t xml:space="preserve">Eintrag im Paket</w:t>
+            </w:r>
+          </w:p>
+        </w:tc>
+        <w:tc>
+          <w:tcPr>
+            <w:tcW w:type="dxa" w:w="6286"/>
+            <w:tcBorders>
+              <w:top w:val="single" w:color="A6A6A6" w:sz="4"/>
+              <w:left w:val="single" w:color="A6A6A6" w:sz="4"/>
+              <w:bottom w:val="single" w:color="A6A6A6" w:sz="4"/>
+              <w:right w:val="single" w:color="A6A6A6" w:sz="4"/>
+            </w:tcBorders>
+            <w:shd w:fill="D9D9D9" w:color="auto" w:val="clear"/>
+            <w:tcMar>
+              <w:top w:type="dxa" w:w="50"/>
+              <w:left w:type="dxa" w:w="90"/>
+              <w:bottom w:type="dxa" w:w="50"/>
+              <w:right w:type="dxa" w:w="90"/>
+            </w:tcMar>
+          </w:tcPr>
+          <w:p>
+            <w:pPr>
+              <w:spacing w:after="0"/>
+            </w:pPr>
+            <w:r>
+              <w:rPr>
+                <w:b/>
+                <w:bCs/>
+                <w:sz w:val="19"/>
+                <w:szCs w:val="19"/>
+              </w:rPr>
+              <w:t xml:space="preserve">Quelle</w:t>
+            </w:r>
+          </w:p>
+        </w:tc>
+      </w:tr>
+      <w:tr>
+        <w:trPr>
+          <w:cantSplit/>
+          <w:tblHeader w:val="false"/>
+        </w:trPr>
+        <w:tc>
+          <w:tcPr>
+            <w:tcW w:type="dxa" w:w="3352"/>
+            <w:tcBorders>
+              <w:top w:val="single" w:color="A6A6A6" w:sz="4"/>
+              <w:left w:val="single" w:color="A6A6A6" w:sz="4"/>
+              <w:bottom w:val="single" w:color="A6A6A6" w:sz="4"/>
+              <w:right w:val="single" w:color="A6A6A6" w:sz="4"/>
+            </w:tcBorders>
+            <w:tcMar>
+              <w:top w:type="dxa" w:w="50"/>
+              <w:left w:type="dxa" w:w="90"/>
+              <w:bottom w:type="dxa" w:w="50"/>
+              <w:right w:type="dxa" w:w="90"/>
+            </w:tcMar>
+          </w:tcPr>
+          <w:p>
+            <w:pPr>
+              <w:spacing w:after="0"/>
+            </w:pPr>
+            <w:r>
+              <w:rPr>
+                <w:rFonts w:ascii="Consolas" w:cs="Consolas" w:eastAsia="Consolas" w:hAnsi="Consolas"/>
+                <w:sz w:val="18"/>
+                <w:szCs w:val="18"/>
+              </w:rPr>
+              <w:t xml:space="preserve">Diagnosedaten.txt</w:t>
+            </w:r>
+          </w:p>
+        </w:tc>
+        <w:tc>
+          <w:tcPr>
+            <w:tcW w:type="dxa" w:w="6286"/>
+            <w:tcBorders>
+              <w:top w:val="single" w:color="A6A6A6" w:sz="4"/>
+              <w:left w:val="single" w:color="A6A6A6" w:sz="4"/>
+              <w:bottom w:val="single" w:color="A6A6A6" w:sz="4"/>
+              <w:right w:val="single" w:color="A6A6A6" w:sz="4"/>
+            </w:tcBorders>
+            <w:tcMar>
+              <w:top w:type="dxa" w:w="50"/>
+              <w:left w:type="dxa" w:w="90"/>
+              <w:bottom w:type="dxa" w:w="50"/>
+              <w:right w:type="dxa" w:w="90"/>
+            </w:tcMar>
+          </w:tcPr>
+          <w:p>
+            <w:pPr>
+              <w:spacing w:after="0"/>
+            </w:pPr>
+            <w:r>
+              <w:rPr>
+                <w:sz w:val="19"/>
+                <w:szCs w:val="19"/>
+              </w:rPr>
+              <w:t xml:space="preserve">der Diagnoseblock, wie der Dialog ihn zeigt</w:t>
+            </w:r>
+          </w:p>
+        </w:tc>
+      </w:tr>
+      <w:tr>
+        <w:trPr>
+          <w:cantSplit/>
+          <w:tblHeader w:val="false"/>
+        </w:trPr>
+        <w:tc>
+          <w:tcPr>
+            <w:tcW w:type="dxa" w:w="3352"/>
+            <w:tcBorders>
+              <w:top w:val="single" w:color="A6A6A6" w:sz="4"/>
+              <w:left w:val="single" w:color="A6A6A6" w:sz="4"/>
+              <w:bottom w:val="single" w:color="A6A6A6" w:sz="4"/>
+              <w:right w:val="single" w:color="A6A6A6" w:sz="4"/>
+            </w:tcBorders>
+            <w:tcMar>
+              <w:top w:type="dxa" w:w="50"/>
+              <w:left w:type="dxa" w:w="90"/>
+              <w:bottom w:type="dxa" w:w="50"/>
+              <w:right w:type="dxa" w:w="90"/>
+            </w:tcMar>
+          </w:tcPr>
+          <w:p>
+            <w:pPr>
+              <w:spacing w:after="0"/>
+            </w:pPr>
+            <w:r>
+              <w:rPr>
+                <w:rFonts w:ascii="Consolas" w:cs="Consolas" w:eastAsia="Consolas" w:hAnsi="Consolas"/>
+                <w:sz w:val="18"/>
+                <w:szCs w:val="18"/>
+              </w:rPr>
+              <w:t xml:space="preserve">Ausnahmen.txt</w:t>
+            </w:r>
+            <w:r>
+              <w:rPr>
+                <w:sz w:val="19"/>
+                <w:szCs w:val="19"/>
+              </w:rPr>
+              <w:t xml:space="preserve">, </w:t>
+            </w:r>
+            <w:r>
+              <w:rPr>
+                <w:rFonts w:ascii="Consolas" w:cs="Consolas" w:eastAsia="Consolas" w:hAnsi="Consolas"/>
+                <w:sz w:val="18"/>
+                <w:szCs w:val="18"/>
+              </w:rPr>
+              <w:t xml:space="preserve">Ausnahmen.alt.txt</w:t>
+            </w:r>
+          </w:p>
+        </w:tc>
+        <w:tc>
+          <w:tcPr>
+            <w:tcW w:type="dxa" w:w="6286"/>
+            <w:tcBorders>
+              <w:top w:val="single" w:color="A6A6A6" w:sz="4"/>
+              <w:left w:val="single" w:color="A6A6A6" w:sz="4"/>
+              <w:bottom w:val="single" w:color="A6A6A6" w:sz="4"/>
+              <w:right w:val="single" w:color="A6A6A6" w:sz="4"/>
+            </w:tcBorders>
+            <w:tcMar>
+              <w:top w:type="dxa" w:w="50"/>
+              <w:left w:type="dxa" w:w="90"/>
+              <w:bottom w:type="dxa" w:w="50"/>
+              <w:right w:type="dxa" w:w="90"/>
+            </w:tcMar>
+          </w:tcPr>
+          <w:p>
+            <w:pPr>
+              <w:spacing w:after="0"/>
+            </w:pPr>
+            <w:r>
+              <w:rPr>
+                <w:sz w:val="19"/>
+                <w:szCs w:val="19"/>
+              </w:rPr>
+              <w:t xml:space="preserve">Protokollordner </w:t>
+            </w:r>
+            <w:r>
+              <w:rPr>
+                <w:rFonts w:ascii="Consolas" w:cs="Consolas" w:eastAsia="Consolas" w:hAnsi="Consolas"/>
+                <w:sz w:val="18"/>
+                <w:szCs w:val="18"/>
+              </w:rPr>
+              <w:t xml:space="preserve">Logs\</w:t>
+            </w:r>
+            <w:r>
+              <w:rPr>
+                <w:sz w:val="19"/>
+                <w:szCs w:val="19"/>
+              </w:rPr>
+              <w:t xml:space="preserve"> neben der Datenbank (</w:t>
+            </w:r>
+            <w:r>
+              <w:rPr>
+                <w:rFonts w:ascii="Consolas" w:cs="Consolas" w:eastAsia="Consolas" w:hAnsi="Consolas"/>
+                <w:sz w:val="18"/>
+                <w:szCs w:val="18"/>
+              </w:rPr>
+              <w:t xml:space="preserve">Diagnosedaten.ProtokollordnerPfad</w:t>
+            </w:r>
+            <w:r>
+              <w:rPr>
+                <w:sz w:val="19"/>
+                <w:szCs w:val="19"/>
+              </w:rPr>
+              <w:t xml:space="preserve">)</w:t>
+            </w:r>
+          </w:p>
+        </w:tc>
+      </w:tr>
+      <w:tr>
+        <w:trPr>
+          <w:cantSplit/>
+          <w:tblHeader w:val="false"/>
+        </w:trPr>
+        <w:tc>
+          <w:tcPr>
+            <w:tcW w:type="dxa" w:w="3352"/>
+            <w:tcBorders>
+              <w:top w:val="single" w:color="A6A6A6" w:sz="4"/>
+              <w:left w:val="single" w:color="A6A6A6" w:sz="4"/>
+              <w:bottom w:val="single" w:color="A6A6A6" w:sz="4"/>
+              <w:right w:val="single" w:color="A6A6A6" w:sz="4"/>
+            </w:tcBorders>
+            <w:tcMar>
+              <w:top w:type="dxa" w:w="50"/>
+              <w:left w:type="dxa" w:w="90"/>
+              <w:bottom w:type="dxa" w:w="50"/>
+              <w:right w:type="dxa" w:w="90"/>
+            </w:tcMar>
+          </w:tcPr>
+          <w:p>
+            <w:pPr>
+              <w:spacing w:after="0"/>
+            </w:pPr>
+            <w:r>
+              <w:rPr>
+                <w:rFonts w:ascii="Consolas" w:cs="Consolas" w:eastAsia="Consolas" w:hAnsi="Consolas"/>
+                <w:sz w:val="18"/>
+                <w:szCs w:val="18"/>
+              </w:rPr>
+              <w:t xml:space="preserve">migration_protokoll.txt</w:t>
+            </w:r>
+          </w:p>
+        </w:tc>
+        <w:tc>
+          <w:tcPr>
+            <w:tcW w:type="dxa" w:w="6286"/>
+            <w:tcBorders>
+              <w:top w:val="single" w:color="A6A6A6" w:sz="4"/>
+              <w:left w:val="single" w:color="A6A6A6" w:sz="4"/>
+              <w:bottom w:val="single" w:color="A6A6A6" w:sz="4"/>
+              <w:right w:val="single" w:color="A6A6A6" w:sz="4"/>
+            </w:tcBorders>
+            <w:tcMar>
+              <w:top w:type="dxa" w:w="50"/>
+              <w:left w:type="dxa" w:w="90"/>
+              <w:bottom w:type="dxa" w:w="50"/>
+              <w:right w:type="dxa" w:w="90"/>
+            </w:tcMar>
+          </w:tcPr>
+          <w:p>
+            <w:pPr>
+              <w:spacing w:after="0"/>
+            </w:pPr>
+            <w:r>
+              <w:rPr>
+                <w:sz w:val="19"/>
+                <w:szCs w:val="19"/>
+              </w:rPr>
+              <w:t xml:space="preserve">neben der Datenbank (Rückfall </w:t>
+            </w:r>
+            <w:r>
+              <w:rPr>
+                <w:rFonts w:ascii="Consolas" w:cs="Consolas" w:eastAsia="Consolas" w:hAnsi="Consolas"/>
+                <w:sz w:val="18"/>
+                <w:szCs w:val="18"/>
+              </w:rPr>
+              <w:t xml:space="preserve">Logs\</w:t>
+            </w:r>
+            <w:r>
+              <w:rPr>
+                <w:sz w:val="19"/>
+                <w:szCs w:val="19"/>
+              </w:rPr>
+              <w:t xml:space="preserve">)</w:t>
+            </w:r>
+          </w:p>
+        </w:tc>
+      </w:tr>
+      <w:tr>
+        <w:trPr>
+          <w:cantSplit/>
+          <w:tblHeader w:val="false"/>
+        </w:trPr>
+        <w:tc>
+          <w:tcPr>
+            <w:tcW w:type="dxa" w:w="3352"/>
+            <w:tcBorders>
+              <w:top w:val="single" w:color="A6A6A6" w:sz="4"/>
+              <w:left w:val="single" w:color="A6A6A6" w:sz="4"/>
+              <w:bottom w:val="single" w:color="A6A6A6" w:sz="4"/>
+              <w:right w:val="single" w:color="A6A6A6" w:sz="4"/>
+            </w:tcBorders>
+            <w:tcMar>
+              <w:top w:type="dxa" w:w="50"/>
+              <w:left w:type="dxa" w:w="90"/>
+              <w:bottom w:type="dxa" w:w="50"/>
+              <w:right w:type="dxa" w:w="90"/>
+            </w:tcMar>
+          </w:tcPr>
+          <w:p>
+            <w:pPr>
+              <w:spacing w:after="0"/>
+            </w:pPr>
+            <w:r>
+              <w:rPr>
+                <w:rFonts w:ascii="Consolas" w:cs="Consolas" w:eastAsia="Consolas" w:hAnsi="Consolas"/>
+                <w:sz w:val="18"/>
+                <w:szCs w:val="18"/>
+              </w:rPr>
+              <w:t xml:space="preserve">Katalogabgleich.txt</w:t>
+            </w:r>
+          </w:p>
+        </w:tc>
+        <w:tc>
+          <w:tcPr>
+            <w:tcW w:type="dxa" w:w="6286"/>
+            <w:tcBorders>
+              <w:top w:val="single" w:color="A6A6A6" w:sz="4"/>
+              <w:left w:val="single" w:color="A6A6A6" w:sz="4"/>
+              <w:bottom w:val="single" w:color="A6A6A6" w:sz="4"/>
+              <w:right w:val="single" w:color="A6A6A6" w:sz="4"/>
+            </w:tcBorders>
+            <w:tcMar>
+              <w:top w:type="dxa" w:w="50"/>
+              <w:left w:type="dxa" w:w="90"/>
+              <w:bottom w:type="dxa" w:w="50"/>
+              <w:right w:type="dxa" w:w="90"/>
+            </w:tcMar>
+          </w:tcPr>
+          <w:p>
+            <w:pPr>
+              <w:spacing w:after="0"/>
+            </w:pPr>
+            <w:r>
+              <w:rPr>
+                <w:sz w:val="19"/>
+                <w:szCs w:val="19"/>
+              </w:rPr>
+              <w:t xml:space="preserve">die jüngsten 2 000 Zeilen von </w:t>
+            </w:r>
+            <w:r>
+              <w:rPr>
+                <w:rFonts w:ascii="Consolas" w:cs="Consolas" w:eastAsia="Consolas" w:hAnsi="Consolas"/>
+                <w:sz w:val="18"/>
+                <w:szCs w:val="18"/>
+              </w:rPr>
+              <w:t xml:space="preserve">Tab_Katalogabgleich</w:t>
+            </w:r>
+            <w:r>
+              <w:rPr>
+                <w:sz w:val="19"/>
+                <w:szCs w:val="19"/>
+              </w:rPr>
+              <w:t xml:space="preserve">, neueste zuerst, tabulatorgetrennt mit Spaltenköpfen (über </w:t>
+            </w:r>
+            <w:r>
+              <w:rPr>
+                <w:rFonts w:ascii="Consolas" w:cs="Consolas" w:eastAsia="Consolas" w:hAnsi="Consolas"/>
+                <w:sz w:val="18"/>
+                <w:szCs w:val="18"/>
+              </w:rPr>
+              <w:t xml:space="preserve">Katalogabgleich.Protokoll</w:t>
+            </w:r>
+            <w:r>
+              <w:rPr>
+                <w:sz w:val="19"/>
+                <w:szCs w:val="19"/>
+              </w:rPr>
+              <w:t xml:space="preserve">, kein eigenes SQL)</w:t>
+            </w:r>
+          </w:p>
+        </w:tc>
+      </w:tr>
+      <w:tr>
+        <w:trPr>
+          <w:cantSplit/>
+          <w:tblHeader w:val="false"/>
+        </w:trPr>
+        <w:tc>
+          <w:tcPr>
+            <w:tcW w:type="dxa" w:w="3352"/>
+            <w:tcBorders>
+              <w:top w:val="single" w:color="A6A6A6" w:sz="4"/>
+              <w:left w:val="single" w:color="A6A6A6" w:sz="4"/>
+              <w:bottom w:val="single" w:color="A6A6A6" w:sz="4"/>
+              <w:right w:val="single" w:color="A6A6A6" w:sz="4"/>
+            </w:tcBorders>
+            <w:tcMar>
+              <w:top w:type="dxa" w:w="50"/>
+              <w:left w:type="dxa" w:w="90"/>
+              <w:bottom w:type="dxa" w:w="50"/>
+              <w:right w:type="dxa" w:w="90"/>
+            </w:tcMar>
+          </w:tcPr>
+          <w:p>
+            <w:pPr>
+              <w:spacing w:after="0"/>
+            </w:pPr>
+            <w:r>
+              <w:rPr>
+                <w:rFonts w:ascii="Consolas" w:cs="Consolas" w:eastAsia="Consolas" w:hAnsi="Consolas"/>
+                <w:sz w:val="18"/>
+                <w:szCs w:val="18"/>
+              </w:rPr>
+              <w:t xml:space="preserve">ki_aktionen.txt</w:t>
+            </w:r>
+          </w:p>
+        </w:tc>
+        <w:tc>
+          <w:tcPr>
+            <w:tcW w:type="dxa" w:w="6286"/>
+            <w:tcBorders>
+              <w:top w:val="single" w:color="A6A6A6" w:sz="4"/>
+              <w:left w:val="single" w:color="A6A6A6" w:sz="4"/>
+              <w:bottom w:val="single" w:color="A6A6A6" w:sz="4"/>
+              <w:right w:val="single" w:color="A6A6A6" w:sz="4"/>
+            </w:tcBorders>
+            <w:tcMar>
+              <w:top w:type="dxa" w:w="50"/>
+              <w:left w:type="dxa" w:w="90"/>
+              <w:bottom w:type="dxa" w:w="50"/>
+              <w:right w:type="dxa" w:w="90"/>
+            </w:tcMar>
+          </w:tcPr>
+          <w:p>
+            <w:pPr>
+              <w:spacing w:after="0"/>
+            </w:pPr>
+            <w:r>
+              <w:rPr>
+                <w:sz w:val="19"/>
+                <w:szCs w:val="19"/>
+              </w:rPr>
+              <w:t xml:space="preserve">nur mit Haken; </w:t>
+            </w:r>
+            <w:r>
+              <w:rPr>
+                <w:rFonts w:ascii="Consolas" w:cs="Consolas" w:eastAsia="Consolas" w:hAnsi="Consolas"/>
+                <w:sz w:val="18"/>
+                <w:szCs w:val="18"/>
+              </w:rPr>
+              <w:t xml:space="preserve">Logs\</w:t>
+            </w:r>
+            <w:r>
+              <w:rPr>
+                <w:sz w:val="19"/>
+                <w:szCs w:val="19"/>
+              </w:rPr>
+              <w:t xml:space="preserve">, sonst neben der Datenbank</w:t>
+            </w:r>
+          </w:p>
+        </w:tc>
+      </w:tr>
+    </w:tbl>
+    <w:p>
+      <w:pPr>
+        <w:spacing w:after="120"/>
+      </w:pPr>
+    </w:p>
+    <w:p>
+      <w:pPr>
+        <w:spacing w:after="120"/>
+      </w:pPr>
+      <w:r>
+        <w:t xml:space="preserve">Fehlt eine Quelle (kein Absturz bisher, keine Migration, Tabelle nicht vorhanden), ist das kein Fehler: Sie steht in der Ergebniszeile unter „Nicht vorhanden". </w:t>
+      </w:r>
+      <w:r>
+        <w:rPr>
+          <w:b/>
+          <w:bCs/>
+        </w:rPr>
+        <w:t xml:space="preserve">Datenschutz:</w:t>
+      </w:r>
+      <w:r>
+        <w:t xml:space="preserve"> Das Paket nimmt nur diese benannten Einträge auf — nie Projektdaten, nie die Datenbank oder eine andere </w:t>
       </w:r>
       <w:r>
         <w:rPr>
@@ -4984,54 +5390,10 @@
           <w:sz w:val="20"/>
           <w:szCs w:val="20"/>
         </w:rPr>
-        <w:t xml:space="preserve">Ausnahmen.txt</w:t>
-      </w:r>
-      <w:r>
-        <w:t xml:space="preserve">, </w:t>
-      </w:r>
-      <w:r>
-        <w:rPr>
-          <w:rFonts w:ascii="Consolas" w:cs="Consolas" w:eastAsia="Consolas" w:hAnsi="Consolas"/>
-          <w:sz w:val="20"/>
-          <w:szCs w:val="20"/>
-        </w:rPr>
-        <w:t xml:space="preserve">Ausnahmen.alt.txt</w:t>
-      </w:r>
-      <w:r>
-        <w:t xml:space="preserve">, </w:t>
-      </w:r>
-      <w:r>
-        <w:rPr>
-          <w:rFonts w:ascii="Consolas" w:cs="Consolas" w:eastAsia="Consolas" w:hAnsi="Consolas"/>
-          <w:sz w:val="20"/>
-          <w:szCs w:val="20"/>
-        </w:rPr>
-        <w:t xml:space="preserve">migration_protokoll.txt</w:t>
-      </w:r>
-      <w:r>
-        <w:t xml:space="preserve"> und dem Auszug aus </w:t>
-      </w:r>
-      <w:r>
-        <w:rPr>
-          <w:rFonts w:ascii="Consolas" w:cs="Consolas" w:eastAsia="Consolas" w:hAnsi="Consolas"/>
-          <w:sz w:val="20"/>
-          <w:szCs w:val="20"/>
-        </w:rPr>
-        <w:t xml:space="preserve">Tab_Katalogabgleich</w:t>
-      </w:r>
-      <w:r>
-        <w:t xml:space="preserve"> — ohne Projektdaten; </w:t>
-      </w:r>
-      <w:r>
-        <w:rPr>
-          <w:rFonts w:ascii="Consolas" w:cs="Consolas" w:eastAsia="Consolas" w:hAnsi="Consolas"/>
-          <w:sz w:val="20"/>
-          <w:szCs w:val="20"/>
-        </w:rPr>
-        <w:t xml:space="preserve">ki_aktionen.txt</w:t>
-      </w:r>
-      <w:r>
-        <w:t xml:space="preserve"> nur mit eigenem Haken, weil es Eingaben des Anwenders enthalten kann. Der Anwender hängt die Datei an seine E-Mail. Das ist der Supportweg ohne Fernwartung und steht auch der Testversion offen.</w:t>
+        <w:t xml:space="preserve">.sqlite</w:t>
+      </w:r>
+      <w:r>
+        <w:t xml:space="preserve">-Datei; die Diagnosedaten nennen Lizenznummer, Firma und Datenbankpfad, wie der Block im Dialog. Das KI-Protokoll kann Eingaben des Anwenders enthalten und kommt deshalb nur mit dem Haken hinein. EPOS-Plan versendet das Paket nicht selbst.</w:t>
       </w:r>
     </w:p>
     <w:p>
@@ -7598,6 +7960,130 @@
           </w:p>
         </w:tc>
       </w:tr>
+      <w:tr>
+        <w:trPr>
+          <w:cantSplit/>
+          <w:tblHeader w:val="false"/>
+        </w:trPr>
+        <w:tc>
+          <w:tcPr>
+            <w:tcW w:type="dxa" w:w="4589"/>
+            <w:tcBorders>
+              <w:top w:val="single" w:color="A6A6A6" w:sz="4"/>
+              <w:left w:val="single" w:color="A6A6A6" w:sz="4"/>
+              <w:bottom w:val="single" w:color="A6A6A6" w:sz="4"/>
+              <w:right w:val="single" w:color="A6A6A6" w:sz="4"/>
+            </w:tcBorders>
+            <w:tcMar>
+              <w:top w:type="dxa" w:w="50"/>
+              <w:left w:type="dxa" w:w="90"/>
+              <w:bottom w:type="dxa" w:w="50"/>
+              <w:right w:type="dxa" w:w="90"/>
+            </w:tcMar>
+          </w:tcPr>
+          <w:p>
+            <w:pPr>
+              <w:spacing w:after="0"/>
+            </w:pPr>
+            <w:r>
+              <w:rPr>
+                <w:rFonts w:ascii="Consolas" w:cs="Consolas" w:eastAsia="Consolas" w:hAnsi="Consolas"/>
+                <w:sz w:val="18"/>
+                <w:szCs w:val="18"/>
+              </w:rPr>
+              <w:t xml:space="preserve">SupportpaketTests</w:t>
+            </w:r>
+            <w:r>
+              <w:rPr>
+                <w:sz w:val="19"/>
+                <w:szCs w:val="19"/>
+              </w:rPr>
+              <w:t xml:space="preserve"> (Kern), bunit </w:t>
+            </w:r>
+            <w:r>
+              <w:rPr>
+                <w:rFonts w:ascii="Consolas" w:cs="Consolas" w:eastAsia="Consolas" w:hAnsi="Consolas"/>
+                <w:sz w:val="18"/>
+                <w:szCs w:val="18"/>
+              </w:rPr>
+              <w:t xml:space="preserve">UeberDialog</w:t>
+            </w:r>
+          </w:p>
+        </w:tc>
+        <w:tc>
+          <w:tcPr>
+            <w:tcW w:type="dxa" w:w="4589"/>
+            <w:tcBorders>
+              <w:top w:val="single" w:color="A6A6A6" w:sz="4"/>
+              <w:left w:val="single" w:color="A6A6A6" w:sz="4"/>
+              <w:bottom w:val="single" w:color="A6A6A6" w:sz="4"/>
+              <w:right w:val="single" w:color="A6A6A6" w:sz="4"/>
+            </w:tcBorders>
+            <w:tcMar>
+              <w:top w:type="dxa" w:w="50"/>
+              <w:left w:type="dxa" w:w="90"/>
+              <w:bottom w:type="dxa" w:w="50"/>
+              <w:right w:type="dxa" w:w="90"/>
+            </w:tcMar>
+          </w:tcPr>
+          <w:p>
+            <w:pPr>
+              <w:spacing w:after="0"/>
+            </w:pPr>
+            <w:r>
+              <w:rPr>
+                <w:sz w:val="19"/>
+                <w:szCs w:val="19"/>
+              </w:rPr>
+              <w:t xml:space="preserve">Paket mit Diagnosedaten, vorhandene Protokolle drin, fehlende benannt, KI-Protokoll nur mit Haken, nie </w:t>
+            </w:r>
+            <w:r>
+              <w:rPr>
+                <w:rFonts w:ascii="Consolas" w:cs="Consolas" w:eastAsia="Consolas" w:hAnsi="Consolas"/>
+                <w:sz w:val="18"/>
+                <w:szCs w:val="18"/>
+              </w:rPr>
+              <w:t xml:space="preserve">.sqlite</w:t>
+            </w:r>
+            <w:r>
+              <w:rPr>
+                <w:sz w:val="19"/>
+                <w:szCs w:val="19"/>
+              </w:rPr>
+              <w:t xml:space="preserve">, Schreibfehler benannt; ohne Rückruf kein Knopf, Klick übergibt den Haken, Ergebniszeile</w:t>
+            </w:r>
+          </w:p>
+        </w:tc>
+        <w:tc>
+          <w:tcPr>
+            <w:tcW w:type="dxa" w:w="460"/>
+            <w:tcBorders>
+              <w:top w:val="single" w:color="A6A6A6" w:sz="4"/>
+              <w:left w:val="single" w:color="A6A6A6" w:sz="4"/>
+              <w:bottom w:val="single" w:color="A6A6A6" w:sz="4"/>
+              <w:right w:val="single" w:color="A6A6A6" w:sz="4"/>
+            </w:tcBorders>
+            <w:tcMar>
+              <w:top w:type="dxa" w:w="50"/>
+              <w:left w:type="dxa" w:w="90"/>
+              <w:bottom w:type="dxa" w:w="50"/>
+              <w:right w:type="dxa" w:w="90"/>
+            </w:tcMar>
+          </w:tcPr>
+          <w:p>
+            <w:pPr>
+              <w:spacing w:after="0"/>
+            </w:pPr>
+            <w:r>
+              <w:rPr>
+                <w:sz w:val="19"/>
+                <w:szCs w:val="19"/>
+              </w:rPr>
+              <w:t xml:space="preserve">3</w:t>
+            </w:r>
+          </w:p>
+        </w:tc>
+      </w:tr>
     </w:tbl>
     <w:p>
       <w:pPr>
@@ -9521,7 +10007,7 @@
                 <w:sz w:val="19"/>
                 <w:szCs w:val="19"/>
               </w:rPr>
-              <w:t xml:space="preserve">Über-Dialog, Diagnosedaten</w:t>
+              <w:t xml:space="preserve">Über-Dialog</w:t>
             </w:r>
           </w:p>
         </w:tc>
@@ -9566,8 +10052,375 @@
                 <w:sz w:val="18"/>
                 <w:szCs w:val="18"/>
               </w:rPr>
+              <w:t xml:space="preserve">UeberDaten.cs</w:t>
+            </w:r>
+            <w:r>
+              <w:rPr>
+                <w:sz w:val="19"/>
+                <w:szCs w:val="19"/>
+              </w:rPr>
+              <w:t xml:space="preserve"> (mit </w:t>
+            </w:r>
+            <w:r>
+              <w:rPr>
+                <w:rFonts w:ascii="Consolas" w:cs="Consolas" w:eastAsia="Consolas" w:hAnsi="Consolas"/>
+                <w:sz w:val="18"/>
+                <w:szCs w:val="18"/>
+              </w:rPr>
+              <w:t xml:space="preserve">UeberAnstoss</w:t>
+            </w:r>
+            <w:r>
+              <w:rPr>
+                <w:sz w:val="19"/>
+                <w:szCs w:val="19"/>
+              </w:rPr>
+              <w:t xml:space="preserve">, </w:t>
+            </w:r>
+            <w:r>
+              <w:rPr>
+                <w:rFonts w:ascii="Consolas" w:cs="Consolas" w:eastAsia="Consolas" w:hAnsi="Consolas"/>
+                <w:sz w:val="18"/>
+                <w:szCs w:val="18"/>
+              </w:rPr>
+              <w:t xml:space="preserve">UeberTexte</w:t>
+            </w:r>
+            <w:r>
+              <w:rPr>
+                <w:sz w:val="19"/>
+                <w:szCs w:val="19"/>
+              </w:rPr>
+              <w:t xml:space="preserve">), Hülle </w:t>
+            </w:r>
+            <w:r>
+              <w:rPr>
+                <w:rFonts w:ascii="Consolas" w:cs="Consolas" w:eastAsia="Consolas" w:hAnsi="Consolas"/>
+                <w:sz w:val="18"/>
+                <w:szCs w:val="18"/>
+              </w:rPr>
+              <w:t xml:space="preserve">EPOS.UI.Daten/Hilfe/UeberHuelle.cs</w:t>
+            </w:r>
+            <w:r>
+              <w:rPr>
+                <w:sz w:val="19"/>
+                <w:szCs w:val="19"/>
+              </w:rPr>
+              <w:t xml:space="preserve">, Fenster </w:t>
+            </w:r>
+            <w:r>
+              <w:rPr>
+                <w:rFonts w:ascii="Consolas" w:cs="Consolas" w:eastAsia="Consolas" w:hAnsi="Consolas"/>
+                <w:sz w:val="18"/>
+                <w:szCs w:val="18"/>
+              </w:rPr>
+              <w:t xml:space="preserve">WindowsFormsApplication1/Views/Help/UeberFenster.cs</w:t>
+            </w:r>
+            <w:r>
+              <w:rPr>
+                <w:sz w:val="19"/>
+                <w:szCs w:val="19"/>
+              </w:rPr>
+              <w:t xml:space="preserve">, Fall </w:t>
+            </w:r>
+            <w:r>
+              <w:rPr>
+                <w:rFonts w:ascii="Consolas" w:cs="Consolas" w:eastAsia="Consolas" w:hAnsi="Consolas"/>
+                <w:sz w:val="18"/>
+                <w:szCs w:val="18"/>
+              </w:rPr>
+              <w:t xml:space="preserve">Version</w:t>
+            </w:r>
+            <w:r>
+              <w:rPr>
+                <w:sz w:val="19"/>
+                <w:szCs w:val="19"/>
+              </w:rPr>
+              <w:t xml:space="preserve"> in </w:t>
+            </w:r>
+            <w:r>
+              <w:rPr>
+                <w:rFonts w:ascii="Consolas" w:cs="Consolas" w:eastAsia="Consolas" w:hAnsi="Consolas"/>
+                <w:sz w:val="18"/>
+                <w:szCs w:val="18"/>
+              </w:rPr>
+              <w:t xml:space="preserve">HauptfensterHuelle.cs</w:t>
+            </w:r>
+          </w:p>
+        </w:tc>
+        <w:tc>
+          <w:tcPr>
+            <w:tcW w:type="dxa" w:w="547"/>
+            <w:tcBorders>
+              <w:top w:val="single" w:color="A6A6A6" w:sz="4"/>
+              <w:left w:val="single" w:color="A6A6A6" w:sz="4"/>
+              <w:bottom w:val="single" w:color="A6A6A6" w:sz="4"/>
+              <w:right w:val="single" w:color="A6A6A6" w:sz="4"/>
+            </w:tcBorders>
+            <w:tcMar>
+              <w:top w:type="dxa" w:w="50"/>
+              <w:left w:type="dxa" w:w="90"/>
+              <w:bottom w:type="dxa" w:w="50"/>
+              <w:right w:type="dxa" w:w="90"/>
+            </w:tcMar>
+          </w:tcPr>
+          <w:p>
+            <w:pPr>
+              <w:spacing w:after="0"/>
+            </w:pPr>
+            <w:r>
+              <w:rPr>
+                <w:sz w:val="19"/>
+                <w:szCs w:val="19"/>
+              </w:rPr>
+              <w:t xml:space="preserve">heute</w:t>
+            </w:r>
+          </w:p>
+        </w:tc>
+      </w:tr>
+      <w:tr>
+        <w:trPr>
+          <w:cantSplit/>
+          <w:tblHeader w:val="false"/>
+        </w:trPr>
+        <w:tc>
+          <w:tcPr>
+            <w:tcW w:type="dxa" w:w="3636"/>
+            <w:tcBorders>
+              <w:top w:val="single" w:color="A6A6A6" w:sz="4"/>
+              <w:left w:val="single" w:color="A6A6A6" w:sz="4"/>
+              <w:bottom w:val="single" w:color="A6A6A6" w:sz="4"/>
+              <w:right w:val="single" w:color="A6A6A6" w:sz="4"/>
+            </w:tcBorders>
+            <w:tcMar>
+              <w:top w:type="dxa" w:w="50"/>
+              <w:left w:type="dxa" w:w="90"/>
+              <w:bottom w:type="dxa" w:w="50"/>
+              <w:right w:type="dxa" w:w="90"/>
+            </w:tcMar>
+          </w:tcPr>
+          <w:p>
+            <w:pPr>
+              <w:spacing w:after="0"/>
+            </w:pPr>
+            <w:r>
+              <w:rPr>
+                <w:sz w:val="19"/>
+                <w:szCs w:val="19"/>
+              </w:rPr>
+              <w:t xml:space="preserve">Geste des Entwicklermodus</w:t>
+            </w:r>
+          </w:p>
+        </w:tc>
+        <w:tc>
+          <w:tcPr>
+            <w:tcW w:type="dxa" w:w="5455"/>
+            <w:tcBorders>
+              <w:top w:val="single" w:color="A6A6A6" w:sz="4"/>
+              <w:left w:val="single" w:color="A6A6A6" w:sz="4"/>
+              <w:bottom w:val="single" w:color="A6A6A6" w:sz="4"/>
+              <w:right w:val="single" w:color="A6A6A6" w:sz="4"/>
+            </w:tcBorders>
+            <w:tcMar>
+              <w:top w:type="dxa" w:w="50"/>
+              <w:left w:type="dxa" w:w="90"/>
+              <w:bottom w:type="dxa" w:w="50"/>
+              <w:right w:type="dxa" w:w="90"/>
+            </w:tcMar>
+          </w:tcPr>
+          <w:p>
+            <w:pPr>
+              <w:spacing w:after="0"/>
+            </w:pPr>
+            <w:r>
+              <w:rPr>
+                <w:rFonts w:ascii="Consolas" w:cs="Consolas" w:eastAsia="Consolas" w:hAnsi="Consolas"/>
+                <w:sz w:val="18"/>
+                <w:szCs w:val="18"/>
+              </w:rPr>
+              <w:t xml:space="preserve">UeberFenster</w:t>
+            </w:r>
+            <w:r>
+              <w:rPr>
+                <w:sz w:val="19"/>
+                <w:szCs w:val="19"/>
+              </w:rPr>
+              <w:t xml:space="preserve"> (Abfang über </w:t>
+            </w:r>
+            <w:r>
+              <w:rPr>
+                <w:rFonts w:ascii="Consolas" w:cs="Consolas" w:eastAsia="Consolas" w:hAnsi="Consolas"/>
+                <w:sz w:val="18"/>
+                <w:szCs w:val="18"/>
+              </w:rPr>
+              <w:t xml:space="preserve">BlazorDialogForm.Befehlstaste</w:t>
+            </w:r>
+            <w:r>
+              <w:rPr>
+                <w:sz w:val="19"/>
+                <w:szCs w:val="19"/>
+              </w:rPr>
+              <w:t xml:space="preserve">), </w:t>
+            </w:r>
+            <w:r>
+              <w:rPr>
+                <w:rFonts w:ascii="Consolas" w:cs="Consolas" w:eastAsia="Consolas" w:hAnsi="Consolas"/>
+                <w:sz w:val="18"/>
+                <w:szCs w:val="18"/>
+              </w:rPr>
+              <w:t xml:space="preserve">WindowsFormsApplication1/Views/Entwicklung/EntwicklungHuelle.cs</w:t>
+            </w:r>
+            <w:r>
+              <w:rPr>
+                <w:sz w:val="19"/>
+                <w:szCs w:val="19"/>
+              </w:rPr>
+              <w:t xml:space="preserve"> (</w:t>
+            </w:r>
+            <w:r>
+              <w:rPr>
+                <w:rFonts w:ascii="Consolas" w:cs="Consolas" w:eastAsia="Consolas" w:hAnsi="Consolas"/>
+                <w:sz w:val="18"/>
+                <w:szCs w:val="18"/>
+              </w:rPr>
+              <w:t xml:space="preserve">GesteUmschalten</w:t>
+            </w:r>
+            <w:r>
+              <w:rPr>
+                <w:sz w:val="19"/>
+                <w:szCs w:val="19"/>
+              </w:rPr>
+              <w:t xml:space="preserve">)</w:t>
+            </w:r>
+          </w:p>
+        </w:tc>
+        <w:tc>
+          <w:tcPr>
+            <w:tcW w:type="dxa" w:w="547"/>
+            <w:tcBorders>
+              <w:top w:val="single" w:color="A6A6A6" w:sz="4"/>
+              <w:left w:val="single" w:color="A6A6A6" w:sz="4"/>
+              <w:bottom w:val="single" w:color="A6A6A6" w:sz="4"/>
+              <w:right w:val="single" w:color="A6A6A6" w:sz="4"/>
+            </w:tcBorders>
+            <w:tcMar>
+              <w:top w:type="dxa" w:w="50"/>
+              <w:left w:type="dxa" w:w="90"/>
+              <w:bottom w:type="dxa" w:w="50"/>
+              <w:right w:type="dxa" w:w="90"/>
+            </w:tcMar>
+          </w:tcPr>
+          <w:p>
+            <w:pPr>
+              <w:spacing w:after="0"/>
+            </w:pPr>
+            <w:r>
+              <w:rPr>
+                <w:sz w:val="19"/>
+                <w:szCs w:val="19"/>
+              </w:rPr>
+              <w:t xml:space="preserve">heute</w:t>
+            </w:r>
+          </w:p>
+        </w:tc>
+      </w:tr>
+      <w:tr>
+        <w:trPr>
+          <w:cantSplit/>
+          <w:tblHeader w:val="false"/>
+        </w:trPr>
+        <w:tc>
+          <w:tcPr>
+            <w:tcW w:type="dxa" w:w="3636"/>
+            <w:tcBorders>
+              <w:top w:val="single" w:color="A6A6A6" w:sz="4"/>
+              <w:left w:val="single" w:color="A6A6A6" w:sz="4"/>
+              <w:bottom w:val="single" w:color="A6A6A6" w:sz="4"/>
+              <w:right w:val="single" w:color="A6A6A6" w:sz="4"/>
+            </w:tcBorders>
+            <w:tcMar>
+              <w:top w:type="dxa" w:w="50"/>
+              <w:left w:type="dxa" w:w="90"/>
+              <w:bottom w:type="dxa" w:w="50"/>
+              <w:right w:type="dxa" w:w="90"/>
+            </w:tcMar>
+          </w:tcPr>
+          <w:p>
+            <w:pPr>
+              <w:spacing w:after="0"/>
+            </w:pPr>
+            <w:r>
+              <w:rPr>
+                <w:sz w:val="19"/>
+                <w:szCs w:val="19"/>
+              </w:rPr>
+              <w:t xml:space="preserve">Diagnosedaten</w:t>
+            </w:r>
+          </w:p>
+        </w:tc>
+        <w:tc>
+          <w:tcPr>
+            <w:tcW w:type="dxa" w:w="5455"/>
+            <w:tcBorders>
+              <w:top w:val="single" w:color="A6A6A6" w:sz="4"/>
+              <w:left w:val="single" w:color="A6A6A6" w:sz="4"/>
+              <w:bottom w:val="single" w:color="A6A6A6" w:sz="4"/>
+              <w:right w:val="single" w:color="A6A6A6" w:sz="4"/>
+            </w:tcBorders>
+            <w:tcMar>
+              <w:top w:type="dxa" w:w="50"/>
+              <w:left w:type="dxa" w:w="90"/>
+              <w:bottom w:type="dxa" w:w="50"/>
+              <w:right w:type="dxa" w:w="90"/>
+            </w:tcMar>
+          </w:tcPr>
+          <w:p>
+            <w:pPr>
+              <w:spacing w:after="0"/>
+            </w:pPr>
+            <w:r>
+              <w:rPr>
+                <w:rFonts w:ascii="Consolas" w:cs="Consolas" w:eastAsia="Consolas" w:hAnsi="Consolas"/>
+                <w:sz w:val="18"/>
+                <w:szCs w:val="18"/>
+              </w:rPr>
               <w:t xml:space="preserve">EPOS.Kern/Allgemein/Diagnose/Diagnosedaten.cs</w:t>
             </w:r>
+            <w:r>
+              <w:rPr>
+                <w:sz w:val="19"/>
+                <w:szCs w:val="19"/>
+              </w:rPr>
+              <w:t xml:space="preserve"> (</w:t>
+            </w:r>
+            <w:r>
+              <w:rPr>
+                <w:rFonts w:ascii="Consolas" w:cs="Consolas" w:eastAsia="Consolas" w:hAnsi="Consolas"/>
+                <w:sz w:val="18"/>
+                <w:szCs w:val="18"/>
+              </w:rPr>
+              <w:t xml:space="preserve">Textblock</w:t>
+            </w:r>
+            <w:r>
+              <w:rPr>
+                <w:sz w:val="19"/>
+                <w:szCs w:val="19"/>
+              </w:rPr>
+              <w:t xml:space="preserve">, </w:t>
+            </w:r>
+            <w:r>
+              <w:rPr>
+                <w:rFonts w:ascii="Consolas" w:cs="Consolas" w:eastAsia="Consolas" w:hAnsi="Consolas"/>
+                <w:sz w:val="18"/>
+                <w:szCs w:val="18"/>
+              </w:rPr>
+              <w:t xml:space="preserve">ProtokollordnerPfad</w:t>
+            </w:r>
+            <w:r>
+              <w:rPr>
+                <w:sz w:val="19"/>
+                <w:szCs w:val="19"/>
+              </w:rPr>
+              <w:t xml:space="preserve">)</w:t>
+            </w:r>
           </w:p>
         </w:tc>
         <w:tc>
@@ -9595,7 +10448,352 @@
                 <w:sz w:val="19"/>
                 <w:szCs w:val="19"/>
               </w:rPr>
-              <w:t xml:space="preserve">3</w:t>
+              <w:t xml:space="preserve">heute</w:t>
+            </w:r>
+          </w:p>
+        </w:tc>
+      </w:tr>
+      <w:tr>
+        <w:trPr>
+          <w:cantSplit/>
+          <w:tblHeader w:val="false"/>
+        </w:trPr>
+        <w:tc>
+          <w:tcPr>
+            <w:tcW w:type="dxa" w:w="3636"/>
+            <w:tcBorders>
+              <w:top w:val="single" w:color="A6A6A6" w:sz="4"/>
+              <w:left w:val="single" w:color="A6A6A6" w:sz="4"/>
+              <w:bottom w:val="single" w:color="A6A6A6" w:sz="4"/>
+              <w:right w:val="single" w:color="A6A6A6" w:sz="4"/>
+            </w:tcBorders>
+            <w:tcMar>
+              <w:top w:type="dxa" w:w="50"/>
+              <w:left w:type="dxa" w:w="90"/>
+              <w:bottom w:type="dxa" w:w="50"/>
+              <w:right w:type="dxa" w:w="90"/>
+            </w:tcMar>
+          </w:tcPr>
+          <w:p>
+            <w:pPr>
+              <w:spacing w:after="0"/>
+            </w:pPr>
+            <w:r>
+              <w:rPr>
+                <w:sz w:val="19"/>
+                <w:szCs w:val="19"/>
+              </w:rPr>
+              <w:t xml:space="preserve">Tests des Über-Dialogs</w:t>
+            </w:r>
+          </w:p>
+        </w:tc>
+        <w:tc>
+          <w:tcPr>
+            <w:tcW w:type="dxa" w:w="5455"/>
+            <w:tcBorders>
+              <w:top w:val="single" w:color="A6A6A6" w:sz="4"/>
+              <w:left w:val="single" w:color="A6A6A6" w:sz="4"/>
+              <w:bottom w:val="single" w:color="A6A6A6" w:sz="4"/>
+              <w:right w:val="single" w:color="A6A6A6" w:sz="4"/>
+            </w:tcBorders>
+            <w:tcMar>
+              <w:top w:type="dxa" w:w="50"/>
+              <w:left w:type="dxa" w:w="90"/>
+              <w:bottom w:type="dxa" w:w="50"/>
+              <w:right w:type="dxa" w:w="90"/>
+            </w:tcMar>
+          </w:tcPr>
+          <w:p>
+            <w:pPr>
+              <w:spacing w:after="0"/>
+            </w:pPr>
+            <w:r>
+              <w:rPr>
+                <w:rFonts w:ascii="Consolas" w:cs="Consolas" w:eastAsia="Consolas" w:hAnsi="Consolas"/>
+                <w:sz w:val="18"/>
+                <w:szCs w:val="18"/>
+              </w:rPr>
+              <w:t xml:space="preserve">EPOS.UI.Tests/Dialoge/UeberDialogTests.cs</w:t>
+            </w:r>
+            <w:r>
+              <w:rPr>
+                <w:sz w:val="19"/>
+                <w:szCs w:val="19"/>
+              </w:rPr>
+              <w:t xml:space="preserve">, </w:t>
+            </w:r>
+            <w:r>
+              <w:rPr>
+                <w:rFonts w:ascii="Consolas" w:cs="Consolas" w:eastAsia="Consolas" w:hAnsi="Consolas"/>
+                <w:sz w:val="18"/>
+                <w:szCs w:val="18"/>
+              </w:rPr>
+              <w:t xml:space="preserve">EPOS.Kern.Tests/DiagnosedatenTests.cs</w:t>
+            </w:r>
+          </w:p>
+        </w:tc>
+        <w:tc>
+          <w:tcPr>
+            <w:tcW w:type="dxa" w:w="547"/>
+            <w:tcBorders>
+              <w:top w:val="single" w:color="A6A6A6" w:sz="4"/>
+              <w:left w:val="single" w:color="A6A6A6" w:sz="4"/>
+              <w:bottom w:val="single" w:color="A6A6A6" w:sz="4"/>
+              <w:right w:val="single" w:color="A6A6A6" w:sz="4"/>
+            </w:tcBorders>
+            <w:tcMar>
+              <w:top w:type="dxa" w:w="50"/>
+              <w:left w:type="dxa" w:w="90"/>
+              <w:bottom w:type="dxa" w:w="50"/>
+              <w:right w:type="dxa" w:w="90"/>
+            </w:tcMar>
+          </w:tcPr>
+          <w:p>
+            <w:pPr>
+              <w:spacing w:after="0"/>
+            </w:pPr>
+            <w:r>
+              <w:rPr>
+                <w:sz w:val="19"/>
+                <w:szCs w:val="19"/>
+              </w:rPr>
+              <w:t xml:space="preserve">heute</w:t>
+            </w:r>
+          </w:p>
+        </w:tc>
+      </w:tr>
+      <w:tr>
+        <w:trPr>
+          <w:cantSplit/>
+          <w:tblHeader w:val="false"/>
+        </w:trPr>
+        <w:tc>
+          <w:tcPr>
+            <w:tcW w:type="dxa" w:w="3636"/>
+            <w:tcBorders>
+              <w:top w:val="single" w:color="A6A6A6" w:sz="4"/>
+              <w:left w:val="single" w:color="A6A6A6" w:sz="4"/>
+              <w:bottom w:val="single" w:color="A6A6A6" w:sz="4"/>
+              <w:right w:val="single" w:color="A6A6A6" w:sz="4"/>
+            </w:tcBorders>
+            <w:tcMar>
+              <w:top w:type="dxa" w:w="50"/>
+              <w:left w:type="dxa" w:w="90"/>
+              <w:bottom w:type="dxa" w:w="50"/>
+              <w:right w:type="dxa" w:w="90"/>
+            </w:tcMar>
+          </w:tcPr>
+          <w:p>
+            <w:pPr>
+              <w:spacing w:after="0"/>
+            </w:pPr>
+            <w:r>
+              <w:rPr>
+                <w:sz w:val="19"/>
+                <w:szCs w:val="19"/>
+              </w:rPr>
+              <w:t xml:space="preserve">Supportpaket</w:t>
+            </w:r>
+          </w:p>
+        </w:tc>
+        <w:tc>
+          <w:tcPr>
+            <w:tcW w:type="dxa" w:w="5455"/>
+            <w:tcBorders>
+              <w:top w:val="single" w:color="A6A6A6" w:sz="4"/>
+              <w:left w:val="single" w:color="A6A6A6" w:sz="4"/>
+              <w:bottom w:val="single" w:color="A6A6A6" w:sz="4"/>
+              <w:right w:val="single" w:color="A6A6A6" w:sz="4"/>
+            </w:tcBorders>
+            <w:tcMar>
+              <w:top w:type="dxa" w:w="50"/>
+              <w:left w:type="dxa" w:w="90"/>
+              <w:bottom w:type="dxa" w:w="50"/>
+              <w:right w:type="dxa" w:w="90"/>
+            </w:tcMar>
+          </w:tcPr>
+          <w:p>
+            <w:pPr>
+              <w:spacing w:after="0"/>
+            </w:pPr>
+            <w:r>
+              <w:rPr>
+                <w:rFonts w:ascii="Consolas" w:cs="Consolas" w:eastAsia="Consolas" w:hAnsi="Consolas"/>
+                <w:sz w:val="18"/>
+                <w:szCs w:val="18"/>
+              </w:rPr>
+              <w:t xml:space="preserve">EPOS.Kern/Allgemein/Support/Supportpaket.cs</w:t>
+            </w:r>
+            <w:r>
+              <w:rPr>
+                <w:sz w:val="19"/>
+                <w:szCs w:val="19"/>
+              </w:rPr>
+              <w:t xml:space="preserve"> (</w:t>
+            </w:r>
+            <w:r>
+              <w:rPr>
+                <w:rFonts w:ascii="Consolas" w:cs="Consolas" w:eastAsia="Consolas" w:hAnsi="Consolas"/>
+                <w:sz w:val="18"/>
+                <w:szCs w:val="18"/>
+              </w:rPr>
+              <w:t xml:space="preserve">Erstellen</w:t>
+            </w:r>
+            <w:r>
+              <w:rPr>
+                <w:sz w:val="19"/>
+                <w:szCs w:val="19"/>
+              </w:rPr>
+              <w:t xml:space="preserve">, </w:t>
+            </w:r>
+            <w:r>
+              <w:rPr>
+                <w:rFonts w:ascii="Consolas" w:cs="Consolas" w:eastAsia="Consolas" w:hAnsi="Consolas"/>
+                <w:sz w:val="18"/>
+                <w:szCs w:val="18"/>
+              </w:rPr>
+              <w:t xml:space="preserve">Vorgabename</w:t>
+            </w:r>
+            <w:r>
+              <w:rPr>
+                <w:sz w:val="19"/>
+                <w:szCs w:val="19"/>
+              </w:rPr>
+              <w:t xml:space="preserve">, </w:t>
+            </w:r>
+            <w:r>
+              <w:rPr>
+                <w:rFonts w:ascii="Consolas" w:cs="Consolas" w:eastAsia="Consolas" w:hAnsi="Consolas"/>
+                <w:sz w:val="18"/>
+                <w:szCs w:val="18"/>
+              </w:rPr>
+              <w:t xml:space="preserve">Supportpaketergebnis</w:t>
+            </w:r>
+            <w:r>
+              <w:rPr>
+                <w:sz w:val="19"/>
+                <w:szCs w:val="19"/>
+              </w:rPr>
+              <w:t xml:space="preserve">), Anzeigeform </w:t>
+            </w:r>
+            <w:r>
+              <w:rPr>
+                <w:rFonts w:ascii="Consolas" w:cs="Consolas" w:eastAsia="Consolas" w:hAnsi="Consolas"/>
+                <w:sz w:val="18"/>
+                <w:szCs w:val="18"/>
+              </w:rPr>
+              <w:t xml:space="preserve">SupportpaketAnzeige</w:t>
+            </w:r>
+            <w:r>
+              <w:rPr>
+                <w:sz w:val="19"/>
+                <w:szCs w:val="19"/>
+              </w:rPr>
+              <w:t xml:space="preserve"> in </w:t>
+            </w:r>
+            <w:r>
+              <w:rPr>
+                <w:rFonts w:ascii="Consolas" w:cs="Consolas" w:eastAsia="Consolas" w:hAnsi="Consolas"/>
+                <w:sz w:val="18"/>
+                <w:szCs w:val="18"/>
+              </w:rPr>
+              <w:t xml:space="preserve">EPOS.UI/Dialoge/Hilfe/UeberDaten.cs</w:t>
+            </w:r>
+            <w:r>
+              <w:rPr>
+                <w:sz w:val="19"/>
+                <w:szCs w:val="19"/>
+              </w:rPr>
+              <w:t xml:space="preserve">, Hülle </w:t>
+            </w:r>
+            <w:r>
+              <w:rPr>
+                <w:rFonts w:ascii="Consolas" w:cs="Consolas" w:eastAsia="Consolas" w:hAnsi="Consolas"/>
+                <w:sz w:val="18"/>
+                <w:szCs w:val="18"/>
+              </w:rPr>
+              <w:t xml:space="preserve">UeberHuelle.SupportpaketSpeichern</w:t>
+            </w:r>
+            <w:r>
+              <w:rPr>
+                <w:sz w:val="19"/>
+                <w:szCs w:val="19"/>
+              </w:rPr>
+              <w:t xml:space="preserve">, Speicherdialog in </w:t>
+            </w:r>
+            <w:r>
+              <w:rPr>
+                <w:rFonts w:ascii="Consolas" w:cs="Consolas" w:eastAsia="Consolas" w:hAnsi="Consolas"/>
+                <w:sz w:val="18"/>
+                <w:szCs w:val="18"/>
+              </w:rPr>
+              <w:t xml:space="preserve">UeberFenster.SupportpaketSpeichern</w:t>
+            </w:r>
+            <w:r>
+              <w:rPr>
+                <w:sz w:val="19"/>
+                <w:szCs w:val="19"/>
+              </w:rPr>
+              <w:t xml:space="preserve">, Tests </w:t>
+            </w:r>
+            <w:r>
+              <w:rPr>
+                <w:rFonts w:ascii="Consolas" w:cs="Consolas" w:eastAsia="Consolas" w:hAnsi="Consolas"/>
+                <w:sz w:val="18"/>
+                <w:szCs w:val="18"/>
+              </w:rPr>
+              <w:t xml:space="preserve">EPOS.Kern.Tests/SupportpaketTests.cs</w:t>
+            </w:r>
+            <w:r>
+              <w:rPr>
+                <w:sz w:val="19"/>
+                <w:szCs w:val="19"/>
+              </w:rPr>
+              <w:t xml:space="preserve">; der Haken steht in </w:t>
+            </w:r>
+            <w:r>
+              <w:rPr>
+                <w:rFonts w:ascii="Consolas" w:cs="Consolas" w:eastAsia="Consolas" w:hAnsi="Consolas"/>
+                <w:sz w:val="18"/>
+                <w:szCs w:val="18"/>
+              </w:rPr>
+              <w:t xml:space="preserve">KiDialogAusnahmen</w:t>
+            </w:r>
+            <w:r>
+              <w:rPr>
+                <w:sz w:val="19"/>
+                <w:szCs w:val="19"/>
+              </w:rPr>
+              <w:t xml:space="preserve"> (Grund Export)</w:t>
+            </w:r>
+          </w:p>
+        </w:tc>
+        <w:tc>
+          <w:tcPr>
+            <w:tcW w:type="dxa" w:w="547"/>
+            <w:tcBorders>
+              <w:top w:val="single" w:color="A6A6A6" w:sz="4"/>
+              <w:left w:val="single" w:color="A6A6A6" w:sz="4"/>
+              <w:bottom w:val="single" w:color="A6A6A6" w:sz="4"/>
+              <w:right w:val="single" w:color="A6A6A6" w:sz="4"/>
+            </w:tcBorders>
+            <w:tcMar>
+              <w:top w:type="dxa" w:w="50"/>
+              <w:left w:type="dxa" w:w="90"/>
+              <w:bottom w:type="dxa" w:w="50"/>
+              <w:right w:type="dxa" w:w="90"/>
+            </w:tcMar>
+          </w:tcPr>
+          <w:p>
+            <w:pPr>
+              <w:spacing w:after="0"/>
+            </w:pPr>
+            <w:r>
+              <w:rPr>
+                <w:sz w:val="19"/>
+                <w:szCs w:val="19"/>
+              </w:rPr>
+              <w:t xml:space="preserve">heute</w:t>
             </w:r>
           </w:p>
         </w:tc>
@@ -9945,23 +11143,7 @@
                 <w:sz w:val="19"/>
                 <w:szCs w:val="19"/>
               </w:rPr>
-              <w:t xml:space="preserve">umgesetzt (11.10.2026, #972); </w:t>
-            </w:r>
-            <w:r>
-              <w:rPr>
-                <w:b/>
-                <w:bCs/>
-                <w:sz w:val="19"/>
-                <w:szCs w:val="19"/>
-              </w:rPr>
-              <w:t xml:space="preserve">Nachzug offen:</w:t>
-            </w:r>
-            <w:r>
-              <w:rPr>
-                <w:sz w:val="19"/>
-                <w:szCs w:val="19"/>
-              </w:rPr>
-              <w:t xml:space="preserve"> Zapfprofil-Vorgaben als Anwenderrubrik „Zapfprofil" statt Entwicklerbereich (Entscheid 11.10.2026)</w:t>
+              <w:t xml:space="preserve">umgesetzt (11.10.2026, #974); die Zapfprofil-Vorgaben sind Anwenderrubrik „Zapfprofil" statt Entwicklerbereich (Nachzug 11.10.2026, #976)</w:t>
             </w:r>
           </w:p>
         </w:tc>
@@ -10054,7 +11236,7 @@
                 <w:sz w:val="19"/>
                 <w:szCs w:val="19"/>
               </w:rPr>
-              <w:t xml:space="preserve">umgesetzt (11.10.2026, #973); offen beim Anwender: Fernwartungsseite, Server, signierter Client</w:t>
+              <w:t xml:space="preserve">umgesetzt (11.10.2026, #975); offen beim Anwender: Fernwartungsseite, Server, signierter Client</w:t>
             </w:r>
           </w:p>
         </w:tc>
@@ -10147,7 +11329,7 @@
                 <w:sz w:val="19"/>
                 <w:szCs w:val="19"/>
               </w:rPr>
-              <w:t xml:space="preserve">offen</w:t>
+              <w:t xml:space="preserve">umgesetzt (11.10.2026, #977): 3a (Dialog, Diagnoseblock, Geste im Dialog), 3b (Supportpaket)</w:t>
             </w:r>
           </w:p>
         </w:tc>

</xml_diff>

<commit_message>
Nachzug Quick Assist: Word-Fassung des Handbuchs, Protokoll geglättet
Word aus der Markdown-Quelle neu erzeugt (Quick Assist, Geste
Strg+Umschalt+F12, Statusnummer #998).

Co-Authored-By: Claude Fable 5.1 <noreply@anthropic.com>
Claude-Session: https://claude.ai/code/session_01PzsmhcNTFHLG2LbqBRVAsq
</commit_message>
<xml_diff>
--- a/Dokumentation/aktuell/Entwicklerhandbuch_Administration_Support_EPOS-Plan.docx
+++ b/Dokumentation/aktuell/Entwicklerhandbuch_Administration_Support_EPOS-Plan.docx
@@ -463,14 +463,14 @@
                 <w:sz w:val="19"/>
                 <w:szCs w:val="19"/>
               </w:rPr>
-              <w:t xml:space="preserve">Strg + Umschalt + Alt + E</w:t>
-            </w:r>
-            <w:r>
-              <w:rPr>
-                <w:sz w:val="19"/>
-                <w:szCs w:val="19"/>
-              </w:rPr>
-              <w:t xml:space="preserve">, Rückfrage „Entwicklermodus einschalten? Er gilt bis zum Ausschalten." bestätigen. Im Hauptfenster wirkt die Tastenfolge nicht. Der Diagnoseblock des Dialogs zeigt danach „Entwickler (Einstellung)". iPad: nicht gebaut (geplant: fünfmal auf die Versionszeile tippen).</w:t>
+              <w:t xml:space="preserve">Strg + Umschalt + F12</w:t>
+            </w:r>
+            <w:r>
+              <w:rPr>
+                <w:sz w:val="19"/>
+                <w:szCs w:val="19"/>
+              </w:rPr>
+              <w:t xml:space="preserve"> (ohne Alt, damit AltGr auf deutscher Tastatur nicht stört; der Dialog erkennt die Folge selbst, das Fenster fängt sie zusätzlich ab), Rückfrage „Entwicklermodus einschalten? Er gilt bis zum Ausschalten." bestätigen. Im Hauptfenster wirkt die Tastenfolge nicht. Der Diagnoseblock des Dialogs zeigt danach „Entwickler (Einstellung)". iPad: nicht gebaut (geplant: fünfmal auf die Versionszeile tippen).</w:t>
             </w:r>
           </w:p>
         </w:tc>
@@ -6144,18 +6144,7 @@
         <w:spacing w:after="120"/>
       </w:pPr>
       <w:r>
-        <w:t xml:space="preserve">RustDesk mit einem Vermittlungsserver, den INEKON selbst betreibt (Entscheid AS-Q7). Platzhalter in diesem Handbuch: Server </w:t>
-      </w:r>
-      <w:r>
-        <w:rPr>
-          <w:rFonts w:ascii="Consolas" w:cs="Consolas" w:eastAsia="Consolas" w:hAnsi="Consolas"/>
-          <w:sz w:val="20"/>
-          <w:szCs w:val="20"/>
-        </w:rPr>
-        <w:t xml:space="preserve">fernwartung.epos-plan.de</w:t>
-      </w:r>
-      <w:r>
-        <w:t xml:space="preserve">, Fernwartungsseite </w:t>
+        <w:t xml:space="preserve">Windows Quick Assist (Entscheid AS-Q7): in Windows 10 und 11 enthalten, von Microsoft signiert, ohne Lizenz und ohne Server. Fernwartungsseite (Anleitung): </w:t>
       </w:r>
       <w:r>
         <w:rPr>
@@ -6166,18 +6155,7 @@
         <w:t xml:space="preserve">https://epos-plan.de/support/fernwartung</w:t>
       </w:r>
       <w:r>
-        <w:t xml:space="preserve">, Client-Datei </w:t>
-      </w:r>
-      <w:r>
-        <w:rPr>
-          <w:rFonts w:ascii="Consolas" w:cs="Consolas" w:eastAsia="Consolas" w:hAnsi="Consolas"/>
-          <w:sz w:val="20"/>
-          <w:szCs w:val="20"/>
-        </w:rPr>
-        <w:t xml:space="preserve">EPOS-Plan-Fernwartung.exe</w:t>
-      </w:r>
-      <w:r>
-        <w:t xml:space="preserve">. Die echten Werte, den Serverschlüssel und die Zugangsdaten der Web-Konsole verwahrt INEKON außerhalb des Repositoriums; sie stehen nie in diesem Handbuch und nie im Quelltext.</w:t>
+        <w:t xml:space="preserve">. Der Support braucht ein Microsoft-Konto (Firmenkonto von INEKON bevorzugt) und Quick Assist am Arbeitsplatz. Zugangsdaten der Konten verwahrt INEKON außerhalb des Repositoriums; sie stehen nie in diesem Handbuch und nie im Quelltext.</w:t>
       </w:r>
     </w:p>
     <w:p>
@@ -6205,7 +6183,7 @@
         <w:t xml:space="preserve">Hilfe → Fernwartung…</w:t>
       </w:r>
       <w:r>
-        <w:t xml:space="preserve"> öffnet den Dialog: Kontakt, die Angaben für den Support (Abschnitt 3.3), der Erklärtext und der Knopf „Fernwartungsseite öffnen". Ohne bezahlte Lizenz ist der Knopf gesperrt, der Grund steht dabei (Abschnitt 4.4). Telefon und E-Mail (Link) stehen im Dialog immer.</w:t>
+        <w:t xml:space="preserve"> öffnet den Dialog: Kontakt, die Angaben für den Support (Abschnitt 3.3), der Erklärtext, die drei Schritte und die Knöpfe „Quick Assist starten" und „Fernwartungsseite öffnen". Ohne bezahlte Lizenz sind die Knöpfe gesperrt, der Grund steht dabei (Abschnitt 4.4). Telefon und E-Mail (Link) stehen im Dialog immer.</w:t>
       </w:r>
     </w:p>
     <w:p>
@@ -6218,18 +6196,7 @@
         <w:spacing w:after="60"/>
       </w:pPr>
       <w:r>
-        <w:t xml:space="preserve">Auf der Fernwartungsseite lädt er </w:t>
-      </w:r>
-      <w:r>
-        <w:rPr>
-          <w:rFonts w:ascii="Consolas" w:cs="Consolas" w:eastAsia="Consolas" w:hAnsi="Consolas"/>
-          <w:sz w:val="20"/>
-          <w:szCs w:val="20"/>
-        </w:rPr>
-        <w:t xml:space="preserve">EPOS-Plan-Fernwartung.exe</w:t>
-      </w:r>
-      <w:r>
-        <w:t xml:space="preserve"> und startet sie; keine Installation, keine Administratorrechte. Bis INEKON ein Codesignaturzertifikat hat, erscheint der SmartScreen-Hinweis „Unbekannter Herausgeber"; die Seite erklärt „Weitere Informationen → Trotzdem ausführen".</w:t>
+        <w:t xml:space="preserve">Er ruft INEKON an.</w:t>
       </w:r>
     </w:p>
     <w:p>
@@ -6242,7 +6209,7 @@
         <w:spacing w:after="60"/>
       </w:pPr>
       <w:r>
-        <w:t xml:space="preserve">Das Programm zeigt eine Kennung und ein Einmalkennwort. Der Anwender nennt beides dem Support am Telefon und nimmt die eingehende Verbindung im Programm an.</w:t>
+        <w:t xml:space="preserve">Mit „Quick Assist starten" öffnet er Quick Assist und gibt den sechsstelligen Code ein, den der Support nennt. Fehlt Quick Assist, zeigt der Dialog einen Hinweis (Startmenü oder Fernwartungsseite).</w:t>
       </w:r>
     </w:p>
     <w:p>
@@ -6255,7 +6222,7 @@
         <w:spacing w:after="60"/>
       </w:pPr>
       <w:r>
-        <w:t xml:space="preserve">Er beendet die Sitzung im Programm oder schließt es. Es bleibt nichts installiert.</w:t>
+        <w:t xml:space="preserve">Er erlaubt Ansicht oder Steuerung, wenn Quick Assist fragt, und beendet die Sitzung jederzeit in Quick Assist. Es bleibt nichts installiert.</w:t>
       </w:r>
     </w:p>
     <w:p>
@@ -6276,7 +6243,7 @@
         <w:spacing w:after="60"/>
       </w:pPr>
       <w:r>
-        <w:t xml:space="preserve">RustDesk in der Vollfassung am Support-Arbeitsplatz, auf INEKONs Server eingestellt; Kennung des Kunden eingeben, Einmalkennwort eintragen, auf die Annahme warten.</w:t>
+        <w:t xml:space="preserve">Quick Assist öffnen, „Einer anderen Person helfen" wählen, mit dem Microsoft-Konto von INEKON anmelden; der Code gilt zehn Minuten. Den Code am Telefon nennen, nach der Annahme „Vollständige Steuerung" oder „Bildschirm anzeigen" wählen; der Anwender bestätigt.</w:t>
       </w:r>
     </w:p>
     <w:p>
@@ -6320,7 +6287,7 @@
         <w:spacing w:after="60"/>
       </w:pPr>
       <w:r>
-        <w:t xml:space="preserve">Soll ein Update eingespielt werden, braucht das Setup Administratorrechte. Die Windows-Abfrage sieht der Support nur, wenn der Fernwartungs-Client mit Administratorrechten läuft; sonst muss der Anwender sie selbst bestätigen. Vorher mit dem Anwender absprechen.</w:t>
+        <w:t xml:space="preserve">Soll ein Update eingespielt werden, braucht das Setup Administratorrechte. Die Windows-Abfrage sieht der Support nur bei voller Steuerung und wenn Quick Assist sie weitergibt; sonst muss der Anwender sie selbst bestätigen. Vorher mit dem Anwender absprechen.</w:t>
       </w:r>
     </w:p>
     <w:p>
@@ -6344,7 +6311,7 @@
         <w:t xml:space="preserve">LizenzCtrl.FernwartungErlaubt()</w:t>
       </w:r>
       <w:r>
-        <w:t xml:space="preserve"> (Erlaubt, Grund) oder am Menüpunkt: ist er gesperrt, steht der Grund im Tooltip. Ist die Lage unklar, lässt er sich den Diagnoseblock aus dem Dialog (Knopf „Kopieren“) per E-Mail schicken. Führt der Knopf ins Leere, fehlt die Fernwartungsseite </w:t>
+        <w:t xml:space="preserve"> (Erlaubt, Grund) oder am Menüpunkt: ist er gesperrt, steht der Grund im Tooltip. Ist die Lage unklar, lässt er sich den Diagnoseblock aus dem Dialog (Knopf „Kopieren“) per E-Mail schicken. Führt der Knopf „Fernwartungsseite öffnen" ins Leere, fehlt die Seite </w:t>
       </w:r>
       <w:r>
         <w:rPr>
@@ -6366,7 +6333,7 @@
         <w:t xml:space="preserve">EPOS.Kern/Allgemein/Support/Fernwartung.cs</w:t>
       </w:r>
       <w:r>
-        <w:t xml:space="preserve">) bei INEKON: Seite und Client prüfen (4.6) und bis dahin den Weg Telefon und E-Mail nehmen.</w:t>
+        <w:t xml:space="preserve">) bei INEKON: Seite prüfen (4.6) und bis dahin den Weg Telefon und E-Mail nehmen.</w:t>
       </w:r>
     </w:p>
     <w:p>
@@ -6379,7 +6346,7 @@
         <w:spacing w:after="60"/>
       </w:pPr>
       <w:r>
-        <w:t xml:space="preserve">Nach der Sitzung: kein Eintrag in EPOS-Plan; das Sitzungsprotokoll der Web-Konsole (wer wann mit wem) ist die einzige Aufzeichnung.</w:t>
+        <w:t xml:space="preserve">Nach der Sitzung: kein Eintrag in EPOS-Plan; EPOS-Plan zeichnet nichts auf.</w:t>
       </w:r>
     </w:p>
     <w:p>
@@ -6510,6 +6477,47 @@
     </w:p>
     <w:p>
       <w:pPr>
+        <w:spacing w:after="120"/>
+      </w:pPr>
+      <w:r>
+        <w:t xml:space="preserve">Fundstellen des Dialogs: </w:t>
+      </w:r>
+      <w:r>
+        <w:rPr>
+          <w:rFonts w:ascii="Consolas" w:cs="Consolas" w:eastAsia="Consolas" w:hAnsi="Consolas"/>
+          <w:sz w:val="20"/>
+          <w:szCs w:val="20"/>
+        </w:rPr>
+        <w:t xml:space="preserve">FernwartungDialog</w:t>
+      </w:r>
+      <w:r>
+        <w:t xml:space="preserve"> und </w:t>
+      </w:r>
+      <w:r>
+        <w:rPr>
+          <w:rFonts w:ascii="Consolas" w:cs="Consolas" w:eastAsia="Consolas" w:hAnsi="Consolas"/>
+          <w:sz w:val="20"/>
+          <w:szCs w:val="20"/>
+        </w:rPr>
+        <w:t xml:space="preserve">FernwartungFenster</w:t>
+      </w:r>
+      <w:r>
+        <w:t xml:space="preserve">; der Start von Quick Assist liegt in </w:t>
+      </w:r>
+      <w:r>
+        <w:rPr>
+          <w:rFonts w:ascii="Consolas" w:cs="Consolas" w:eastAsia="Consolas" w:hAnsi="Consolas"/>
+          <w:sz w:val="20"/>
+          <w:szCs w:val="20"/>
+        </w:rPr>
+        <w:t xml:space="preserve">WindowsFormsApplication1/Allgemein/Support/QuickAssistStart.cs</w:t>
+      </w:r>
+      <w:r>
+        <w:t xml:space="preserve"> (Abschnitt 6).</w:t>
+      </w:r>
+    </w:p>
+    <w:p>
+      <w:pPr>
         <w:pStyle w:val="Heading2"/>
       </w:pPr>
       <w:r>
@@ -6521,7 +6529,7 @@
         <w:spacing w:after="120"/>
       </w:pPr>
       <w:r>
-        <w:t xml:space="preserve">Zurückgestellt (Anwender 11.10.2026: „wird später bearbeitet"). Stufe 2 baut die Fernwartung für Windows; auf dem iPad gibt es weder Menüpunkt noch Dialog, bis der iPad-Weg entschieden ist. Befund für dann: Ein iPad lässt sich mit RustDesk weder fernsteuern noch ansehen. Der Supportweg vom iPad ist bis dahin Telefon und E-Mail.</w:t>
+        <w:t xml:space="preserve">Zurückgestellt (Anwender 11.10.2026: „wird später bearbeitet"). Stufe 2 baut die Fernwartung für Windows; auf dem iPad gibt es weder Menüpunkt noch Dialog, bis der iPad-Weg entschieden ist. Befund für dann: Quick Assist gibt es auf dem iPad nicht. Der Supportweg vom iPad ist bis dahin Telefon und E-Mail.</w:t>
       </w:r>
     </w:p>
     <w:p>
@@ -6545,8 +6553,8 @@
         </w:tblBorders>
       </w:tblPr>
       <w:tblGrid>
-        <w:gridCol w:w="3352"/>
-        <w:gridCol w:w="6286"/>
+        <w:gridCol w:w="2834"/>
+        <w:gridCol w:w="6804"/>
       </w:tblGrid>
       <w:tr>
         <w:trPr>
@@ -6555,7 +6563,7 @@
         </w:trPr>
         <w:tc>
           <w:tcPr>
-            <w:tcW w:type="dxa" w:w="3352"/>
+            <w:tcW w:type="dxa" w:w="2834"/>
             <w:tcBorders>
               <w:top w:val="single" w:color="A6A6A6" w:sz="4"/>
               <w:left w:val="single" w:color="A6A6A6" w:sz="4"/>
@@ -6587,7 +6595,7 @@
         </w:tc>
         <w:tc>
           <w:tcPr>
-            <w:tcW w:type="dxa" w:w="6286"/>
+            <w:tcW w:type="dxa" w:w="6804"/>
             <w:tcBorders>
               <w:top w:val="single" w:color="A6A6A6" w:sz="4"/>
               <w:left w:val="single" w:color="A6A6A6" w:sz="4"/>
@@ -6625,82 +6633,59 @@
         </w:trPr>
         <w:tc>
           <w:tcPr>
-            <w:tcW w:type="dxa" w:w="3352"/>
-            <w:tcBorders>
-              <w:top w:val="single" w:color="A6A6A6" w:sz="4"/>
-              <w:left w:val="single" w:color="A6A6A6" w:sz="4"/>
-              <w:bottom w:val="single" w:color="A6A6A6" w:sz="4"/>
-              <w:right w:val="single" w:color="A6A6A6" w:sz="4"/>
-            </w:tcBorders>
-            <w:tcMar>
-              <w:top w:type="dxa" w:w="50"/>
-              <w:left w:type="dxa" w:w="90"/>
-              <w:bottom w:type="dxa" w:w="50"/>
-              <w:right w:type="dxa" w:w="90"/>
-            </w:tcMar>
-          </w:tcPr>
-          <w:p>
-            <w:pPr>
-              <w:spacing w:after="0"/>
-            </w:pPr>
-            <w:r>
-              <w:rPr>
-                <w:sz w:val="19"/>
-                <w:szCs w:val="19"/>
-              </w:rPr>
-              <w:t xml:space="preserve">Server prüfen</w:t>
-            </w:r>
-          </w:p>
-        </w:tc>
-        <w:tc>
-          <w:tcPr>
-            <w:tcW w:type="dxa" w:w="6286"/>
-            <w:tcBorders>
-              <w:top w:val="single" w:color="A6A6A6" w:sz="4"/>
-              <w:left w:val="single" w:color="A6A6A6" w:sz="4"/>
-              <w:bottom w:val="single" w:color="A6A6A6" w:sz="4"/>
-              <w:right w:val="single" w:color="A6A6A6" w:sz="4"/>
-            </w:tcBorders>
-            <w:tcMar>
-              <w:top w:type="dxa" w:w="50"/>
-              <w:left w:type="dxa" w:w="90"/>
-              <w:bottom w:type="dxa" w:w="50"/>
-              <w:right w:type="dxa" w:w="90"/>
-            </w:tcMar>
-          </w:tcPr>
-          <w:p>
-            <w:pPr>
-              <w:spacing w:after="0"/>
-            </w:pPr>
-            <w:r>
-              <w:rPr>
-                <w:rFonts w:ascii="Consolas" w:cs="Consolas" w:eastAsia="Consolas" w:hAnsi="Consolas"/>
-                <w:sz w:val="18"/>
-                <w:szCs w:val="18"/>
-              </w:rPr>
-              <w:t xml:space="preserve">hbbs</w:t>
-            </w:r>
-            <w:r>
-              <w:rPr>
-                <w:sz w:val="19"/>
-                <w:szCs w:val="19"/>
-              </w:rPr>
-              <w:t xml:space="preserve"> und </w:t>
-            </w:r>
-            <w:r>
-              <w:rPr>
-                <w:rFonts w:ascii="Consolas" w:cs="Consolas" w:eastAsia="Consolas" w:hAnsi="Consolas"/>
-                <w:sz w:val="18"/>
-                <w:szCs w:val="18"/>
-              </w:rPr>
-              <w:t xml:space="preserve">hbbr</w:t>
-            </w:r>
-            <w:r>
-              <w:rPr>
-                <w:sz w:val="19"/>
-                <w:szCs w:val="19"/>
-              </w:rPr>
-              <w:t xml:space="preserve"> laufen (Docker), Ports 21115 bis 21119 TCP und 21116 UDP erreichbar; nach einem Serverupdate eine Probesitzung zwischen zwei INEKON-Rechnern</w:t>
+            <w:tcW w:type="dxa" w:w="2834"/>
+            <w:tcBorders>
+              <w:top w:val="single" w:color="A6A6A6" w:sz="4"/>
+              <w:left w:val="single" w:color="A6A6A6" w:sz="4"/>
+              <w:bottom w:val="single" w:color="A6A6A6" w:sz="4"/>
+              <w:right w:val="single" w:color="A6A6A6" w:sz="4"/>
+            </w:tcBorders>
+            <w:tcMar>
+              <w:top w:type="dxa" w:w="50"/>
+              <w:left w:type="dxa" w:w="90"/>
+              <w:bottom w:type="dxa" w:w="50"/>
+              <w:right w:type="dxa" w:w="90"/>
+            </w:tcMar>
+          </w:tcPr>
+          <w:p>
+            <w:pPr>
+              <w:spacing w:after="0"/>
+            </w:pPr>
+            <w:r>
+              <w:rPr>
+                <w:sz w:val="19"/>
+                <w:szCs w:val="19"/>
+              </w:rPr>
+              <w:t xml:space="preserve">Support-Konto anlegen</w:t>
+            </w:r>
+          </w:p>
+        </w:tc>
+        <w:tc>
+          <w:tcPr>
+            <w:tcW w:type="dxa" w:w="6804"/>
+            <w:tcBorders>
+              <w:top w:val="single" w:color="A6A6A6" w:sz="4"/>
+              <w:left w:val="single" w:color="A6A6A6" w:sz="4"/>
+              <w:bottom w:val="single" w:color="A6A6A6" w:sz="4"/>
+              <w:right w:val="single" w:color="A6A6A6" w:sz="4"/>
+            </w:tcBorders>
+            <w:tcMar>
+              <w:top w:type="dxa" w:w="50"/>
+              <w:left w:type="dxa" w:w="90"/>
+              <w:bottom w:type="dxa" w:w="50"/>
+              <w:right w:type="dxa" w:w="90"/>
+            </w:tcMar>
+          </w:tcPr>
+          <w:p>
+            <w:pPr>
+              <w:spacing w:after="0"/>
+            </w:pPr>
+            <w:r>
+              <w:rPr>
+                <w:sz w:val="19"/>
+                <w:szCs w:val="19"/>
+              </w:rPr>
+              <w:t xml:space="preserve">Microsoft-Konto je Mitarbeiter (Firmenkonto bevorzugt); Quick Assist am Arbeitsplatz einmal anmelden und eine Probesitzung zwischen zwei INEKON-Rechnern fahren</w:t>
             </w:r>
           </w:p>
         </w:tc>
@@ -6712,59 +6697,59 @@
         </w:trPr>
         <w:tc>
           <w:tcPr>
-            <w:tcW w:type="dxa" w:w="3352"/>
-            <w:tcBorders>
-              <w:top w:val="single" w:color="A6A6A6" w:sz="4"/>
-              <w:left w:val="single" w:color="A6A6A6" w:sz="4"/>
-              <w:bottom w:val="single" w:color="A6A6A6" w:sz="4"/>
-              <w:right w:val="single" w:color="A6A6A6" w:sz="4"/>
-            </w:tcBorders>
-            <w:tcMar>
-              <w:top w:type="dxa" w:w="50"/>
-              <w:left w:type="dxa" w:w="90"/>
-              <w:bottom w:type="dxa" w:w="50"/>
-              <w:right w:type="dxa" w:w="90"/>
-            </w:tcMar>
-          </w:tcPr>
-          <w:p>
-            <w:pPr>
-              <w:spacing w:after="0"/>
-            </w:pPr>
-            <w:r>
-              <w:rPr>
-                <w:sz w:val="19"/>
-                <w:szCs w:val="19"/>
-              </w:rPr>
-              <w:t xml:space="preserve">Clientfassung tauschen</w:t>
-            </w:r>
-          </w:p>
-        </w:tc>
-        <w:tc>
-          <w:tcPr>
-            <w:tcW w:type="dxa" w:w="6286"/>
-            <w:tcBorders>
-              <w:top w:val="single" w:color="A6A6A6" w:sz="4"/>
-              <w:left w:val="single" w:color="A6A6A6" w:sz="4"/>
-              <w:bottom w:val="single" w:color="A6A6A6" w:sz="4"/>
-              <w:right w:val="single" w:color="A6A6A6" w:sz="4"/>
-            </w:tcBorders>
-            <w:tcMar>
-              <w:top w:type="dxa" w:w="50"/>
-              <w:left w:type="dxa" w:w="90"/>
-              <w:bottom w:type="dxa" w:w="50"/>
-              <w:right w:type="dxa" w:w="90"/>
-            </w:tcMar>
-          </w:tcPr>
-          <w:p>
-            <w:pPr>
-              <w:spacing w:after="0"/>
-            </w:pPr>
-            <w:r>
-              <w:rPr>
-                <w:sz w:val="19"/>
-                <w:szCs w:val="19"/>
-              </w:rPr>
-              <w:t xml:space="preserve">neuen Client im Generator der Web-Konsole bauen, mit INEKONs Zertifikat signieren, Datei auf epos-plan.de ersetzen, Fernwartungsseite prüfen; der alte Client auf Kundenrechnern ist eine Einzeldatei und wird beim nächsten Fall neu geladen</w:t>
+            <w:tcW w:type="dxa" w:w="2834"/>
+            <w:tcBorders>
+              <w:top w:val="single" w:color="A6A6A6" w:sz="4"/>
+              <w:left w:val="single" w:color="A6A6A6" w:sz="4"/>
+              <w:bottom w:val="single" w:color="A6A6A6" w:sz="4"/>
+              <w:right w:val="single" w:color="A6A6A6" w:sz="4"/>
+            </w:tcBorders>
+            <w:tcMar>
+              <w:top w:type="dxa" w:w="50"/>
+              <w:left w:type="dxa" w:w="90"/>
+              <w:bottom w:type="dxa" w:w="50"/>
+              <w:right w:type="dxa" w:w="90"/>
+            </w:tcMar>
+          </w:tcPr>
+          <w:p>
+            <w:pPr>
+              <w:spacing w:after="0"/>
+            </w:pPr>
+            <w:r>
+              <w:rPr>
+                <w:sz w:val="19"/>
+                <w:szCs w:val="19"/>
+              </w:rPr>
+              <w:t xml:space="preserve">Fernwartungsseite pflegen</w:t>
+            </w:r>
+          </w:p>
+        </w:tc>
+        <w:tc>
+          <w:tcPr>
+            <w:tcW w:type="dxa" w:w="6804"/>
+            <w:tcBorders>
+              <w:top w:val="single" w:color="A6A6A6" w:sz="4"/>
+              <w:left w:val="single" w:color="A6A6A6" w:sz="4"/>
+              <w:bottom w:val="single" w:color="A6A6A6" w:sz="4"/>
+              <w:right w:val="single" w:color="A6A6A6" w:sz="4"/>
+            </w:tcBorders>
+            <w:tcMar>
+              <w:top w:type="dxa" w:w="50"/>
+              <w:left w:type="dxa" w:w="90"/>
+              <w:bottom w:type="dxa" w:w="50"/>
+              <w:right w:type="dxa" w:w="90"/>
+            </w:tcMar>
+          </w:tcPr>
+          <w:p>
+            <w:pPr>
+              <w:spacing w:after="0"/>
+            </w:pPr>
+            <w:r>
+              <w:rPr>
+                <w:sz w:val="19"/>
+                <w:szCs w:val="19"/>
+              </w:rPr>
+              <w:t xml:space="preserve">Anleitung auf epos-plan.de prüfen, wenn Quick Assist seine Oberfläche ändert; Schritte, Bilder, Telefon und Zeiten, Satz für das iPad</w:t>
             </w:r>
           </w:p>
         </w:tc>
@@ -6776,123 +6761,59 @@
         </w:trPr>
         <w:tc>
           <w:tcPr>
-            <w:tcW w:type="dxa" w:w="3352"/>
-            <w:tcBorders>
-              <w:top w:val="single" w:color="A6A6A6" w:sz="4"/>
-              <w:left w:val="single" w:color="A6A6A6" w:sz="4"/>
-              <w:bottom w:val="single" w:color="A6A6A6" w:sz="4"/>
-              <w:right w:val="single" w:color="A6A6A6" w:sz="4"/>
-            </w:tcBorders>
-            <w:tcMar>
-              <w:top w:type="dxa" w:w="50"/>
-              <w:left w:type="dxa" w:w="90"/>
-              <w:bottom w:type="dxa" w:w="50"/>
-              <w:right w:type="dxa" w:w="90"/>
-            </w:tcMar>
-          </w:tcPr>
-          <w:p>
-            <w:pPr>
-              <w:spacing w:after="0"/>
-            </w:pPr>
-            <w:r>
-              <w:rPr>
-                <w:sz w:val="19"/>
-                <w:szCs w:val="19"/>
-              </w:rPr>
-              <w:t xml:space="preserve">Schlüssel oder Servername ändern</w:t>
-            </w:r>
-          </w:p>
-        </w:tc>
-        <w:tc>
-          <w:tcPr>
-            <w:tcW w:type="dxa" w:w="6286"/>
-            <w:tcBorders>
-              <w:top w:val="single" w:color="A6A6A6" w:sz="4"/>
-              <w:left w:val="single" w:color="A6A6A6" w:sz="4"/>
-              <w:bottom w:val="single" w:color="A6A6A6" w:sz="4"/>
-              <w:right w:val="single" w:color="A6A6A6" w:sz="4"/>
-            </w:tcBorders>
-            <w:tcMar>
-              <w:top w:type="dxa" w:w="50"/>
-              <w:left w:type="dxa" w:w="90"/>
-              <w:bottom w:type="dxa" w:w="50"/>
-              <w:right w:type="dxa" w:w="90"/>
-            </w:tcMar>
-          </w:tcPr>
-          <w:p>
-            <w:pPr>
-              <w:spacing w:after="0"/>
-            </w:pPr>
-            <w:r>
-              <w:rPr>
-                <w:sz w:val="19"/>
-                <w:szCs w:val="19"/>
-              </w:rPr>
-              <w:t xml:space="preserve">neuer Client nötig (Server und Schlüssel sind fest eingebaut); alte Clients verbinden sich dann nicht mehr</w:t>
-            </w:r>
-          </w:p>
-        </w:tc>
-      </w:tr>
-      <w:tr>
-        <w:trPr>
-          <w:cantSplit/>
-          <w:tblHeader w:val="false"/>
-        </w:trPr>
-        <w:tc>
-          <w:tcPr>
-            <w:tcW w:type="dxa" w:w="3352"/>
-            <w:tcBorders>
-              <w:top w:val="single" w:color="A6A6A6" w:sz="4"/>
-              <w:left w:val="single" w:color="A6A6A6" w:sz="4"/>
-              <w:bottom w:val="single" w:color="A6A6A6" w:sz="4"/>
-              <w:right w:val="single" w:color="A6A6A6" w:sz="4"/>
-            </w:tcBorders>
-            <w:tcMar>
-              <w:top w:type="dxa" w:w="50"/>
-              <w:left w:type="dxa" w:w="90"/>
-              <w:bottom w:type="dxa" w:w="50"/>
-              <w:right w:type="dxa" w:w="90"/>
-            </w:tcMar>
-          </w:tcPr>
-          <w:p>
-            <w:pPr>
-              <w:spacing w:after="0"/>
-            </w:pPr>
-            <w:r>
-              <w:rPr>
-                <w:sz w:val="19"/>
-                <w:szCs w:val="19"/>
-              </w:rPr>
-              <w:t xml:space="preserve">Ohne Pro-Tarif</w:t>
-            </w:r>
-          </w:p>
-        </w:tc>
-        <w:tc>
-          <w:tcPr>
-            <w:tcW w:type="dxa" w:w="6286"/>
-            <w:tcBorders>
-              <w:top w:val="single" w:color="A6A6A6" w:sz="4"/>
-              <w:left w:val="single" w:color="A6A6A6" w:sz="4"/>
-              <w:bottom w:val="single" w:color="A6A6A6" w:sz="4"/>
-              <w:right w:val="single" w:color="A6A6A6" w:sz="4"/>
-            </w:tcBorders>
-            <w:tcMar>
-              <w:top w:type="dxa" w:w="50"/>
-              <w:left w:type="dxa" w:w="90"/>
-              <w:bottom w:type="dxa" w:w="50"/>
-              <w:right w:type="dxa" w:w="90"/>
-            </w:tcMar>
-          </w:tcPr>
-          <w:p>
-            <w:pPr>
-              <w:spacing w:after="0"/>
-            </w:pPr>
-            <w:r>
-              <w:rPr>
-                <w:sz w:val="19"/>
-                <w:szCs w:val="19"/>
-              </w:rPr>
-              <w:t xml:space="preserve">quelloffener Client mit Serverangabe im Dateinamen </w:t>
+            <w:tcW w:type="dxa" w:w="2834"/>
+            <w:tcBorders>
+              <w:top w:val="single" w:color="A6A6A6" w:sz="4"/>
+              <w:left w:val="single" w:color="A6A6A6" w:sz="4"/>
+              <w:bottom w:val="single" w:color="A6A6A6" w:sz="4"/>
+              <w:right w:val="single" w:color="A6A6A6" w:sz="4"/>
+            </w:tcBorders>
+            <w:tcMar>
+              <w:top w:type="dxa" w:w="50"/>
+              <w:left w:type="dxa" w:w="90"/>
+              <w:bottom w:type="dxa" w:w="50"/>
+              <w:right w:type="dxa" w:w="90"/>
+            </w:tcMar>
+          </w:tcPr>
+          <w:p>
+            <w:pPr>
+              <w:spacing w:after="0"/>
+            </w:pPr>
+            <w:r>
+              <w:rPr>
+                <w:sz w:val="19"/>
+                <w:szCs w:val="19"/>
+              </w:rPr>
+              <w:t xml:space="preserve">Quick Assist gesperrt</w:t>
+            </w:r>
+          </w:p>
+        </w:tc>
+        <w:tc>
+          <w:tcPr>
+            <w:tcW w:type="dxa" w:w="6804"/>
+            <w:tcBorders>
+              <w:top w:val="single" w:color="A6A6A6" w:sz="4"/>
+              <w:left w:val="single" w:color="A6A6A6" w:sz="4"/>
+              <w:bottom w:val="single" w:color="A6A6A6" w:sz="4"/>
+              <w:right w:val="single" w:color="A6A6A6" w:sz="4"/>
+            </w:tcBorders>
+            <w:tcMar>
+              <w:top w:type="dxa" w:w="50"/>
+              <w:left w:type="dxa" w:w="90"/>
+              <w:bottom w:type="dxa" w:w="50"/>
+              <w:right w:type="dxa" w:w="90"/>
+            </w:tcMar>
+          </w:tcPr>
+          <w:p>
+            <w:pPr>
+              <w:spacing w:after="0"/>
+            </w:pPr>
+            <w:r>
+              <w:rPr>
+                <w:sz w:val="19"/>
+                <w:szCs w:val="19"/>
+              </w:rPr>
+              <w:t xml:space="preserve">Reserve: quelloffener RustDesk-Client mit Serverangabe im Dateinamen </w:t>
             </w:r>
             <w:r>
               <w:rPr>
@@ -6907,22 +6828,7 @@
                 <w:sz w:val="19"/>
                 <w:szCs w:val="19"/>
               </w:rPr>
-              <w:t xml:space="preserve"> oder Startargument </w:t>
-            </w:r>
-            <w:r>
-              <w:rPr>
-                <w:rFonts w:ascii="Consolas" w:cs="Consolas" w:eastAsia="Consolas" w:hAnsi="Consolas"/>
-                <w:sz w:val="18"/>
-                <w:szCs w:val="18"/>
-              </w:rPr>
-              <w:t xml:space="preserve">--config</w:t>
-            </w:r>
-            <w:r>
-              <w:rPr>
-                <w:sz w:val="19"/>
-                <w:szCs w:val="19"/>
-              </w:rPr>
-              <w:t xml:space="preserve">; ohne Logo, Adressbuch und Sitzungsprotokoll</w:t>
+              <w:t xml:space="preserve"> gegen einen eigenen quelloffenen Server; erst einrichten, wenn der Fall eintritt</w:t>
             </w:r>
           </w:p>
         </w:tc>
@@ -8179,9 +8085,9 @@
         </w:tblBorders>
       </w:tblPr>
       <w:tblGrid>
-        <w:gridCol w:w="3636"/>
-        <w:gridCol w:w="5455"/>
-        <w:gridCol w:w="547"/>
+        <w:gridCol w:w="3473"/>
+        <w:gridCol w:w="5209"/>
+        <w:gridCol w:w="956"/>
       </w:tblGrid>
       <w:tr>
         <w:trPr>
@@ -8190,7 +8096,7 @@
         </w:trPr>
         <w:tc>
           <w:tcPr>
-            <w:tcW w:type="dxa" w:w="3636"/>
+            <w:tcW w:type="dxa" w:w="3473"/>
             <w:tcBorders>
               <w:top w:val="single" w:color="A6A6A6" w:sz="4"/>
               <w:left w:val="single" w:color="A6A6A6" w:sz="4"/>
@@ -8222,7 +8128,7 @@
         </w:tc>
         <w:tc>
           <w:tcPr>
-            <w:tcW w:type="dxa" w:w="5455"/>
+            <w:tcW w:type="dxa" w:w="5209"/>
             <w:tcBorders>
               <w:top w:val="single" w:color="A6A6A6" w:sz="4"/>
               <w:left w:val="single" w:color="A6A6A6" w:sz="4"/>
@@ -8254,7 +8160,7 @@
         </w:tc>
         <w:tc>
           <w:tcPr>
-            <w:tcW w:type="dxa" w:w="547"/>
+            <w:tcW w:type="dxa" w:w="956"/>
             <w:tcBorders>
               <w:top w:val="single" w:color="A6A6A6" w:sz="4"/>
               <w:left w:val="single" w:color="A6A6A6" w:sz="4"/>
@@ -8292,7 +8198,7 @@
         </w:trPr>
         <w:tc>
           <w:tcPr>
-            <w:tcW w:type="dxa" w:w="3636"/>
+            <w:tcW w:type="dxa" w:w="3473"/>
             <w:tcBorders>
               <w:top w:val="single" w:color="A6A6A6" w:sz="4"/>
               <w:left w:val="single" w:color="A6A6A6" w:sz="4"/>
@@ -8321,7 +8227,7 @@
         </w:tc>
         <w:tc>
           <w:tcPr>
-            <w:tcW w:type="dxa" w:w="5455"/>
+            <w:tcW w:type="dxa" w:w="5209"/>
             <w:tcBorders>
               <w:top w:val="single" w:color="A6A6A6" w:sz="4"/>
               <w:left w:val="single" w:color="A6A6A6" w:sz="4"/>
@@ -8366,7 +8272,7 @@
         </w:tc>
         <w:tc>
           <w:tcPr>
-            <w:tcW w:type="dxa" w:w="547"/>
+            <w:tcW w:type="dxa" w:w="956"/>
             <w:tcBorders>
               <w:top w:val="single" w:color="A6A6A6" w:sz="4"/>
               <w:left w:val="single" w:color="A6A6A6" w:sz="4"/>
@@ -8401,7 +8307,7 @@
         </w:trPr>
         <w:tc>
           <w:tcPr>
-            <w:tcW w:type="dxa" w:w="3636"/>
+            <w:tcW w:type="dxa" w:w="3473"/>
             <w:tcBorders>
               <w:top w:val="single" w:color="A6A6A6" w:sz="4"/>
               <w:left w:val="single" w:color="A6A6A6" w:sz="4"/>
@@ -8430,7 +8336,7 @@
         </w:tc>
         <w:tc>
           <w:tcPr>
-            <w:tcW w:type="dxa" w:w="5455"/>
+            <w:tcW w:type="dxa" w:w="5209"/>
             <w:tcBorders>
               <w:top w:val="single" w:color="A6A6A6" w:sz="4"/>
               <w:left w:val="single" w:color="A6A6A6" w:sz="4"/>
@@ -8497,7 +8403,7 @@
         </w:tc>
         <w:tc>
           <w:tcPr>
-            <w:tcW w:type="dxa" w:w="547"/>
+            <w:tcW w:type="dxa" w:w="956"/>
             <w:tcBorders>
               <w:top w:val="single" w:color="A6A6A6" w:sz="4"/>
               <w:left w:val="single" w:color="A6A6A6" w:sz="4"/>
@@ -8532,7 +8438,7 @@
         </w:trPr>
         <w:tc>
           <w:tcPr>
-            <w:tcW w:type="dxa" w:w="3636"/>
+            <w:tcW w:type="dxa" w:w="3473"/>
             <w:tcBorders>
               <w:top w:val="single" w:color="A6A6A6" w:sz="4"/>
               <w:left w:val="single" w:color="A6A6A6" w:sz="4"/>
@@ -8561,7 +8467,7 @@
         </w:tc>
         <w:tc>
           <w:tcPr>
-            <w:tcW w:type="dxa" w:w="5455"/>
+            <w:tcW w:type="dxa" w:w="5209"/>
             <w:tcBorders>
               <w:top w:val="single" w:color="A6A6A6" w:sz="4"/>
               <w:left w:val="single" w:color="A6A6A6" w:sz="4"/>
@@ -8606,7 +8512,7 @@
         </w:tc>
         <w:tc>
           <w:tcPr>
-            <w:tcW w:type="dxa" w:w="547"/>
+            <w:tcW w:type="dxa" w:w="956"/>
             <w:tcBorders>
               <w:top w:val="single" w:color="A6A6A6" w:sz="4"/>
               <w:left w:val="single" w:color="A6A6A6" w:sz="4"/>
@@ -8641,7 +8547,7 @@
         </w:trPr>
         <w:tc>
           <w:tcPr>
-            <w:tcW w:type="dxa" w:w="3636"/>
+            <w:tcW w:type="dxa" w:w="3473"/>
             <w:tcBorders>
               <w:top w:val="single" w:color="A6A6A6" w:sz="4"/>
               <w:left w:val="single" w:color="A6A6A6" w:sz="4"/>
@@ -8670,7 +8576,7 @@
         </w:tc>
         <w:tc>
           <w:tcPr>
-            <w:tcW w:type="dxa" w:w="5455"/>
+            <w:tcW w:type="dxa" w:w="5209"/>
             <w:tcBorders>
               <w:top w:val="single" w:color="A6A6A6" w:sz="4"/>
               <w:left w:val="single" w:color="A6A6A6" w:sz="4"/>
@@ -8722,7 +8628,7 @@
         </w:tc>
         <w:tc>
           <w:tcPr>
-            <w:tcW w:type="dxa" w:w="547"/>
+            <w:tcW w:type="dxa" w:w="956"/>
             <w:tcBorders>
               <w:top w:val="single" w:color="A6A6A6" w:sz="4"/>
               <w:left w:val="single" w:color="A6A6A6" w:sz="4"/>
@@ -8757,7 +8663,7 @@
         </w:trPr>
         <w:tc>
           <w:tcPr>
-            <w:tcW w:type="dxa" w:w="3636"/>
+            <w:tcW w:type="dxa" w:w="3473"/>
             <w:tcBorders>
               <w:top w:val="single" w:color="A6A6A6" w:sz="4"/>
               <w:left w:val="single" w:color="A6A6A6" w:sz="4"/>
@@ -8786,7 +8692,7 @@
         </w:tc>
         <w:tc>
           <w:tcPr>
-            <w:tcW w:type="dxa" w:w="5455"/>
+            <w:tcW w:type="dxa" w:w="5209"/>
             <w:tcBorders>
               <w:top w:val="single" w:color="A6A6A6" w:sz="4"/>
               <w:left w:val="single" w:color="A6A6A6" w:sz="4"/>
@@ -8815,7 +8721,7 @@
         </w:tc>
         <w:tc>
           <w:tcPr>
-            <w:tcW w:type="dxa" w:w="547"/>
+            <w:tcW w:type="dxa" w:w="956"/>
             <w:tcBorders>
               <w:top w:val="single" w:color="A6A6A6" w:sz="4"/>
               <w:left w:val="single" w:color="A6A6A6" w:sz="4"/>
@@ -8850,7 +8756,7 @@
         </w:trPr>
         <w:tc>
           <w:tcPr>
-            <w:tcW w:type="dxa" w:w="3636"/>
+            <w:tcW w:type="dxa" w:w="3473"/>
             <w:tcBorders>
               <w:top w:val="single" w:color="A6A6A6" w:sz="4"/>
               <w:left w:val="single" w:color="A6A6A6" w:sz="4"/>
@@ -8879,7 +8785,7 @@
         </w:tc>
         <w:tc>
           <w:tcPr>
-            <w:tcW w:type="dxa" w:w="5455"/>
+            <w:tcW w:type="dxa" w:w="5209"/>
             <w:tcBorders>
               <w:top w:val="single" w:color="A6A6A6" w:sz="4"/>
               <w:left w:val="single" w:color="A6A6A6" w:sz="4"/>
@@ -8924,7 +8830,7 @@
         </w:tc>
         <w:tc>
           <w:tcPr>
-            <w:tcW w:type="dxa" w:w="547"/>
+            <w:tcW w:type="dxa" w:w="956"/>
             <w:tcBorders>
               <w:top w:val="single" w:color="A6A6A6" w:sz="4"/>
               <w:left w:val="single" w:color="A6A6A6" w:sz="4"/>
@@ -8959,7 +8865,7 @@
         </w:trPr>
         <w:tc>
           <w:tcPr>
-            <w:tcW w:type="dxa" w:w="3636"/>
+            <w:tcW w:type="dxa" w:w="3473"/>
             <w:tcBorders>
               <w:top w:val="single" w:color="A6A6A6" w:sz="4"/>
               <w:left w:val="single" w:color="A6A6A6" w:sz="4"/>
@@ -8988,7 +8894,7 @@
         </w:tc>
         <w:tc>
           <w:tcPr>
-            <w:tcW w:type="dxa" w:w="5455"/>
+            <w:tcW w:type="dxa" w:w="5209"/>
             <w:tcBorders>
               <w:top w:val="single" w:color="A6A6A6" w:sz="4"/>
               <w:left w:val="single" w:color="A6A6A6" w:sz="4"/>
@@ -9078,7 +8984,7 @@
         </w:tc>
         <w:tc>
           <w:tcPr>
-            <w:tcW w:type="dxa" w:w="547"/>
+            <w:tcW w:type="dxa" w:w="956"/>
             <w:tcBorders>
               <w:top w:val="single" w:color="A6A6A6" w:sz="4"/>
               <w:left w:val="single" w:color="A6A6A6" w:sz="4"/>
@@ -9113,7 +9019,7 @@
         </w:trPr>
         <w:tc>
           <w:tcPr>
-            <w:tcW w:type="dxa" w:w="3636"/>
+            <w:tcW w:type="dxa" w:w="3473"/>
             <w:tcBorders>
               <w:top w:val="single" w:color="A6A6A6" w:sz="4"/>
               <w:left w:val="single" w:color="A6A6A6" w:sz="4"/>
@@ -9142,7 +9048,7 @@
         </w:tc>
         <w:tc>
           <w:tcPr>
-            <w:tcW w:type="dxa" w:w="5455"/>
+            <w:tcW w:type="dxa" w:w="5209"/>
             <w:tcBorders>
               <w:top w:val="single" w:color="A6A6A6" w:sz="4"/>
               <w:left w:val="single" w:color="A6A6A6" w:sz="4"/>
@@ -9217,7 +9123,7 @@
         </w:tc>
         <w:tc>
           <w:tcPr>
-            <w:tcW w:type="dxa" w:w="547"/>
+            <w:tcW w:type="dxa" w:w="956"/>
             <w:tcBorders>
               <w:top w:val="single" w:color="A6A6A6" w:sz="4"/>
               <w:left w:val="single" w:color="A6A6A6" w:sz="4"/>
@@ -9252,7 +9158,7 @@
         </w:trPr>
         <w:tc>
           <w:tcPr>
-            <w:tcW w:type="dxa" w:w="3636"/>
+            <w:tcW w:type="dxa" w:w="3473"/>
             <w:tcBorders>
               <w:top w:val="single" w:color="A6A6A6" w:sz="4"/>
               <w:left w:val="single" w:color="A6A6A6" w:sz="4"/>
@@ -9281,7 +9187,7 @@
         </w:tc>
         <w:tc>
           <w:tcPr>
-            <w:tcW w:type="dxa" w:w="5455"/>
+            <w:tcW w:type="dxa" w:w="5209"/>
             <w:tcBorders>
               <w:top w:val="single" w:color="A6A6A6" w:sz="4"/>
               <w:left w:val="single" w:color="A6A6A6" w:sz="4"/>
@@ -9371,7 +9277,7 @@
         </w:tc>
         <w:tc>
           <w:tcPr>
-            <w:tcW w:type="dxa" w:w="547"/>
+            <w:tcW w:type="dxa" w:w="956"/>
             <w:tcBorders>
               <w:top w:val="single" w:color="A6A6A6" w:sz="4"/>
               <w:left w:val="single" w:color="A6A6A6" w:sz="4"/>
@@ -9406,164 +9312,89 @@
         </w:trPr>
         <w:tc>
           <w:tcPr>
-            <w:tcW w:type="dxa" w:w="3636"/>
-            <w:tcBorders>
-              <w:top w:val="single" w:color="A6A6A6" w:sz="4"/>
-              <w:left w:val="single" w:color="A6A6A6" w:sz="4"/>
-              <w:bottom w:val="single" w:color="A6A6A6" w:sz="4"/>
-              <w:right w:val="single" w:color="A6A6A6" w:sz="4"/>
-            </w:tcBorders>
-            <w:tcMar>
-              <w:top w:type="dxa" w:w="50"/>
-              <w:left w:type="dxa" w:w="90"/>
-              <w:bottom w:type="dxa" w:w="50"/>
-              <w:right w:type="dxa" w:w="90"/>
-            </w:tcMar>
-          </w:tcPr>
-          <w:p>
-            <w:pPr>
-              <w:spacing w:after="0"/>
-            </w:pPr>
-            <w:r>
-              <w:rPr>
-                <w:sz w:val="19"/>
-                <w:szCs w:val="19"/>
-              </w:rPr>
-              <w:t xml:space="preserve">Fernwartungsregel, Adresse</w:t>
-            </w:r>
-          </w:p>
-        </w:tc>
-        <w:tc>
-          <w:tcPr>
-            <w:tcW w:type="dxa" w:w="5455"/>
-            <w:tcBorders>
-              <w:top w:val="single" w:color="A6A6A6" w:sz="4"/>
-              <w:left w:val="single" w:color="A6A6A6" w:sz="4"/>
-              <w:bottom w:val="single" w:color="A6A6A6" w:sz="4"/>
-              <w:right w:val="single" w:color="A6A6A6" w:sz="4"/>
-            </w:tcBorders>
-            <w:tcMar>
-              <w:top w:type="dxa" w:w="50"/>
-              <w:left w:type="dxa" w:w="90"/>
-              <w:bottom w:type="dxa" w:w="50"/>
-              <w:right w:type="dxa" w:w="90"/>
-            </w:tcMar>
-          </w:tcPr>
-          <w:p>
-            <w:pPr>
-              <w:spacing w:after="0"/>
-            </w:pPr>
-            <w:r>
-              <w:rPr>
-                <w:rFonts w:ascii="Consolas" w:cs="Consolas" w:eastAsia="Consolas" w:hAnsi="Consolas"/>
-                <w:sz w:val="18"/>
-                <w:szCs w:val="18"/>
-              </w:rPr>
-              <w:t xml:space="preserve">EPOS.Kern/Allgemein/Support/Fernwartung.cs</w:t>
-            </w:r>
-            <w:r>
-              <w:rPr>
-                <w:sz w:val="19"/>
-                <w:szCs w:val="19"/>
-              </w:rPr>
-              <w:t xml:space="preserve"> (</w:t>
-            </w:r>
-            <w:r>
-              <w:rPr>
-                <w:rFonts w:ascii="Consolas" w:cs="Consolas" w:eastAsia="Consolas" w:hAnsi="Consolas"/>
-                <w:sz w:val="18"/>
-                <w:szCs w:val="18"/>
-              </w:rPr>
-              <w:t xml:space="preserve">SEITE</w:t>
-            </w:r>
-            <w:r>
-              <w:rPr>
-                <w:sz w:val="19"/>
-                <w:szCs w:val="19"/>
-              </w:rPr>
-              <w:t xml:space="preserve">, </w:t>
-            </w:r>
-            <w:r>
-              <w:rPr>
-                <w:rFonts w:ascii="Consolas" w:cs="Consolas" w:eastAsia="Consolas" w:hAnsi="Consolas"/>
-                <w:sz w:val="18"/>
-                <w:szCs w:val="18"/>
-              </w:rPr>
-              <w:t xml:space="preserve">Fernwartungsfreigabe</w:t>
-            </w:r>
-            <w:r>
-              <w:rPr>
-                <w:sz w:val="19"/>
-                <w:szCs w:val="19"/>
-              </w:rPr>
-              <w:t xml:space="preserve">), </w:t>
-            </w:r>
-            <w:r>
-              <w:rPr>
-                <w:rFonts w:ascii="Consolas" w:cs="Consolas" w:eastAsia="Consolas" w:hAnsi="Consolas"/>
-                <w:sz w:val="18"/>
-                <w:szCs w:val="18"/>
-              </w:rPr>
-              <w:t xml:space="preserve">EPOS.Kern/Controller/LizenzCtrl.cs</w:t>
-            </w:r>
-            <w:r>
-              <w:rPr>
-                <w:sz w:val="19"/>
-                <w:szCs w:val="19"/>
-              </w:rPr>
-              <w:t xml:space="preserve"> (</w:t>
-            </w:r>
-            <w:r>
-              <w:rPr>
-                <w:rFonts w:ascii="Consolas" w:cs="Consolas" w:eastAsia="Consolas" w:hAnsi="Consolas"/>
-                <w:sz w:val="18"/>
-                <w:szCs w:val="18"/>
-              </w:rPr>
-              <w:t xml:space="preserve">FernwartungErlaubt</w:t>
-            </w:r>
-            <w:r>
-              <w:rPr>
-                <w:sz w:val="19"/>
-                <w:szCs w:val="19"/>
-              </w:rPr>
-              <w:t xml:space="preserve">), </w:t>
-            </w:r>
-            <w:r>
-              <w:rPr>
-                <w:rFonts w:ascii="Consolas" w:cs="Consolas" w:eastAsia="Consolas" w:hAnsi="Consolas"/>
-                <w:sz w:val="18"/>
-                <w:szCs w:val="18"/>
-              </w:rPr>
-              <w:t xml:space="preserve">LizenzManager.AnkerOhneSchreiben</w:t>
-            </w:r>
-          </w:p>
-        </w:tc>
-        <w:tc>
-          <w:tcPr>
-            <w:tcW w:type="dxa" w:w="547"/>
-            <w:tcBorders>
-              <w:top w:val="single" w:color="A6A6A6" w:sz="4"/>
-              <w:left w:val="single" w:color="A6A6A6" w:sz="4"/>
-              <w:bottom w:val="single" w:color="A6A6A6" w:sz="4"/>
-              <w:right w:val="single" w:color="A6A6A6" w:sz="4"/>
-            </w:tcBorders>
-            <w:tcMar>
-              <w:top w:type="dxa" w:w="50"/>
-              <w:left w:type="dxa" w:w="90"/>
-              <w:bottom w:type="dxa" w:w="50"/>
-              <w:right w:type="dxa" w:w="90"/>
-            </w:tcMar>
-          </w:tcPr>
-          <w:p>
-            <w:pPr>
-              <w:spacing w:after="0"/>
-            </w:pPr>
-            <w:r>
-              <w:rPr>
-                <w:sz w:val="19"/>
-                <w:szCs w:val="19"/>
-              </w:rPr>
-              <w:t xml:space="preserve">2</w:t>
+            <w:tcW w:type="dxa" w:w="3473"/>
+            <w:tcBorders>
+              <w:top w:val="single" w:color="A6A6A6" w:sz="4"/>
+              <w:left w:val="single" w:color="A6A6A6" w:sz="4"/>
+              <w:bottom w:val="single" w:color="A6A6A6" w:sz="4"/>
+              <w:right w:val="single" w:color="A6A6A6" w:sz="4"/>
+            </w:tcBorders>
+            <w:tcMar>
+              <w:top w:type="dxa" w:w="50"/>
+              <w:left w:type="dxa" w:w="90"/>
+              <w:bottom w:type="dxa" w:w="50"/>
+              <w:right w:type="dxa" w:w="90"/>
+            </w:tcMar>
+          </w:tcPr>
+          <w:p>
+            <w:pPr>
+              <w:spacing w:after="0"/>
+            </w:pPr>
+            <w:r>
+              <w:rPr>
+                <w:sz w:val="19"/>
+                <w:szCs w:val="19"/>
+              </w:rPr>
+              <w:t xml:space="preserve">Start von Quick Assist</w:t>
+            </w:r>
+          </w:p>
+        </w:tc>
+        <w:tc>
+          <w:tcPr>
+            <w:tcW w:type="dxa" w:w="5209"/>
+            <w:tcBorders>
+              <w:top w:val="single" w:color="A6A6A6" w:sz="4"/>
+              <w:left w:val="single" w:color="A6A6A6" w:sz="4"/>
+              <w:bottom w:val="single" w:color="A6A6A6" w:sz="4"/>
+              <w:right w:val="single" w:color="A6A6A6" w:sz="4"/>
+            </w:tcBorders>
+            <w:tcMar>
+              <w:top w:type="dxa" w:w="50"/>
+              <w:left w:type="dxa" w:w="90"/>
+              <w:bottom w:type="dxa" w:w="50"/>
+              <w:right w:type="dxa" w:w="90"/>
+            </w:tcMar>
+          </w:tcPr>
+          <w:p>
+            <w:pPr>
+              <w:spacing w:after="0"/>
+            </w:pPr>
+            <w:r>
+              <w:rPr>
+                <w:rFonts w:ascii="Consolas" w:cs="Consolas" w:eastAsia="Consolas" w:hAnsi="Consolas"/>
+                <w:sz w:val="18"/>
+                <w:szCs w:val="18"/>
+              </w:rPr>
+              <w:t xml:space="preserve">WindowsFormsApplication1/Allgemein/Support/QuickAssistStart.cs</w:t>
+            </w:r>
+          </w:p>
+        </w:tc>
+        <w:tc>
+          <w:tcPr>
+            <w:tcW w:type="dxa" w:w="956"/>
+            <w:tcBorders>
+              <w:top w:val="single" w:color="A6A6A6" w:sz="4"/>
+              <w:left w:val="single" w:color="A6A6A6" w:sz="4"/>
+              <w:bottom w:val="single" w:color="A6A6A6" w:sz="4"/>
+              <w:right w:val="single" w:color="A6A6A6" w:sz="4"/>
+            </w:tcBorders>
+            <w:tcMar>
+              <w:top w:type="dxa" w:w="50"/>
+              <w:left w:type="dxa" w:w="90"/>
+              <w:bottom w:type="dxa" w:w="50"/>
+              <w:right w:type="dxa" w:w="90"/>
+            </w:tcMar>
+          </w:tcPr>
+          <w:p>
+            <w:pPr>
+              <w:spacing w:after="0"/>
+            </w:pPr>
+            <w:r>
+              <w:rPr>
+                <w:sz w:val="19"/>
+                <w:szCs w:val="19"/>
+              </w:rPr>
+              <w:t xml:space="preserve">2 (Nachzug)</w:t>
             </w:r>
           </w:p>
         </w:tc>
@@ -9575,60 +9406,60 @@
         </w:trPr>
         <w:tc>
           <w:tcPr>
-            <w:tcW w:type="dxa" w:w="3636"/>
-            <w:tcBorders>
-              <w:top w:val="single" w:color="A6A6A6" w:sz="4"/>
-              <w:left w:val="single" w:color="A6A6A6" w:sz="4"/>
-              <w:bottom w:val="single" w:color="A6A6A6" w:sz="4"/>
-              <w:right w:val="single" w:color="A6A6A6" w:sz="4"/>
-            </w:tcBorders>
-            <w:tcMar>
-              <w:top w:type="dxa" w:w="50"/>
-              <w:left w:type="dxa" w:w="90"/>
-              <w:bottom w:type="dxa" w:w="50"/>
-              <w:right w:type="dxa" w:w="90"/>
-            </w:tcMar>
-          </w:tcPr>
-          <w:p>
-            <w:pPr>
-              <w:spacing w:after="0"/>
-            </w:pPr>
-            <w:r>
-              <w:rPr>
-                <w:sz w:val="19"/>
-                <w:szCs w:val="19"/>
-              </w:rPr>
-              <w:t xml:space="preserve">Menüsperre</w:t>
-            </w:r>
-          </w:p>
-        </w:tc>
-        <w:tc>
-          <w:tcPr>
-            <w:tcW w:type="dxa" w:w="5455"/>
-            <w:tcBorders>
-              <w:top w:val="single" w:color="A6A6A6" w:sz="4"/>
-              <w:left w:val="single" w:color="A6A6A6" w:sz="4"/>
-              <w:bottom w:val="single" w:color="A6A6A6" w:sz="4"/>
-              <w:right w:val="single" w:color="A6A6A6" w:sz="4"/>
-            </w:tcBorders>
-            <w:tcMar>
-              <w:top w:type="dxa" w:w="50"/>
-              <w:left w:type="dxa" w:w="90"/>
-              <w:bottom w:type="dxa" w:w="50"/>
-              <w:right w:type="dxa" w:w="90"/>
-            </w:tcMar>
-          </w:tcPr>
-          <w:p>
-            <w:pPr>
-              <w:spacing w:after="0"/>
-            </w:pPr>
-            <w:r>
-              <w:rPr>
-                <w:rFonts w:ascii="Consolas" w:cs="Consolas" w:eastAsia="Consolas" w:hAnsi="Consolas"/>
-                <w:sz w:val="18"/>
-                <w:szCs w:val="18"/>
-              </w:rPr>
-              <w:t xml:space="preserve">EPOS.UI/Bausteine/Menuepunkt.cs</w:t>
+            <w:tcW w:type="dxa" w:w="3473"/>
+            <w:tcBorders>
+              <w:top w:val="single" w:color="A6A6A6" w:sz="4"/>
+              <w:left w:val="single" w:color="A6A6A6" w:sz="4"/>
+              <w:bottom w:val="single" w:color="A6A6A6" w:sz="4"/>
+              <w:right w:val="single" w:color="A6A6A6" w:sz="4"/>
+            </w:tcBorders>
+            <w:tcMar>
+              <w:top w:type="dxa" w:w="50"/>
+              <w:left w:type="dxa" w:w="90"/>
+              <w:bottom w:type="dxa" w:w="50"/>
+              <w:right w:type="dxa" w:w="90"/>
+            </w:tcMar>
+          </w:tcPr>
+          <w:p>
+            <w:pPr>
+              <w:spacing w:after="0"/>
+            </w:pPr>
+            <w:r>
+              <w:rPr>
+                <w:sz w:val="19"/>
+                <w:szCs w:val="19"/>
+              </w:rPr>
+              <w:t xml:space="preserve">Fernwartungsregel, Adresse</w:t>
+            </w:r>
+          </w:p>
+        </w:tc>
+        <w:tc>
+          <w:tcPr>
+            <w:tcW w:type="dxa" w:w="5209"/>
+            <w:tcBorders>
+              <w:top w:val="single" w:color="A6A6A6" w:sz="4"/>
+              <w:left w:val="single" w:color="A6A6A6" w:sz="4"/>
+              <w:bottom w:val="single" w:color="A6A6A6" w:sz="4"/>
+              <w:right w:val="single" w:color="A6A6A6" w:sz="4"/>
+            </w:tcBorders>
+            <w:tcMar>
+              <w:top w:type="dxa" w:w="50"/>
+              <w:left w:type="dxa" w:w="90"/>
+              <w:bottom w:type="dxa" w:w="50"/>
+              <w:right w:type="dxa" w:w="90"/>
+            </w:tcMar>
+          </w:tcPr>
+          <w:p>
+            <w:pPr>
+              <w:spacing w:after="0"/>
+            </w:pPr>
+            <w:r>
+              <w:rPr>
+                <w:rFonts w:ascii="Consolas" w:cs="Consolas" w:eastAsia="Consolas" w:hAnsi="Consolas"/>
+                <w:sz w:val="18"/>
+                <w:szCs w:val="18"/>
+              </w:rPr>
+              <w:t xml:space="preserve">EPOS.Kern/Allgemein/Support/Fernwartung.cs</w:t>
             </w:r>
             <w:r>
               <w:rPr>
@@ -9643,7 +9474,22 @@
                 <w:sz w:val="18"/>
                 <w:szCs w:val="18"/>
               </w:rPr>
-              <w:t xml:space="preserve">Sperrgrund</w:t>
+              <w:t xml:space="preserve">SEITE</w:t>
+            </w:r>
+            <w:r>
+              <w:rPr>
+                <w:sz w:val="19"/>
+                <w:szCs w:val="19"/>
+              </w:rPr>
+              <w:t xml:space="preserve">, </w:t>
+            </w:r>
+            <w:r>
+              <w:rPr>
+                <w:rFonts w:ascii="Consolas" w:cs="Consolas" w:eastAsia="Consolas" w:hAnsi="Consolas"/>
+                <w:sz w:val="18"/>
+                <w:szCs w:val="18"/>
+              </w:rPr>
+              <w:t xml:space="preserve">Fernwartungsfreigabe</w:t>
             </w:r>
             <w:r>
               <w:rPr>
@@ -9658,22 +9504,22 @@
                 <w:sz w:val="18"/>
                 <w:szCs w:val="18"/>
               </w:rPr>
-              <w:t xml:space="preserve">Menuetabelle.cs</w:t>
-            </w:r>
-            <w:r>
-              <w:rPr>
-                <w:sz w:val="19"/>
-                <w:szCs w:val="19"/>
-              </w:rPr>
-              <w:t xml:space="preserve"> (Punkt </w:t>
-            </w:r>
-            <w:r>
-              <w:rPr>
-                <w:rFonts w:ascii="Consolas" w:cs="Consolas" w:eastAsia="Consolas" w:hAnsi="Consolas"/>
-                <w:sz w:val="18"/>
-                <w:szCs w:val="18"/>
-              </w:rPr>
-              <w:t xml:space="preserve">MenuItem_Fernwartung</w:t>
+              <w:t xml:space="preserve">EPOS.Kern/Controller/LizenzCtrl.cs</w:t>
+            </w:r>
+            <w:r>
+              <w:rPr>
+                <w:sz w:val="19"/>
+                <w:szCs w:val="19"/>
+              </w:rPr>
+              <w:t xml:space="preserve"> (</w:t>
+            </w:r>
+            <w:r>
+              <w:rPr>
+                <w:rFonts w:ascii="Consolas" w:cs="Consolas" w:eastAsia="Consolas" w:hAnsi="Consolas"/>
+                <w:sz w:val="18"/>
+                <w:szCs w:val="18"/>
+              </w:rPr>
+              <w:t xml:space="preserve">FernwartungErlaubt</w:t>
             </w:r>
             <w:r>
               <w:rPr>
@@ -9688,50 +9534,13 @@
                 <w:sz w:val="18"/>
                 <w:szCs w:val="18"/>
               </w:rPr>
-              <w:t xml:space="preserve">Menueband.razor</w:t>
-            </w:r>
-            <w:r>
-              <w:rPr>
-                <w:sz w:val="19"/>
-                <w:szCs w:val="19"/>
-              </w:rPr>
-              <w:t xml:space="preserve">, </w:t>
-            </w:r>
-            <w:r>
-              <w:rPr>
-                <w:rFonts w:ascii="Consolas" w:cs="Consolas" w:eastAsia="Consolas" w:hAnsi="Consolas"/>
-                <w:sz w:val="18"/>
-                <w:szCs w:val="18"/>
-              </w:rPr>
-              <w:t xml:space="preserve">HauptfensterHuelle.cs</w:t>
-            </w:r>
-            <w:r>
-              <w:rPr>
-                <w:sz w:val="19"/>
-                <w:szCs w:val="19"/>
-              </w:rPr>
-              <w:t xml:space="preserve"> (Fall </w:t>
-            </w:r>
-            <w:r>
-              <w:rPr>
-                <w:rFonts w:ascii="Consolas" w:cs="Consolas" w:eastAsia="Consolas" w:hAnsi="Consolas"/>
-                <w:sz w:val="18"/>
-                <w:szCs w:val="18"/>
-              </w:rPr>
-              <w:t xml:space="preserve">Fernwartung</w:t>
-            </w:r>
-            <w:r>
-              <w:rPr>
-                <w:sz w:val="19"/>
-                <w:szCs w:val="19"/>
-              </w:rPr>
-              <w:t xml:space="preserve">)</w:t>
-            </w:r>
-          </w:p>
-        </w:tc>
-        <w:tc>
-          <w:tcPr>
-            <w:tcW w:type="dxa" w:w="547"/>
+              <w:t xml:space="preserve">LizenzManager.AnkerOhneSchreiben</w:t>
+            </w:r>
+          </w:p>
+        </w:tc>
+        <w:tc>
+          <w:tcPr>
+            <w:tcW w:type="dxa" w:w="956"/>
             <w:tcBorders>
               <w:top w:val="single" w:color="A6A6A6" w:sz="4"/>
               <w:left w:val="single" w:color="A6A6A6" w:sz="4"/>
@@ -9766,60 +9575,120 @@
         </w:trPr>
         <w:tc>
           <w:tcPr>
-            <w:tcW w:type="dxa" w:w="3636"/>
-            <w:tcBorders>
-              <w:top w:val="single" w:color="A6A6A6" w:sz="4"/>
-              <w:left w:val="single" w:color="A6A6A6" w:sz="4"/>
-              <w:bottom w:val="single" w:color="A6A6A6" w:sz="4"/>
-              <w:right w:val="single" w:color="A6A6A6" w:sz="4"/>
-            </w:tcBorders>
-            <w:tcMar>
-              <w:top w:type="dxa" w:w="50"/>
-              <w:left w:type="dxa" w:w="90"/>
-              <w:bottom w:type="dxa" w:w="50"/>
-              <w:right w:type="dxa" w:w="90"/>
-            </w:tcMar>
-          </w:tcPr>
-          <w:p>
-            <w:pPr>
-              <w:spacing w:after="0"/>
-            </w:pPr>
-            <w:r>
-              <w:rPr>
-                <w:sz w:val="19"/>
-                <w:szCs w:val="19"/>
-              </w:rPr>
-              <w:t xml:space="preserve">Tests der Fernwartung</w:t>
-            </w:r>
-          </w:p>
-        </w:tc>
-        <w:tc>
-          <w:tcPr>
-            <w:tcW w:type="dxa" w:w="5455"/>
-            <w:tcBorders>
-              <w:top w:val="single" w:color="A6A6A6" w:sz="4"/>
-              <w:left w:val="single" w:color="A6A6A6" w:sz="4"/>
-              <w:bottom w:val="single" w:color="A6A6A6" w:sz="4"/>
-              <w:right w:val="single" w:color="A6A6A6" w:sz="4"/>
-            </w:tcBorders>
-            <w:tcMar>
-              <w:top w:type="dxa" w:w="50"/>
-              <w:left w:type="dxa" w:w="90"/>
-              <w:bottom w:type="dxa" w:w="50"/>
-              <w:right w:type="dxa" w:w="90"/>
-            </w:tcMar>
-          </w:tcPr>
-          <w:p>
-            <w:pPr>
-              <w:spacing w:after="0"/>
-            </w:pPr>
-            <w:r>
-              <w:rPr>
-                <w:rFonts w:ascii="Consolas" w:cs="Consolas" w:eastAsia="Consolas" w:hAnsi="Consolas"/>
-                <w:sz w:val="18"/>
-                <w:szCs w:val="18"/>
-              </w:rPr>
-              <w:t xml:space="preserve">EPOS.Kern.Tests/FernwartungFreigabeTests.cs</w:t>
+            <w:tcW w:type="dxa" w:w="3473"/>
+            <w:tcBorders>
+              <w:top w:val="single" w:color="A6A6A6" w:sz="4"/>
+              <w:left w:val="single" w:color="A6A6A6" w:sz="4"/>
+              <w:bottom w:val="single" w:color="A6A6A6" w:sz="4"/>
+              <w:right w:val="single" w:color="A6A6A6" w:sz="4"/>
+            </w:tcBorders>
+            <w:tcMar>
+              <w:top w:type="dxa" w:w="50"/>
+              <w:left w:type="dxa" w:w="90"/>
+              <w:bottom w:type="dxa" w:w="50"/>
+              <w:right w:type="dxa" w:w="90"/>
+            </w:tcMar>
+          </w:tcPr>
+          <w:p>
+            <w:pPr>
+              <w:spacing w:after="0"/>
+            </w:pPr>
+            <w:r>
+              <w:rPr>
+                <w:sz w:val="19"/>
+                <w:szCs w:val="19"/>
+              </w:rPr>
+              <w:t xml:space="preserve">Menüsperre</w:t>
+            </w:r>
+          </w:p>
+        </w:tc>
+        <w:tc>
+          <w:tcPr>
+            <w:tcW w:type="dxa" w:w="5209"/>
+            <w:tcBorders>
+              <w:top w:val="single" w:color="A6A6A6" w:sz="4"/>
+              <w:left w:val="single" w:color="A6A6A6" w:sz="4"/>
+              <w:bottom w:val="single" w:color="A6A6A6" w:sz="4"/>
+              <w:right w:val="single" w:color="A6A6A6" w:sz="4"/>
+            </w:tcBorders>
+            <w:tcMar>
+              <w:top w:type="dxa" w:w="50"/>
+              <w:left w:type="dxa" w:w="90"/>
+              <w:bottom w:type="dxa" w:w="50"/>
+              <w:right w:type="dxa" w:w="90"/>
+            </w:tcMar>
+          </w:tcPr>
+          <w:p>
+            <w:pPr>
+              <w:spacing w:after="0"/>
+            </w:pPr>
+            <w:r>
+              <w:rPr>
+                <w:rFonts w:ascii="Consolas" w:cs="Consolas" w:eastAsia="Consolas" w:hAnsi="Consolas"/>
+                <w:sz w:val="18"/>
+                <w:szCs w:val="18"/>
+              </w:rPr>
+              <w:t xml:space="preserve">EPOS.UI/Bausteine/Menuepunkt.cs</w:t>
+            </w:r>
+            <w:r>
+              <w:rPr>
+                <w:sz w:val="19"/>
+                <w:szCs w:val="19"/>
+              </w:rPr>
+              <w:t xml:space="preserve"> (</w:t>
+            </w:r>
+            <w:r>
+              <w:rPr>
+                <w:rFonts w:ascii="Consolas" w:cs="Consolas" w:eastAsia="Consolas" w:hAnsi="Consolas"/>
+                <w:sz w:val="18"/>
+                <w:szCs w:val="18"/>
+              </w:rPr>
+              <w:t xml:space="preserve">Sperrgrund</w:t>
+            </w:r>
+            <w:r>
+              <w:rPr>
+                <w:sz w:val="19"/>
+                <w:szCs w:val="19"/>
+              </w:rPr>
+              <w:t xml:space="preserve">), </w:t>
+            </w:r>
+            <w:r>
+              <w:rPr>
+                <w:rFonts w:ascii="Consolas" w:cs="Consolas" w:eastAsia="Consolas" w:hAnsi="Consolas"/>
+                <w:sz w:val="18"/>
+                <w:szCs w:val="18"/>
+              </w:rPr>
+              <w:t xml:space="preserve">Menuetabelle.cs</w:t>
+            </w:r>
+            <w:r>
+              <w:rPr>
+                <w:sz w:val="19"/>
+                <w:szCs w:val="19"/>
+              </w:rPr>
+              <w:t xml:space="preserve"> (Punkt </w:t>
+            </w:r>
+            <w:r>
+              <w:rPr>
+                <w:rFonts w:ascii="Consolas" w:cs="Consolas" w:eastAsia="Consolas" w:hAnsi="Consolas"/>
+                <w:sz w:val="18"/>
+                <w:szCs w:val="18"/>
+              </w:rPr>
+              <w:t xml:space="preserve">MenuItem_Fernwartung</w:t>
+            </w:r>
+            <w:r>
+              <w:rPr>
+                <w:sz w:val="19"/>
+                <w:szCs w:val="19"/>
+              </w:rPr>
+              <w:t xml:space="preserve">), </w:t>
+            </w:r>
+            <w:r>
+              <w:rPr>
+                <w:rFonts w:ascii="Consolas" w:cs="Consolas" w:eastAsia="Consolas" w:hAnsi="Consolas"/>
+                <w:sz w:val="18"/>
+                <w:szCs w:val="18"/>
+              </w:rPr>
+              <w:t xml:space="preserve">Menueband.razor</w:t>
             </w:r>
             <w:r>
               <w:rPr>
@@ -9834,28 +9703,35 @@
                 <w:sz w:val="18"/>
                 <w:szCs w:val="18"/>
               </w:rPr>
-              <w:t xml:space="preserve">EPOS.UI.Tests/Dialoge/FernwartungDialogTests.cs</w:t>
-            </w:r>
-            <w:r>
-              <w:rPr>
-                <w:sz w:val="19"/>
-                <w:szCs w:val="19"/>
-              </w:rPr>
-              <w:t xml:space="preserve">, </w:t>
-            </w:r>
-            <w:r>
-              <w:rPr>
-                <w:rFonts w:ascii="Consolas" w:cs="Consolas" w:eastAsia="Consolas" w:hAnsi="Consolas"/>
-                <w:sz w:val="18"/>
-                <w:szCs w:val="18"/>
-              </w:rPr>
-              <w:t xml:space="preserve">MenuebandTests</w:t>
-            </w:r>
-          </w:p>
-        </w:tc>
-        <w:tc>
-          <w:tcPr>
-            <w:tcW w:type="dxa" w:w="547"/>
+              <w:t xml:space="preserve">HauptfensterHuelle.cs</w:t>
+            </w:r>
+            <w:r>
+              <w:rPr>
+                <w:sz w:val="19"/>
+                <w:szCs w:val="19"/>
+              </w:rPr>
+              <w:t xml:space="preserve"> (Fall </w:t>
+            </w:r>
+            <w:r>
+              <w:rPr>
+                <w:rFonts w:ascii="Consolas" w:cs="Consolas" w:eastAsia="Consolas" w:hAnsi="Consolas"/>
+                <w:sz w:val="18"/>
+                <w:szCs w:val="18"/>
+              </w:rPr>
+              <w:t xml:space="preserve">Fernwartung</w:t>
+            </w:r>
+            <w:r>
+              <w:rPr>
+                <w:sz w:val="19"/>
+                <w:szCs w:val="19"/>
+              </w:rPr>
+              <w:t xml:space="preserve">)</w:t>
+            </w:r>
+          </w:p>
+        </w:tc>
+        <w:tc>
+          <w:tcPr>
+            <w:tcW w:type="dxa" w:w="956"/>
             <w:tcBorders>
               <w:top w:val="single" w:color="A6A6A6" w:sz="4"/>
               <w:left w:val="single" w:color="A6A6A6" w:sz="4"/>
@@ -9890,66 +9766,96 @@
         </w:trPr>
         <w:tc>
           <w:tcPr>
-            <w:tcW w:type="dxa" w:w="3636"/>
-            <w:tcBorders>
-              <w:top w:val="single" w:color="A6A6A6" w:sz="4"/>
-              <w:left w:val="single" w:color="A6A6A6" w:sz="4"/>
-              <w:bottom w:val="single" w:color="A6A6A6" w:sz="4"/>
-              <w:right w:val="single" w:color="A6A6A6" w:sz="4"/>
-            </w:tcBorders>
-            <w:tcMar>
-              <w:top w:type="dxa" w:w="50"/>
-              <w:left w:type="dxa" w:w="90"/>
-              <w:bottom w:type="dxa" w:w="50"/>
-              <w:right w:type="dxa" w:w="90"/>
-            </w:tcMar>
-          </w:tcPr>
-          <w:p>
-            <w:pPr>
-              <w:spacing w:after="0"/>
-            </w:pPr>
-            <w:r>
-              <w:rPr>
-                <w:sz w:val="19"/>
-                <w:szCs w:val="19"/>
-              </w:rPr>
-              <w:t xml:space="preserve">Wiki-Quelle</w:t>
-            </w:r>
-          </w:p>
-        </w:tc>
-        <w:tc>
-          <w:tcPr>
-            <w:tcW w:type="dxa" w:w="5455"/>
-            <w:tcBorders>
-              <w:top w:val="single" w:color="A6A6A6" w:sz="4"/>
-              <w:left w:val="single" w:color="A6A6A6" w:sz="4"/>
-              <w:bottom w:val="single" w:color="A6A6A6" w:sz="4"/>
-              <w:right w:val="single" w:color="A6A6A6" w:sz="4"/>
-            </w:tcBorders>
-            <w:tcMar>
-              <w:top w:type="dxa" w:w="50"/>
-              <w:left w:type="dxa" w:w="90"/>
-              <w:bottom w:type="dxa" w:w="50"/>
-              <w:right w:type="dxa" w:w="90"/>
-            </w:tcMar>
-          </w:tcPr>
-          <w:p>
-            <w:pPr>
-              <w:spacing w:after="0"/>
-            </w:pPr>
-            <w:r>
-              <w:rPr>
-                <w:rFonts w:ascii="Consolas" w:cs="Consolas" w:eastAsia="Consolas" w:hAnsi="Consolas"/>
-                <w:sz w:val="18"/>
-                <w:szCs w:val="18"/>
-              </w:rPr>
-              <w:t xml:space="preserve">Projekte/Wiki/Programm Dokumentation - Fernwartung.wiki</w:t>
-            </w:r>
-          </w:p>
-        </w:tc>
-        <w:tc>
-          <w:tcPr>
-            <w:tcW w:type="dxa" w:w="547"/>
+            <w:tcW w:type="dxa" w:w="3473"/>
+            <w:tcBorders>
+              <w:top w:val="single" w:color="A6A6A6" w:sz="4"/>
+              <w:left w:val="single" w:color="A6A6A6" w:sz="4"/>
+              <w:bottom w:val="single" w:color="A6A6A6" w:sz="4"/>
+              <w:right w:val="single" w:color="A6A6A6" w:sz="4"/>
+            </w:tcBorders>
+            <w:tcMar>
+              <w:top w:type="dxa" w:w="50"/>
+              <w:left w:type="dxa" w:w="90"/>
+              <w:bottom w:type="dxa" w:w="50"/>
+              <w:right w:type="dxa" w:w="90"/>
+            </w:tcMar>
+          </w:tcPr>
+          <w:p>
+            <w:pPr>
+              <w:spacing w:after="0"/>
+            </w:pPr>
+            <w:r>
+              <w:rPr>
+                <w:sz w:val="19"/>
+                <w:szCs w:val="19"/>
+              </w:rPr>
+              <w:t xml:space="preserve">Tests der Fernwartung</w:t>
+            </w:r>
+          </w:p>
+        </w:tc>
+        <w:tc>
+          <w:tcPr>
+            <w:tcW w:type="dxa" w:w="5209"/>
+            <w:tcBorders>
+              <w:top w:val="single" w:color="A6A6A6" w:sz="4"/>
+              <w:left w:val="single" w:color="A6A6A6" w:sz="4"/>
+              <w:bottom w:val="single" w:color="A6A6A6" w:sz="4"/>
+              <w:right w:val="single" w:color="A6A6A6" w:sz="4"/>
+            </w:tcBorders>
+            <w:tcMar>
+              <w:top w:type="dxa" w:w="50"/>
+              <w:left w:type="dxa" w:w="90"/>
+              <w:bottom w:type="dxa" w:w="50"/>
+              <w:right w:type="dxa" w:w="90"/>
+            </w:tcMar>
+          </w:tcPr>
+          <w:p>
+            <w:pPr>
+              <w:spacing w:after="0"/>
+            </w:pPr>
+            <w:r>
+              <w:rPr>
+                <w:rFonts w:ascii="Consolas" w:cs="Consolas" w:eastAsia="Consolas" w:hAnsi="Consolas"/>
+                <w:sz w:val="18"/>
+                <w:szCs w:val="18"/>
+              </w:rPr>
+              <w:t xml:space="preserve">EPOS.Kern.Tests/FernwartungFreigabeTests.cs</w:t>
+            </w:r>
+            <w:r>
+              <w:rPr>
+                <w:sz w:val="19"/>
+                <w:szCs w:val="19"/>
+              </w:rPr>
+              <w:t xml:space="preserve">, </w:t>
+            </w:r>
+            <w:r>
+              <w:rPr>
+                <w:rFonts w:ascii="Consolas" w:cs="Consolas" w:eastAsia="Consolas" w:hAnsi="Consolas"/>
+                <w:sz w:val="18"/>
+                <w:szCs w:val="18"/>
+              </w:rPr>
+              <w:t xml:space="preserve">EPOS.UI.Tests/Dialoge/FernwartungDialogTests.cs</w:t>
+            </w:r>
+            <w:r>
+              <w:rPr>
+                <w:sz w:val="19"/>
+                <w:szCs w:val="19"/>
+              </w:rPr>
+              <w:t xml:space="preserve">, </w:t>
+            </w:r>
+            <w:r>
+              <w:rPr>
+                <w:rFonts w:ascii="Consolas" w:cs="Consolas" w:eastAsia="Consolas" w:hAnsi="Consolas"/>
+                <w:sz w:val="18"/>
+                <w:szCs w:val="18"/>
+              </w:rPr>
+              <w:t xml:space="preserve">MenuebandTests</w:t>
+            </w:r>
+          </w:p>
+        </w:tc>
+        <w:tc>
+          <w:tcPr>
+            <w:tcW w:type="dxa" w:w="956"/>
             <w:tcBorders>
               <w:top w:val="single" w:color="A6A6A6" w:sz="4"/>
               <w:left w:val="single" w:color="A6A6A6" w:sz="4"/>
@@ -9984,194 +9890,89 @@
         </w:trPr>
         <w:tc>
           <w:tcPr>
-            <w:tcW w:type="dxa" w:w="3636"/>
-            <w:tcBorders>
-              <w:top w:val="single" w:color="A6A6A6" w:sz="4"/>
-              <w:left w:val="single" w:color="A6A6A6" w:sz="4"/>
-              <w:bottom w:val="single" w:color="A6A6A6" w:sz="4"/>
-              <w:right w:val="single" w:color="A6A6A6" w:sz="4"/>
-            </w:tcBorders>
-            <w:tcMar>
-              <w:top w:type="dxa" w:w="50"/>
-              <w:left w:type="dxa" w:w="90"/>
-              <w:bottom w:type="dxa" w:w="50"/>
-              <w:right w:type="dxa" w:w="90"/>
-            </w:tcMar>
-          </w:tcPr>
-          <w:p>
-            <w:pPr>
-              <w:spacing w:after="0"/>
-            </w:pPr>
-            <w:r>
-              <w:rPr>
-                <w:sz w:val="19"/>
-                <w:szCs w:val="19"/>
-              </w:rPr>
-              <w:t xml:space="preserve">Über-Dialog</w:t>
-            </w:r>
-          </w:p>
-        </w:tc>
-        <w:tc>
-          <w:tcPr>
-            <w:tcW w:type="dxa" w:w="5455"/>
-            <w:tcBorders>
-              <w:top w:val="single" w:color="A6A6A6" w:sz="4"/>
-              <w:left w:val="single" w:color="A6A6A6" w:sz="4"/>
-              <w:bottom w:val="single" w:color="A6A6A6" w:sz="4"/>
-              <w:right w:val="single" w:color="A6A6A6" w:sz="4"/>
-            </w:tcBorders>
-            <w:tcMar>
-              <w:top w:type="dxa" w:w="50"/>
-              <w:left w:type="dxa" w:w="90"/>
-              <w:bottom w:type="dxa" w:w="50"/>
-              <w:right w:type="dxa" w:w="90"/>
-            </w:tcMar>
-          </w:tcPr>
-          <w:p>
-            <w:pPr>
-              <w:spacing w:after="0"/>
-            </w:pPr>
-            <w:r>
-              <w:rPr>
-                <w:rFonts w:ascii="Consolas" w:cs="Consolas" w:eastAsia="Consolas" w:hAnsi="Consolas"/>
-                <w:sz w:val="18"/>
-                <w:szCs w:val="18"/>
-              </w:rPr>
-              <w:t xml:space="preserve">EPOS.UI/Dialoge/Hilfe/UeberDialog.razor</w:t>
-            </w:r>
-            <w:r>
-              <w:rPr>
-                <w:sz w:val="19"/>
-                <w:szCs w:val="19"/>
-              </w:rPr>
-              <w:t xml:space="preserve">, </w:t>
-            </w:r>
-            <w:r>
-              <w:rPr>
-                <w:rFonts w:ascii="Consolas" w:cs="Consolas" w:eastAsia="Consolas" w:hAnsi="Consolas"/>
-                <w:sz w:val="18"/>
-                <w:szCs w:val="18"/>
-              </w:rPr>
-              <w:t xml:space="preserve">UeberDaten.cs</w:t>
-            </w:r>
-            <w:r>
-              <w:rPr>
-                <w:sz w:val="19"/>
-                <w:szCs w:val="19"/>
-              </w:rPr>
-              <w:t xml:space="preserve"> (mit </w:t>
-            </w:r>
-            <w:r>
-              <w:rPr>
-                <w:rFonts w:ascii="Consolas" w:cs="Consolas" w:eastAsia="Consolas" w:hAnsi="Consolas"/>
-                <w:sz w:val="18"/>
-                <w:szCs w:val="18"/>
-              </w:rPr>
-              <w:t xml:space="preserve">UeberAnstoss</w:t>
-            </w:r>
-            <w:r>
-              <w:rPr>
-                <w:sz w:val="19"/>
-                <w:szCs w:val="19"/>
-              </w:rPr>
-              <w:t xml:space="preserve">, </w:t>
-            </w:r>
-            <w:r>
-              <w:rPr>
-                <w:rFonts w:ascii="Consolas" w:cs="Consolas" w:eastAsia="Consolas" w:hAnsi="Consolas"/>
-                <w:sz w:val="18"/>
-                <w:szCs w:val="18"/>
-              </w:rPr>
-              <w:t xml:space="preserve">UeberTexte</w:t>
-            </w:r>
-            <w:r>
-              <w:rPr>
-                <w:sz w:val="19"/>
-                <w:szCs w:val="19"/>
-              </w:rPr>
-              <w:t xml:space="preserve">), Hülle </w:t>
-            </w:r>
-            <w:r>
-              <w:rPr>
-                <w:rFonts w:ascii="Consolas" w:cs="Consolas" w:eastAsia="Consolas" w:hAnsi="Consolas"/>
-                <w:sz w:val="18"/>
-                <w:szCs w:val="18"/>
-              </w:rPr>
-              <w:t xml:space="preserve">EPOS.UI.Daten/Hilfe/UeberHuelle.cs</w:t>
-            </w:r>
-            <w:r>
-              <w:rPr>
-                <w:sz w:val="19"/>
-                <w:szCs w:val="19"/>
-              </w:rPr>
-              <w:t xml:space="preserve">, Fenster </w:t>
-            </w:r>
-            <w:r>
-              <w:rPr>
-                <w:rFonts w:ascii="Consolas" w:cs="Consolas" w:eastAsia="Consolas" w:hAnsi="Consolas"/>
-                <w:sz w:val="18"/>
-                <w:szCs w:val="18"/>
-              </w:rPr>
-              <w:t xml:space="preserve">WindowsFormsApplication1/Views/Help/UeberFenster.cs</w:t>
-            </w:r>
-            <w:r>
-              <w:rPr>
-                <w:sz w:val="19"/>
-                <w:szCs w:val="19"/>
-              </w:rPr>
-              <w:t xml:space="preserve">, Fall </w:t>
-            </w:r>
-            <w:r>
-              <w:rPr>
-                <w:rFonts w:ascii="Consolas" w:cs="Consolas" w:eastAsia="Consolas" w:hAnsi="Consolas"/>
-                <w:sz w:val="18"/>
-                <w:szCs w:val="18"/>
-              </w:rPr>
-              <w:t xml:space="preserve">Version</w:t>
-            </w:r>
-            <w:r>
-              <w:rPr>
-                <w:sz w:val="19"/>
-                <w:szCs w:val="19"/>
-              </w:rPr>
-              <w:t xml:space="preserve"> in </w:t>
-            </w:r>
-            <w:r>
-              <w:rPr>
-                <w:rFonts w:ascii="Consolas" w:cs="Consolas" w:eastAsia="Consolas" w:hAnsi="Consolas"/>
-                <w:sz w:val="18"/>
-                <w:szCs w:val="18"/>
-              </w:rPr>
-              <w:t xml:space="preserve">HauptfensterHuelle.cs</w:t>
-            </w:r>
-          </w:p>
-        </w:tc>
-        <w:tc>
-          <w:tcPr>
-            <w:tcW w:type="dxa" w:w="547"/>
-            <w:tcBorders>
-              <w:top w:val="single" w:color="A6A6A6" w:sz="4"/>
-              <w:left w:val="single" w:color="A6A6A6" w:sz="4"/>
-              <w:bottom w:val="single" w:color="A6A6A6" w:sz="4"/>
-              <w:right w:val="single" w:color="A6A6A6" w:sz="4"/>
-            </w:tcBorders>
-            <w:tcMar>
-              <w:top w:type="dxa" w:w="50"/>
-              <w:left w:type="dxa" w:w="90"/>
-              <w:bottom w:type="dxa" w:w="50"/>
-              <w:right w:type="dxa" w:w="90"/>
-            </w:tcMar>
-          </w:tcPr>
-          <w:p>
-            <w:pPr>
-              <w:spacing w:after="0"/>
-            </w:pPr>
-            <w:r>
-              <w:rPr>
-                <w:sz w:val="19"/>
-                <w:szCs w:val="19"/>
-              </w:rPr>
-              <w:t xml:space="preserve">heute</w:t>
+            <w:tcW w:type="dxa" w:w="3473"/>
+            <w:tcBorders>
+              <w:top w:val="single" w:color="A6A6A6" w:sz="4"/>
+              <w:left w:val="single" w:color="A6A6A6" w:sz="4"/>
+              <w:bottom w:val="single" w:color="A6A6A6" w:sz="4"/>
+              <w:right w:val="single" w:color="A6A6A6" w:sz="4"/>
+            </w:tcBorders>
+            <w:tcMar>
+              <w:top w:type="dxa" w:w="50"/>
+              <w:left w:type="dxa" w:w="90"/>
+              <w:bottom w:type="dxa" w:w="50"/>
+              <w:right w:type="dxa" w:w="90"/>
+            </w:tcMar>
+          </w:tcPr>
+          <w:p>
+            <w:pPr>
+              <w:spacing w:after="0"/>
+            </w:pPr>
+            <w:r>
+              <w:rPr>
+                <w:sz w:val="19"/>
+                <w:szCs w:val="19"/>
+              </w:rPr>
+              <w:t xml:space="preserve">Wiki-Quelle</w:t>
+            </w:r>
+          </w:p>
+        </w:tc>
+        <w:tc>
+          <w:tcPr>
+            <w:tcW w:type="dxa" w:w="5209"/>
+            <w:tcBorders>
+              <w:top w:val="single" w:color="A6A6A6" w:sz="4"/>
+              <w:left w:val="single" w:color="A6A6A6" w:sz="4"/>
+              <w:bottom w:val="single" w:color="A6A6A6" w:sz="4"/>
+              <w:right w:val="single" w:color="A6A6A6" w:sz="4"/>
+            </w:tcBorders>
+            <w:tcMar>
+              <w:top w:type="dxa" w:w="50"/>
+              <w:left w:type="dxa" w:w="90"/>
+              <w:bottom w:type="dxa" w:w="50"/>
+              <w:right w:type="dxa" w:w="90"/>
+            </w:tcMar>
+          </w:tcPr>
+          <w:p>
+            <w:pPr>
+              <w:spacing w:after="0"/>
+            </w:pPr>
+            <w:r>
+              <w:rPr>
+                <w:rFonts w:ascii="Consolas" w:cs="Consolas" w:eastAsia="Consolas" w:hAnsi="Consolas"/>
+                <w:sz w:val="18"/>
+                <w:szCs w:val="18"/>
+              </w:rPr>
+              <w:t xml:space="preserve">Projekte/Wiki/Programm Dokumentation - Fernwartung.wiki</w:t>
+            </w:r>
+          </w:p>
+        </w:tc>
+        <w:tc>
+          <w:tcPr>
+            <w:tcW w:type="dxa" w:w="956"/>
+            <w:tcBorders>
+              <w:top w:val="single" w:color="A6A6A6" w:sz="4"/>
+              <w:left w:val="single" w:color="A6A6A6" w:sz="4"/>
+              <w:bottom w:val="single" w:color="A6A6A6" w:sz="4"/>
+              <w:right w:val="single" w:color="A6A6A6" w:sz="4"/>
+            </w:tcBorders>
+            <w:tcMar>
+              <w:top w:type="dxa" w:w="50"/>
+              <w:left w:type="dxa" w:w="90"/>
+              <w:bottom w:type="dxa" w:w="50"/>
+              <w:right w:type="dxa" w:w="90"/>
+            </w:tcMar>
+          </w:tcPr>
+          <w:p>
+            <w:pPr>
+              <w:spacing w:after="0"/>
+            </w:pPr>
+            <w:r>
+              <w:rPr>
+                <w:sz w:val="19"/>
+                <w:szCs w:val="19"/>
+              </w:rPr>
+              <w:t xml:space="preserve">2</w:t>
             </w:r>
           </w:p>
         </w:tc>
@@ -10183,118 +9984,171 @@
         </w:trPr>
         <w:tc>
           <w:tcPr>
-            <w:tcW w:type="dxa" w:w="3636"/>
-            <w:tcBorders>
-              <w:top w:val="single" w:color="A6A6A6" w:sz="4"/>
-              <w:left w:val="single" w:color="A6A6A6" w:sz="4"/>
-              <w:bottom w:val="single" w:color="A6A6A6" w:sz="4"/>
-              <w:right w:val="single" w:color="A6A6A6" w:sz="4"/>
-            </w:tcBorders>
-            <w:tcMar>
-              <w:top w:type="dxa" w:w="50"/>
-              <w:left w:type="dxa" w:w="90"/>
-              <w:bottom w:type="dxa" w:w="50"/>
-              <w:right w:type="dxa" w:w="90"/>
-            </w:tcMar>
-          </w:tcPr>
-          <w:p>
-            <w:pPr>
-              <w:spacing w:after="0"/>
-            </w:pPr>
-            <w:r>
-              <w:rPr>
-                <w:sz w:val="19"/>
-                <w:szCs w:val="19"/>
-              </w:rPr>
-              <w:t xml:space="preserve">Geste des Entwicklermodus</w:t>
-            </w:r>
-          </w:p>
-        </w:tc>
-        <w:tc>
-          <w:tcPr>
-            <w:tcW w:type="dxa" w:w="5455"/>
-            <w:tcBorders>
-              <w:top w:val="single" w:color="A6A6A6" w:sz="4"/>
-              <w:left w:val="single" w:color="A6A6A6" w:sz="4"/>
-              <w:bottom w:val="single" w:color="A6A6A6" w:sz="4"/>
-              <w:right w:val="single" w:color="A6A6A6" w:sz="4"/>
-            </w:tcBorders>
-            <w:tcMar>
-              <w:top w:type="dxa" w:w="50"/>
-              <w:left w:type="dxa" w:w="90"/>
-              <w:bottom w:type="dxa" w:w="50"/>
-              <w:right w:type="dxa" w:w="90"/>
-            </w:tcMar>
-          </w:tcPr>
-          <w:p>
-            <w:pPr>
-              <w:spacing w:after="0"/>
-            </w:pPr>
-            <w:r>
-              <w:rPr>
-                <w:rFonts w:ascii="Consolas" w:cs="Consolas" w:eastAsia="Consolas" w:hAnsi="Consolas"/>
-                <w:sz w:val="18"/>
-                <w:szCs w:val="18"/>
-              </w:rPr>
-              <w:t xml:space="preserve">UeberFenster</w:t>
-            </w:r>
-            <w:r>
-              <w:rPr>
-                <w:sz w:val="19"/>
-                <w:szCs w:val="19"/>
-              </w:rPr>
-              <w:t xml:space="preserve"> (Abfang über </w:t>
-            </w:r>
-            <w:r>
-              <w:rPr>
-                <w:rFonts w:ascii="Consolas" w:cs="Consolas" w:eastAsia="Consolas" w:hAnsi="Consolas"/>
-                <w:sz w:val="18"/>
-                <w:szCs w:val="18"/>
-              </w:rPr>
-              <w:t xml:space="preserve">BlazorDialogForm.Befehlstaste</w:t>
-            </w:r>
-            <w:r>
-              <w:rPr>
-                <w:sz w:val="19"/>
-                <w:szCs w:val="19"/>
-              </w:rPr>
-              <w:t xml:space="preserve">), </w:t>
-            </w:r>
-            <w:r>
-              <w:rPr>
-                <w:rFonts w:ascii="Consolas" w:cs="Consolas" w:eastAsia="Consolas" w:hAnsi="Consolas"/>
-                <w:sz w:val="18"/>
-                <w:szCs w:val="18"/>
-              </w:rPr>
-              <w:t xml:space="preserve">WindowsFormsApplication1/Views/Entwicklung/EntwicklungHuelle.cs</w:t>
-            </w:r>
-            <w:r>
-              <w:rPr>
-                <w:sz w:val="19"/>
-                <w:szCs w:val="19"/>
-              </w:rPr>
-              <w:t xml:space="preserve"> (</w:t>
-            </w:r>
-            <w:r>
-              <w:rPr>
-                <w:rFonts w:ascii="Consolas" w:cs="Consolas" w:eastAsia="Consolas" w:hAnsi="Consolas"/>
-                <w:sz w:val="18"/>
-                <w:szCs w:val="18"/>
-              </w:rPr>
-              <w:t xml:space="preserve">GesteUmschalten</w:t>
-            </w:r>
-            <w:r>
-              <w:rPr>
-                <w:sz w:val="19"/>
-                <w:szCs w:val="19"/>
-              </w:rPr>
-              <w:t xml:space="preserve">)</w:t>
-            </w:r>
-          </w:p>
-        </w:tc>
-        <w:tc>
-          <w:tcPr>
-            <w:tcW w:type="dxa" w:w="547"/>
+            <w:tcW w:type="dxa" w:w="3473"/>
+            <w:tcBorders>
+              <w:top w:val="single" w:color="A6A6A6" w:sz="4"/>
+              <w:left w:val="single" w:color="A6A6A6" w:sz="4"/>
+              <w:bottom w:val="single" w:color="A6A6A6" w:sz="4"/>
+              <w:right w:val="single" w:color="A6A6A6" w:sz="4"/>
+            </w:tcBorders>
+            <w:tcMar>
+              <w:top w:type="dxa" w:w="50"/>
+              <w:left w:type="dxa" w:w="90"/>
+              <w:bottom w:type="dxa" w:w="50"/>
+              <w:right w:type="dxa" w:w="90"/>
+            </w:tcMar>
+          </w:tcPr>
+          <w:p>
+            <w:pPr>
+              <w:spacing w:after="0"/>
+            </w:pPr>
+            <w:r>
+              <w:rPr>
+                <w:sz w:val="19"/>
+                <w:szCs w:val="19"/>
+              </w:rPr>
+              <w:t xml:space="preserve">Über-Dialog</w:t>
+            </w:r>
+          </w:p>
+        </w:tc>
+        <w:tc>
+          <w:tcPr>
+            <w:tcW w:type="dxa" w:w="5209"/>
+            <w:tcBorders>
+              <w:top w:val="single" w:color="A6A6A6" w:sz="4"/>
+              <w:left w:val="single" w:color="A6A6A6" w:sz="4"/>
+              <w:bottom w:val="single" w:color="A6A6A6" w:sz="4"/>
+              <w:right w:val="single" w:color="A6A6A6" w:sz="4"/>
+            </w:tcBorders>
+            <w:tcMar>
+              <w:top w:type="dxa" w:w="50"/>
+              <w:left w:type="dxa" w:w="90"/>
+              <w:bottom w:type="dxa" w:w="50"/>
+              <w:right w:type="dxa" w:w="90"/>
+            </w:tcMar>
+          </w:tcPr>
+          <w:p>
+            <w:pPr>
+              <w:spacing w:after="0"/>
+            </w:pPr>
+            <w:r>
+              <w:rPr>
+                <w:rFonts w:ascii="Consolas" w:cs="Consolas" w:eastAsia="Consolas" w:hAnsi="Consolas"/>
+                <w:sz w:val="18"/>
+                <w:szCs w:val="18"/>
+              </w:rPr>
+              <w:t xml:space="preserve">EPOS.UI/Dialoge/Hilfe/UeberDialog.razor</w:t>
+            </w:r>
+            <w:r>
+              <w:rPr>
+                <w:sz w:val="19"/>
+                <w:szCs w:val="19"/>
+              </w:rPr>
+              <w:t xml:space="preserve">, </w:t>
+            </w:r>
+            <w:r>
+              <w:rPr>
+                <w:rFonts w:ascii="Consolas" w:cs="Consolas" w:eastAsia="Consolas" w:hAnsi="Consolas"/>
+                <w:sz w:val="18"/>
+                <w:szCs w:val="18"/>
+              </w:rPr>
+              <w:t xml:space="preserve">UeberDaten.cs</w:t>
+            </w:r>
+            <w:r>
+              <w:rPr>
+                <w:sz w:val="19"/>
+                <w:szCs w:val="19"/>
+              </w:rPr>
+              <w:t xml:space="preserve"> (mit </w:t>
+            </w:r>
+            <w:r>
+              <w:rPr>
+                <w:rFonts w:ascii="Consolas" w:cs="Consolas" w:eastAsia="Consolas" w:hAnsi="Consolas"/>
+                <w:sz w:val="18"/>
+                <w:szCs w:val="18"/>
+              </w:rPr>
+              <w:t xml:space="preserve">UeberAnstoss</w:t>
+            </w:r>
+            <w:r>
+              <w:rPr>
+                <w:sz w:val="19"/>
+                <w:szCs w:val="19"/>
+              </w:rPr>
+              <w:t xml:space="preserve">, </w:t>
+            </w:r>
+            <w:r>
+              <w:rPr>
+                <w:rFonts w:ascii="Consolas" w:cs="Consolas" w:eastAsia="Consolas" w:hAnsi="Consolas"/>
+                <w:sz w:val="18"/>
+                <w:szCs w:val="18"/>
+              </w:rPr>
+              <w:t xml:space="preserve">UeberTexte</w:t>
+            </w:r>
+            <w:r>
+              <w:rPr>
+                <w:sz w:val="19"/>
+                <w:szCs w:val="19"/>
+              </w:rPr>
+              <w:t xml:space="preserve">), Hülle </w:t>
+            </w:r>
+            <w:r>
+              <w:rPr>
+                <w:rFonts w:ascii="Consolas" w:cs="Consolas" w:eastAsia="Consolas" w:hAnsi="Consolas"/>
+                <w:sz w:val="18"/>
+                <w:szCs w:val="18"/>
+              </w:rPr>
+              <w:t xml:space="preserve">EPOS.UI.Daten/Hilfe/UeberHuelle.cs</w:t>
+            </w:r>
+            <w:r>
+              <w:rPr>
+                <w:sz w:val="19"/>
+                <w:szCs w:val="19"/>
+              </w:rPr>
+              <w:t xml:space="preserve">, Fenster </w:t>
+            </w:r>
+            <w:r>
+              <w:rPr>
+                <w:rFonts w:ascii="Consolas" w:cs="Consolas" w:eastAsia="Consolas" w:hAnsi="Consolas"/>
+                <w:sz w:val="18"/>
+                <w:szCs w:val="18"/>
+              </w:rPr>
+              <w:t xml:space="preserve">WindowsFormsApplication1/Views/Help/UeberFenster.cs</w:t>
+            </w:r>
+            <w:r>
+              <w:rPr>
+                <w:sz w:val="19"/>
+                <w:szCs w:val="19"/>
+              </w:rPr>
+              <w:t xml:space="preserve">, Fall </w:t>
+            </w:r>
+            <w:r>
+              <w:rPr>
+                <w:rFonts w:ascii="Consolas" w:cs="Consolas" w:eastAsia="Consolas" w:hAnsi="Consolas"/>
+                <w:sz w:val="18"/>
+                <w:szCs w:val="18"/>
+              </w:rPr>
+              <w:t xml:space="preserve">Version</w:t>
+            </w:r>
+            <w:r>
+              <w:rPr>
+                <w:sz w:val="19"/>
+                <w:szCs w:val="19"/>
+              </w:rPr>
+              <w:t xml:space="preserve"> in </w:t>
+            </w:r>
+            <w:r>
+              <w:rPr>
+                <w:rFonts w:ascii="Consolas" w:cs="Consolas" w:eastAsia="Consolas" w:hAnsi="Consolas"/>
+                <w:sz w:val="18"/>
+                <w:szCs w:val="18"/>
+              </w:rPr>
+              <w:t xml:space="preserve">HauptfensterHuelle.cs</w:t>
+            </w:r>
+          </w:p>
+        </w:tc>
+        <w:tc>
+          <w:tcPr>
+            <w:tcW w:type="dxa" w:w="956"/>
             <w:tcBorders>
               <w:top w:val="single" w:color="A6A6A6" w:sz="4"/>
               <w:left w:val="single" w:color="A6A6A6" w:sz="4"/>
@@ -10329,60 +10183,105 @@
         </w:trPr>
         <w:tc>
           <w:tcPr>
-            <w:tcW w:type="dxa" w:w="3636"/>
-            <w:tcBorders>
-              <w:top w:val="single" w:color="A6A6A6" w:sz="4"/>
-              <w:left w:val="single" w:color="A6A6A6" w:sz="4"/>
-              <w:bottom w:val="single" w:color="A6A6A6" w:sz="4"/>
-              <w:right w:val="single" w:color="A6A6A6" w:sz="4"/>
-            </w:tcBorders>
-            <w:tcMar>
-              <w:top w:type="dxa" w:w="50"/>
-              <w:left w:type="dxa" w:w="90"/>
-              <w:bottom w:type="dxa" w:w="50"/>
-              <w:right w:type="dxa" w:w="90"/>
-            </w:tcMar>
-          </w:tcPr>
-          <w:p>
-            <w:pPr>
-              <w:spacing w:after="0"/>
-            </w:pPr>
-            <w:r>
-              <w:rPr>
-                <w:sz w:val="19"/>
-                <w:szCs w:val="19"/>
-              </w:rPr>
-              <w:t xml:space="preserve">Diagnosedaten</w:t>
-            </w:r>
-          </w:p>
-        </w:tc>
-        <w:tc>
-          <w:tcPr>
-            <w:tcW w:type="dxa" w:w="5455"/>
-            <w:tcBorders>
-              <w:top w:val="single" w:color="A6A6A6" w:sz="4"/>
-              <w:left w:val="single" w:color="A6A6A6" w:sz="4"/>
-              <w:bottom w:val="single" w:color="A6A6A6" w:sz="4"/>
-              <w:right w:val="single" w:color="A6A6A6" w:sz="4"/>
-            </w:tcBorders>
-            <w:tcMar>
-              <w:top w:type="dxa" w:w="50"/>
-              <w:left w:type="dxa" w:w="90"/>
-              <w:bottom w:type="dxa" w:w="50"/>
-              <w:right w:type="dxa" w:w="90"/>
-            </w:tcMar>
-          </w:tcPr>
-          <w:p>
-            <w:pPr>
-              <w:spacing w:after="0"/>
-            </w:pPr>
-            <w:r>
-              <w:rPr>
-                <w:rFonts w:ascii="Consolas" w:cs="Consolas" w:eastAsia="Consolas" w:hAnsi="Consolas"/>
-                <w:sz w:val="18"/>
-                <w:szCs w:val="18"/>
-              </w:rPr>
-              <w:t xml:space="preserve">EPOS.Kern/Allgemein/Diagnose/Diagnosedaten.cs</w:t>
+            <w:tcW w:type="dxa" w:w="3473"/>
+            <w:tcBorders>
+              <w:top w:val="single" w:color="A6A6A6" w:sz="4"/>
+              <w:left w:val="single" w:color="A6A6A6" w:sz="4"/>
+              <w:bottom w:val="single" w:color="A6A6A6" w:sz="4"/>
+              <w:right w:val="single" w:color="A6A6A6" w:sz="4"/>
+            </w:tcBorders>
+            <w:tcMar>
+              <w:top w:type="dxa" w:w="50"/>
+              <w:left w:type="dxa" w:w="90"/>
+              <w:bottom w:type="dxa" w:w="50"/>
+              <w:right w:type="dxa" w:w="90"/>
+            </w:tcMar>
+          </w:tcPr>
+          <w:p>
+            <w:pPr>
+              <w:spacing w:after="0"/>
+            </w:pPr>
+            <w:r>
+              <w:rPr>
+                <w:sz w:val="19"/>
+                <w:szCs w:val="19"/>
+              </w:rPr>
+              <w:t xml:space="preserve">Geste des Entwicklermodus</w:t>
+            </w:r>
+          </w:p>
+        </w:tc>
+        <w:tc>
+          <w:tcPr>
+            <w:tcW w:type="dxa" w:w="5209"/>
+            <w:tcBorders>
+              <w:top w:val="single" w:color="A6A6A6" w:sz="4"/>
+              <w:left w:val="single" w:color="A6A6A6" w:sz="4"/>
+              <w:bottom w:val="single" w:color="A6A6A6" w:sz="4"/>
+              <w:right w:val="single" w:color="A6A6A6" w:sz="4"/>
+            </w:tcBorders>
+            <w:tcMar>
+              <w:top w:type="dxa" w:w="50"/>
+              <w:left w:type="dxa" w:w="90"/>
+              <w:bottom w:type="dxa" w:w="50"/>
+              <w:right w:type="dxa" w:w="90"/>
+            </w:tcMar>
+          </w:tcPr>
+          <w:p>
+            <w:pPr>
+              <w:spacing w:after="0"/>
+            </w:pPr>
+            <w:r>
+              <w:rPr>
+                <w:rFonts w:ascii="Consolas" w:cs="Consolas" w:eastAsia="Consolas" w:hAnsi="Consolas"/>
+                <w:sz w:val="18"/>
+                <w:szCs w:val="18"/>
+              </w:rPr>
+              <w:t xml:space="preserve">UeberDialog</w:t>
+            </w:r>
+            <w:r>
+              <w:rPr>
+                <w:sz w:val="19"/>
+                <w:szCs w:val="19"/>
+              </w:rPr>
+              <w:t xml:space="preserve"> (erkennt Strg+Umschalt+F12 selbst) und </w:t>
+            </w:r>
+            <w:r>
+              <w:rPr>
+                <w:rFonts w:ascii="Consolas" w:cs="Consolas" w:eastAsia="Consolas" w:hAnsi="Consolas"/>
+                <w:sz w:val="18"/>
+                <w:szCs w:val="18"/>
+              </w:rPr>
+              <w:t xml:space="preserve">UeberFenster</w:t>
+            </w:r>
+            <w:r>
+              <w:rPr>
+                <w:sz w:val="19"/>
+                <w:szCs w:val="19"/>
+              </w:rPr>
+              <w:t xml:space="preserve"> (fängt dieselbe Folge über </w:t>
+            </w:r>
+            <w:r>
+              <w:rPr>
+                <w:rFonts w:ascii="Consolas" w:cs="Consolas" w:eastAsia="Consolas" w:hAnsi="Consolas"/>
+                <w:sz w:val="18"/>
+                <w:szCs w:val="18"/>
+              </w:rPr>
+              <w:t xml:space="preserve">BlazorDialogForm.Befehlstaste</w:t>
+            </w:r>
+            <w:r>
+              <w:rPr>
+                <w:sz w:val="19"/>
+                <w:szCs w:val="19"/>
+              </w:rPr>
+              <w:t xml:space="preserve"> zusätzlich ab), </w:t>
+            </w:r>
+            <w:r>
+              <w:rPr>
+                <w:rFonts w:ascii="Consolas" w:cs="Consolas" w:eastAsia="Consolas" w:hAnsi="Consolas"/>
+                <w:sz w:val="18"/>
+                <w:szCs w:val="18"/>
+              </w:rPr>
+              <w:t xml:space="preserve">WindowsFormsApplication1/Views/Entwicklung/EntwicklungHuelle.cs</w:t>
             </w:r>
             <w:r>
               <w:rPr>
@@ -10397,22 +10296,7 @@
                 <w:sz w:val="18"/>
                 <w:szCs w:val="18"/>
               </w:rPr>
-              <w:t xml:space="preserve">Textblock</w:t>
-            </w:r>
-            <w:r>
-              <w:rPr>
-                <w:sz w:val="19"/>
-                <w:szCs w:val="19"/>
-              </w:rPr>
-              <w:t xml:space="preserve">, </w:t>
-            </w:r>
-            <w:r>
-              <w:rPr>
-                <w:rFonts w:ascii="Consolas" w:cs="Consolas" w:eastAsia="Consolas" w:hAnsi="Consolas"/>
-                <w:sz w:val="18"/>
-                <w:szCs w:val="18"/>
-              </w:rPr>
-              <w:t xml:space="preserve">ProtokollordnerPfad</w:t>
+              <w:t xml:space="preserve">GesteUmschalten</w:t>
             </w:r>
             <w:r>
               <w:rPr>
@@ -10425,7 +10309,7 @@
         </w:tc>
         <w:tc>
           <w:tcPr>
-            <w:tcW w:type="dxa" w:w="547"/>
+            <w:tcW w:type="dxa" w:w="956"/>
             <w:tcBorders>
               <w:top w:val="single" w:color="A6A6A6" w:sz="4"/>
               <w:left w:val="single" w:color="A6A6A6" w:sz="4"/>
@@ -10460,60 +10344,75 @@
         </w:trPr>
         <w:tc>
           <w:tcPr>
-            <w:tcW w:type="dxa" w:w="3636"/>
-            <w:tcBorders>
-              <w:top w:val="single" w:color="A6A6A6" w:sz="4"/>
-              <w:left w:val="single" w:color="A6A6A6" w:sz="4"/>
-              <w:bottom w:val="single" w:color="A6A6A6" w:sz="4"/>
-              <w:right w:val="single" w:color="A6A6A6" w:sz="4"/>
-            </w:tcBorders>
-            <w:tcMar>
-              <w:top w:type="dxa" w:w="50"/>
-              <w:left w:type="dxa" w:w="90"/>
-              <w:bottom w:type="dxa" w:w="50"/>
-              <w:right w:type="dxa" w:w="90"/>
-            </w:tcMar>
-          </w:tcPr>
-          <w:p>
-            <w:pPr>
-              <w:spacing w:after="0"/>
-            </w:pPr>
-            <w:r>
-              <w:rPr>
-                <w:sz w:val="19"/>
-                <w:szCs w:val="19"/>
-              </w:rPr>
-              <w:t xml:space="preserve">Tests des Über-Dialogs</w:t>
-            </w:r>
-          </w:p>
-        </w:tc>
-        <w:tc>
-          <w:tcPr>
-            <w:tcW w:type="dxa" w:w="5455"/>
-            <w:tcBorders>
-              <w:top w:val="single" w:color="A6A6A6" w:sz="4"/>
-              <w:left w:val="single" w:color="A6A6A6" w:sz="4"/>
-              <w:bottom w:val="single" w:color="A6A6A6" w:sz="4"/>
-              <w:right w:val="single" w:color="A6A6A6" w:sz="4"/>
-            </w:tcBorders>
-            <w:tcMar>
-              <w:top w:type="dxa" w:w="50"/>
-              <w:left w:type="dxa" w:w="90"/>
-              <w:bottom w:type="dxa" w:w="50"/>
-              <w:right w:type="dxa" w:w="90"/>
-            </w:tcMar>
-          </w:tcPr>
-          <w:p>
-            <w:pPr>
-              <w:spacing w:after="0"/>
-            </w:pPr>
-            <w:r>
-              <w:rPr>
-                <w:rFonts w:ascii="Consolas" w:cs="Consolas" w:eastAsia="Consolas" w:hAnsi="Consolas"/>
-                <w:sz w:val="18"/>
-                <w:szCs w:val="18"/>
-              </w:rPr>
-              <w:t xml:space="preserve">EPOS.UI.Tests/Dialoge/UeberDialogTests.cs</w:t>
+            <w:tcW w:type="dxa" w:w="3473"/>
+            <w:tcBorders>
+              <w:top w:val="single" w:color="A6A6A6" w:sz="4"/>
+              <w:left w:val="single" w:color="A6A6A6" w:sz="4"/>
+              <w:bottom w:val="single" w:color="A6A6A6" w:sz="4"/>
+              <w:right w:val="single" w:color="A6A6A6" w:sz="4"/>
+            </w:tcBorders>
+            <w:tcMar>
+              <w:top w:type="dxa" w:w="50"/>
+              <w:left w:type="dxa" w:w="90"/>
+              <w:bottom w:type="dxa" w:w="50"/>
+              <w:right w:type="dxa" w:w="90"/>
+            </w:tcMar>
+          </w:tcPr>
+          <w:p>
+            <w:pPr>
+              <w:spacing w:after="0"/>
+            </w:pPr>
+            <w:r>
+              <w:rPr>
+                <w:sz w:val="19"/>
+                <w:szCs w:val="19"/>
+              </w:rPr>
+              <w:t xml:space="preserve">Diagnosedaten</w:t>
+            </w:r>
+          </w:p>
+        </w:tc>
+        <w:tc>
+          <w:tcPr>
+            <w:tcW w:type="dxa" w:w="5209"/>
+            <w:tcBorders>
+              <w:top w:val="single" w:color="A6A6A6" w:sz="4"/>
+              <w:left w:val="single" w:color="A6A6A6" w:sz="4"/>
+              <w:bottom w:val="single" w:color="A6A6A6" w:sz="4"/>
+              <w:right w:val="single" w:color="A6A6A6" w:sz="4"/>
+            </w:tcBorders>
+            <w:tcMar>
+              <w:top w:type="dxa" w:w="50"/>
+              <w:left w:type="dxa" w:w="90"/>
+              <w:bottom w:type="dxa" w:w="50"/>
+              <w:right w:type="dxa" w:w="90"/>
+            </w:tcMar>
+          </w:tcPr>
+          <w:p>
+            <w:pPr>
+              <w:spacing w:after="0"/>
+            </w:pPr>
+            <w:r>
+              <w:rPr>
+                <w:rFonts w:ascii="Consolas" w:cs="Consolas" w:eastAsia="Consolas" w:hAnsi="Consolas"/>
+                <w:sz w:val="18"/>
+                <w:szCs w:val="18"/>
+              </w:rPr>
+              <w:t xml:space="preserve">EPOS.Kern/Allgemein/Diagnose/Diagnosedaten.cs</w:t>
+            </w:r>
+            <w:r>
+              <w:rPr>
+                <w:sz w:val="19"/>
+                <w:szCs w:val="19"/>
+              </w:rPr>
+              <w:t xml:space="preserve"> (</w:t>
+            </w:r>
+            <w:r>
+              <w:rPr>
+                <w:rFonts w:ascii="Consolas" w:cs="Consolas" w:eastAsia="Consolas" w:hAnsi="Consolas"/>
+                <w:sz w:val="18"/>
+                <w:szCs w:val="18"/>
+              </w:rPr>
+              <w:t xml:space="preserve">Textblock</w:t>
             </w:r>
             <w:r>
               <w:rPr>
@@ -10528,13 +10427,20 @@
                 <w:sz w:val="18"/>
                 <w:szCs w:val="18"/>
               </w:rPr>
-              <w:t xml:space="preserve">EPOS.Kern.Tests/DiagnosedatenTests.cs</w:t>
-            </w:r>
-          </w:p>
-        </w:tc>
-        <w:tc>
-          <w:tcPr>
-            <w:tcW w:type="dxa" w:w="547"/>
+              <w:t xml:space="preserve">ProtokollordnerPfad</w:t>
+            </w:r>
+            <w:r>
+              <w:rPr>
+                <w:sz w:val="19"/>
+                <w:szCs w:val="19"/>
+              </w:rPr>
+              <w:t xml:space="preserve">)</w:t>
+            </w:r>
+          </w:p>
+        </w:tc>
+        <w:tc>
+          <w:tcPr>
+            <w:tcW w:type="dxa" w:w="956"/>
             <w:tcBorders>
               <w:top w:val="single" w:color="A6A6A6" w:sz="4"/>
               <w:left w:val="single" w:color="A6A6A6" w:sz="4"/>
@@ -10569,75 +10475,60 @@
         </w:trPr>
         <w:tc>
           <w:tcPr>
-            <w:tcW w:type="dxa" w:w="3636"/>
-            <w:tcBorders>
-              <w:top w:val="single" w:color="A6A6A6" w:sz="4"/>
-              <w:left w:val="single" w:color="A6A6A6" w:sz="4"/>
-              <w:bottom w:val="single" w:color="A6A6A6" w:sz="4"/>
-              <w:right w:val="single" w:color="A6A6A6" w:sz="4"/>
-            </w:tcBorders>
-            <w:tcMar>
-              <w:top w:type="dxa" w:w="50"/>
-              <w:left w:type="dxa" w:w="90"/>
-              <w:bottom w:type="dxa" w:w="50"/>
-              <w:right w:type="dxa" w:w="90"/>
-            </w:tcMar>
-          </w:tcPr>
-          <w:p>
-            <w:pPr>
-              <w:spacing w:after="0"/>
-            </w:pPr>
-            <w:r>
-              <w:rPr>
-                <w:sz w:val="19"/>
-                <w:szCs w:val="19"/>
-              </w:rPr>
-              <w:t xml:space="preserve">Supportpaket</w:t>
-            </w:r>
-          </w:p>
-        </w:tc>
-        <w:tc>
-          <w:tcPr>
-            <w:tcW w:type="dxa" w:w="5455"/>
-            <w:tcBorders>
-              <w:top w:val="single" w:color="A6A6A6" w:sz="4"/>
-              <w:left w:val="single" w:color="A6A6A6" w:sz="4"/>
-              <w:bottom w:val="single" w:color="A6A6A6" w:sz="4"/>
-              <w:right w:val="single" w:color="A6A6A6" w:sz="4"/>
-            </w:tcBorders>
-            <w:tcMar>
-              <w:top w:type="dxa" w:w="50"/>
-              <w:left w:type="dxa" w:w="90"/>
-              <w:bottom w:type="dxa" w:w="50"/>
-              <w:right w:type="dxa" w:w="90"/>
-            </w:tcMar>
-          </w:tcPr>
-          <w:p>
-            <w:pPr>
-              <w:spacing w:after="0"/>
-            </w:pPr>
-            <w:r>
-              <w:rPr>
-                <w:rFonts w:ascii="Consolas" w:cs="Consolas" w:eastAsia="Consolas" w:hAnsi="Consolas"/>
-                <w:sz w:val="18"/>
-                <w:szCs w:val="18"/>
-              </w:rPr>
-              <w:t xml:space="preserve">EPOS.Kern/Allgemein/Support/Supportpaket.cs</w:t>
-            </w:r>
-            <w:r>
-              <w:rPr>
-                <w:sz w:val="19"/>
-                <w:szCs w:val="19"/>
-              </w:rPr>
-              <w:t xml:space="preserve"> (</w:t>
-            </w:r>
-            <w:r>
-              <w:rPr>
-                <w:rFonts w:ascii="Consolas" w:cs="Consolas" w:eastAsia="Consolas" w:hAnsi="Consolas"/>
-                <w:sz w:val="18"/>
-                <w:szCs w:val="18"/>
-              </w:rPr>
-              <w:t xml:space="preserve">Erstellen</w:t>
+            <w:tcW w:type="dxa" w:w="3473"/>
+            <w:tcBorders>
+              <w:top w:val="single" w:color="A6A6A6" w:sz="4"/>
+              <w:left w:val="single" w:color="A6A6A6" w:sz="4"/>
+              <w:bottom w:val="single" w:color="A6A6A6" w:sz="4"/>
+              <w:right w:val="single" w:color="A6A6A6" w:sz="4"/>
+            </w:tcBorders>
+            <w:tcMar>
+              <w:top w:type="dxa" w:w="50"/>
+              <w:left w:type="dxa" w:w="90"/>
+              <w:bottom w:type="dxa" w:w="50"/>
+              <w:right w:type="dxa" w:w="90"/>
+            </w:tcMar>
+          </w:tcPr>
+          <w:p>
+            <w:pPr>
+              <w:spacing w:after="0"/>
+            </w:pPr>
+            <w:r>
+              <w:rPr>
+                <w:sz w:val="19"/>
+                <w:szCs w:val="19"/>
+              </w:rPr>
+              <w:t xml:space="preserve">Tests des Über-Dialogs</w:t>
+            </w:r>
+          </w:p>
+        </w:tc>
+        <w:tc>
+          <w:tcPr>
+            <w:tcW w:type="dxa" w:w="5209"/>
+            <w:tcBorders>
+              <w:top w:val="single" w:color="A6A6A6" w:sz="4"/>
+              <w:left w:val="single" w:color="A6A6A6" w:sz="4"/>
+              <w:bottom w:val="single" w:color="A6A6A6" w:sz="4"/>
+              <w:right w:val="single" w:color="A6A6A6" w:sz="4"/>
+            </w:tcBorders>
+            <w:tcMar>
+              <w:top w:type="dxa" w:w="50"/>
+              <w:left w:type="dxa" w:w="90"/>
+              <w:bottom w:type="dxa" w:w="50"/>
+              <w:right w:type="dxa" w:w="90"/>
+            </w:tcMar>
+          </w:tcPr>
+          <w:p>
+            <w:pPr>
+              <w:spacing w:after="0"/>
+            </w:pPr>
+            <w:r>
+              <w:rPr>
+                <w:rFonts w:ascii="Consolas" w:cs="Consolas" w:eastAsia="Consolas" w:hAnsi="Consolas"/>
+                <w:sz w:val="18"/>
+                <w:szCs w:val="18"/>
+              </w:rPr>
+              <w:t xml:space="preserve">EPOS.UI.Tests/Dialoge/UeberDialogTests.cs</w:t>
             </w:r>
             <w:r>
               <w:rPr>
@@ -10652,125 +10543,13 @@
                 <w:sz w:val="18"/>
                 <w:szCs w:val="18"/>
               </w:rPr>
-              <w:t xml:space="preserve">Vorgabename</w:t>
-            </w:r>
-            <w:r>
-              <w:rPr>
-                <w:sz w:val="19"/>
-                <w:szCs w:val="19"/>
-              </w:rPr>
-              <w:t xml:space="preserve">, </w:t>
-            </w:r>
-            <w:r>
-              <w:rPr>
-                <w:rFonts w:ascii="Consolas" w:cs="Consolas" w:eastAsia="Consolas" w:hAnsi="Consolas"/>
-                <w:sz w:val="18"/>
-                <w:szCs w:val="18"/>
-              </w:rPr>
-              <w:t xml:space="preserve">Supportpaketergebnis</w:t>
-            </w:r>
-            <w:r>
-              <w:rPr>
-                <w:sz w:val="19"/>
-                <w:szCs w:val="19"/>
-              </w:rPr>
-              <w:t xml:space="preserve">), Anzeigeform </w:t>
-            </w:r>
-            <w:r>
-              <w:rPr>
-                <w:rFonts w:ascii="Consolas" w:cs="Consolas" w:eastAsia="Consolas" w:hAnsi="Consolas"/>
-                <w:sz w:val="18"/>
-                <w:szCs w:val="18"/>
-              </w:rPr>
-              <w:t xml:space="preserve">SupportpaketAnzeige</w:t>
-            </w:r>
-            <w:r>
-              <w:rPr>
-                <w:sz w:val="19"/>
-                <w:szCs w:val="19"/>
-              </w:rPr>
-              <w:t xml:space="preserve"> in </w:t>
-            </w:r>
-            <w:r>
-              <w:rPr>
-                <w:rFonts w:ascii="Consolas" w:cs="Consolas" w:eastAsia="Consolas" w:hAnsi="Consolas"/>
-                <w:sz w:val="18"/>
-                <w:szCs w:val="18"/>
-              </w:rPr>
-              <w:t xml:space="preserve">EPOS.UI/Dialoge/Hilfe/UeberDaten.cs</w:t>
-            </w:r>
-            <w:r>
-              <w:rPr>
-                <w:sz w:val="19"/>
-                <w:szCs w:val="19"/>
-              </w:rPr>
-              <w:t xml:space="preserve">, Hülle </w:t>
-            </w:r>
-            <w:r>
-              <w:rPr>
-                <w:rFonts w:ascii="Consolas" w:cs="Consolas" w:eastAsia="Consolas" w:hAnsi="Consolas"/>
-                <w:sz w:val="18"/>
-                <w:szCs w:val="18"/>
-              </w:rPr>
-              <w:t xml:space="preserve">UeberHuelle.SupportpaketSpeichern</w:t>
-            </w:r>
-            <w:r>
-              <w:rPr>
-                <w:sz w:val="19"/>
-                <w:szCs w:val="19"/>
-              </w:rPr>
-              <w:t xml:space="preserve">, Speicherdialog in </w:t>
-            </w:r>
-            <w:r>
-              <w:rPr>
-                <w:rFonts w:ascii="Consolas" w:cs="Consolas" w:eastAsia="Consolas" w:hAnsi="Consolas"/>
-                <w:sz w:val="18"/>
-                <w:szCs w:val="18"/>
-              </w:rPr>
-              <w:t xml:space="preserve">UeberFenster.SupportpaketSpeichern</w:t>
-            </w:r>
-            <w:r>
-              <w:rPr>
-                <w:sz w:val="19"/>
-                <w:szCs w:val="19"/>
-              </w:rPr>
-              <w:t xml:space="preserve">, Tests </w:t>
-            </w:r>
-            <w:r>
-              <w:rPr>
-                <w:rFonts w:ascii="Consolas" w:cs="Consolas" w:eastAsia="Consolas" w:hAnsi="Consolas"/>
-                <w:sz w:val="18"/>
-                <w:szCs w:val="18"/>
-              </w:rPr>
-              <w:t xml:space="preserve">EPOS.Kern.Tests/SupportpaketTests.cs</w:t>
-            </w:r>
-            <w:r>
-              <w:rPr>
-                <w:sz w:val="19"/>
-                <w:szCs w:val="19"/>
-              </w:rPr>
-              <w:t xml:space="preserve">; der Haken steht in </w:t>
-            </w:r>
-            <w:r>
-              <w:rPr>
-                <w:rFonts w:ascii="Consolas" w:cs="Consolas" w:eastAsia="Consolas" w:hAnsi="Consolas"/>
-                <w:sz w:val="18"/>
-                <w:szCs w:val="18"/>
-              </w:rPr>
-              <w:t xml:space="preserve">KiDialogAusnahmen</w:t>
-            </w:r>
-            <w:r>
-              <w:rPr>
-                <w:sz w:val="19"/>
-                <w:szCs w:val="19"/>
-              </w:rPr>
-              <w:t xml:space="preserve"> (Grund Export)</w:t>
-            </w:r>
-          </w:p>
-        </w:tc>
-        <w:tc>
-          <w:tcPr>
-            <w:tcW w:type="dxa" w:w="547"/>
+              <w:t xml:space="preserve">EPOS.Kern.Tests/DiagnosedatenTests.cs</w:t>
+            </w:r>
+          </w:p>
+        </w:tc>
+        <w:tc>
+          <w:tcPr>
+            <w:tcW w:type="dxa" w:w="956"/>
             <w:tcBorders>
               <w:top w:val="single" w:color="A6A6A6" w:sz="4"/>
               <w:left w:val="single" w:color="A6A6A6" w:sz="4"/>
@@ -10805,7 +10584,243 @@
         </w:trPr>
         <w:tc>
           <w:tcPr>
-            <w:tcW w:type="dxa" w:w="3636"/>
+            <w:tcW w:type="dxa" w:w="3473"/>
+            <w:tcBorders>
+              <w:top w:val="single" w:color="A6A6A6" w:sz="4"/>
+              <w:left w:val="single" w:color="A6A6A6" w:sz="4"/>
+              <w:bottom w:val="single" w:color="A6A6A6" w:sz="4"/>
+              <w:right w:val="single" w:color="A6A6A6" w:sz="4"/>
+            </w:tcBorders>
+            <w:tcMar>
+              <w:top w:type="dxa" w:w="50"/>
+              <w:left w:type="dxa" w:w="90"/>
+              <w:bottom w:type="dxa" w:w="50"/>
+              <w:right w:type="dxa" w:w="90"/>
+            </w:tcMar>
+          </w:tcPr>
+          <w:p>
+            <w:pPr>
+              <w:spacing w:after="0"/>
+            </w:pPr>
+            <w:r>
+              <w:rPr>
+                <w:sz w:val="19"/>
+                <w:szCs w:val="19"/>
+              </w:rPr>
+              <w:t xml:space="preserve">Supportpaket</w:t>
+            </w:r>
+          </w:p>
+        </w:tc>
+        <w:tc>
+          <w:tcPr>
+            <w:tcW w:type="dxa" w:w="5209"/>
+            <w:tcBorders>
+              <w:top w:val="single" w:color="A6A6A6" w:sz="4"/>
+              <w:left w:val="single" w:color="A6A6A6" w:sz="4"/>
+              <w:bottom w:val="single" w:color="A6A6A6" w:sz="4"/>
+              <w:right w:val="single" w:color="A6A6A6" w:sz="4"/>
+            </w:tcBorders>
+            <w:tcMar>
+              <w:top w:type="dxa" w:w="50"/>
+              <w:left w:type="dxa" w:w="90"/>
+              <w:bottom w:type="dxa" w:w="50"/>
+              <w:right w:type="dxa" w:w="90"/>
+            </w:tcMar>
+          </w:tcPr>
+          <w:p>
+            <w:pPr>
+              <w:spacing w:after="0"/>
+            </w:pPr>
+            <w:r>
+              <w:rPr>
+                <w:rFonts w:ascii="Consolas" w:cs="Consolas" w:eastAsia="Consolas" w:hAnsi="Consolas"/>
+                <w:sz w:val="18"/>
+                <w:szCs w:val="18"/>
+              </w:rPr>
+              <w:t xml:space="preserve">EPOS.Kern/Allgemein/Support/Supportpaket.cs</w:t>
+            </w:r>
+            <w:r>
+              <w:rPr>
+                <w:sz w:val="19"/>
+                <w:szCs w:val="19"/>
+              </w:rPr>
+              <w:t xml:space="preserve"> (</w:t>
+            </w:r>
+            <w:r>
+              <w:rPr>
+                <w:rFonts w:ascii="Consolas" w:cs="Consolas" w:eastAsia="Consolas" w:hAnsi="Consolas"/>
+                <w:sz w:val="18"/>
+                <w:szCs w:val="18"/>
+              </w:rPr>
+              <w:t xml:space="preserve">Erstellen</w:t>
+            </w:r>
+            <w:r>
+              <w:rPr>
+                <w:sz w:val="19"/>
+                <w:szCs w:val="19"/>
+              </w:rPr>
+              <w:t xml:space="preserve">, </w:t>
+            </w:r>
+            <w:r>
+              <w:rPr>
+                <w:rFonts w:ascii="Consolas" w:cs="Consolas" w:eastAsia="Consolas" w:hAnsi="Consolas"/>
+                <w:sz w:val="18"/>
+                <w:szCs w:val="18"/>
+              </w:rPr>
+              <w:t xml:space="preserve">Vorgabename</w:t>
+            </w:r>
+            <w:r>
+              <w:rPr>
+                <w:sz w:val="19"/>
+                <w:szCs w:val="19"/>
+              </w:rPr>
+              <w:t xml:space="preserve">, </w:t>
+            </w:r>
+            <w:r>
+              <w:rPr>
+                <w:rFonts w:ascii="Consolas" w:cs="Consolas" w:eastAsia="Consolas" w:hAnsi="Consolas"/>
+                <w:sz w:val="18"/>
+                <w:szCs w:val="18"/>
+              </w:rPr>
+              <w:t xml:space="preserve">Supportpaketergebnis</w:t>
+            </w:r>
+            <w:r>
+              <w:rPr>
+                <w:sz w:val="19"/>
+                <w:szCs w:val="19"/>
+              </w:rPr>
+              <w:t xml:space="preserve">), Anzeigeform </w:t>
+            </w:r>
+            <w:r>
+              <w:rPr>
+                <w:rFonts w:ascii="Consolas" w:cs="Consolas" w:eastAsia="Consolas" w:hAnsi="Consolas"/>
+                <w:sz w:val="18"/>
+                <w:szCs w:val="18"/>
+              </w:rPr>
+              <w:t xml:space="preserve">SupportpaketAnzeige</w:t>
+            </w:r>
+            <w:r>
+              <w:rPr>
+                <w:sz w:val="19"/>
+                <w:szCs w:val="19"/>
+              </w:rPr>
+              <w:t xml:space="preserve"> in </w:t>
+            </w:r>
+            <w:r>
+              <w:rPr>
+                <w:rFonts w:ascii="Consolas" w:cs="Consolas" w:eastAsia="Consolas" w:hAnsi="Consolas"/>
+                <w:sz w:val="18"/>
+                <w:szCs w:val="18"/>
+              </w:rPr>
+              <w:t xml:space="preserve">EPOS.UI/Dialoge/Hilfe/UeberDaten.cs</w:t>
+            </w:r>
+            <w:r>
+              <w:rPr>
+                <w:sz w:val="19"/>
+                <w:szCs w:val="19"/>
+              </w:rPr>
+              <w:t xml:space="preserve">, Hülle </w:t>
+            </w:r>
+            <w:r>
+              <w:rPr>
+                <w:rFonts w:ascii="Consolas" w:cs="Consolas" w:eastAsia="Consolas" w:hAnsi="Consolas"/>
+                <w:sz w:val="18"/>
+                <w:szCs w:val="18"/>
+              </w:rPr>
+              <w:t xml:space="preserve">UeberHuelle.SupportpaketSpeichern</w:t>
+            </w:r>
+            <w:r>
+              <w:rPr>
+                <w:sz w:val="19"/>
+                <w:szCs w:val="19"/>
+              </w:rPr>
+              <w:t xml:space="preserve">, Speicherdialog in </w:t>
+            </w:r>
+            <w:r>
+              <w:rPr>
+                <w:rFonts w:ascii="Consolas" w:cs="Consolas" w:eastAsia="Consolas" w:hAnsi="Consolas"/>
+                <w:sz w:val="18"/>
+                <w:szCs w:val="18"/>
+              </w:rPr>
+              <w:t xml:space="preserve">UeberFenster.SupportpaketSpeichern</w:t>
+            </w:r>
+            <w:r>
+              <w:rPr>
+                <w:sz w:val="19"/>
+                <w:szCs w:val="19"/>
+              </w:rPr>
+              <w:t xml:space="preserve">, Tests </w:t>
+            </w:r>
+            <w:r>
+              <w:rPr>
+                <w:rFonts w:ascii="Consolas" w:cs="Consolas" w:eastAsia="Consolas" w:hAnsi="Consolas"/>
+                <w:sz w:val="18"/>
+                <w:szCs w:val="18"/>
+              </w:rPr>
+              <w:t xml:space="preserve">EPOS.Kern.Tests/SupportpaketTests.cs</w:t>
+            </w:r>
+            <w:r>
+              <w:rPr>
+                <w:sz w:val="19"/>
+                <w:szCs w:val="19"/>
+              </w:rPr>
+              <w:t xml:space="preserve">; der Haken steht in </w:t>
+            </w:r>
+            <w:r>
+              <w:rPr>
+                <w:rFonts w:ascii="Consolas" w:cs="Consolas" w:eastAsia="Consolas" w:hAnsi="Consolas"/>
+                <w:sz w:val="18"/>
+                <w:szCs w:val="18"/>
+              </w:rPr>
+              <w:t xml:space="preserve">KiDialogAusnahmen</w:t>
+            </w:r>
+            <w:r>
+              <w:rPr>
+                <w:sz w:val="19"/>
+                <w:szCs w:val="19"/>
+              </w:rPr>
+              <w:t xml:space="preserve"> (Grund Export)</w:t>
+            </w:r>
+          </w:p>
+        </w:tc>
+        <w:tc>
+          <w:tcPr>
+            <w:tcW w:type="dxa" w:w="956"/>
+            <w:tcBorders>
+              <w:top w:val="single" w:color="A6A6A6" w:sz="4"/>
+              <w:left w:val="single" w:color="A6A6A6" w:sz="4"/>
+              <w:bottom w:val="single" w:color="A6A6A6" w:sz="4"/>
+              <w:right w:val="single" w:color="A6A6A6" w:sz="4"/>
+            </w:tcBorders>
+            <w:tcMar>
+              <w:top w:type="dxa" w:w="50"/>
+              <w:left w:type="dxa" w:w="90"/>
+              <w:bottom w:type="dxa" w:w="50"/>
+              <w:right w:type="dxa" w:w="90"/>
+            </w:tcMar>
+          </w:tcPr>
+          <w:p>
+            <w:pPr>
+              <w:spacing w:after="0"/>
+            </w:pPr>
+            <w:r>
+              <w:rPr>
+                <w:sz w:val="19"/>
+                <w:szCs w:val="19"/>
+              </w:rPr>
+              <w:t xml:space="preserve">heute</w:t>
+            </w:r>
+          </w:p>
+        </w:tc>
+      </w:tr>
+      <w:tr>
+        <w:trPr>
+          <w:cantSplit/>
+          <w:tblHeader w:val="false"/>
+        </w:trPr>
+        <w:tc>
+          <w:tcPr>
+            <w:tcW w:type="dxa" w:w="3473"/>
             <w:tcBorders>
               <w:top w:val="single" w:color="A6A6A6" w:sz="4"/>
               <w:left w:val="single" w:color="A6A6A6" w:sz="4"/>
@@ -10834,7 +10849,7 @@
         </w:tc>
         <w:tc>
           <w:tcPr>
-            <w:tcW w:type="dxa" w:w="5455"/>
+            <w:tcW w:type="dxa" w:w="5209"/>
             <w:tcBorders>
               <w:top w:val="single" w:color="A6A6A6" w:sz="4"/>
               <w:left w:val="single" w:color="A6A6A6" w:sz="4"/>
@@ -10894,7 +10909,7 @@
         </w:tc>
         <w:tc>
           <w:tcPr>
-            <w:tcW w:type="dxa" w:w="547"/>
+            <w:tcW w:type="dxa" w:w="956"/>
             <w:tcBorders>
               <w:top w:val="single" w:color="A6A6A6" w:sz="4"/>
               <w:left w:val="single" w:color="A6A6A6" w:sz="4"/>
@@ -11207,7 +11222,7 @@
                 <w:sz w:val="19"/>
                 <w:szCs w:val="19"/>
               </w:rPr>
-              <w:t xml:space="preserve">Fernwartung unter Windows: Menüpunkt, Dialog, Lizenzbedingung, Fernwartungsseite; Zuarbeit INEKON: Server, Client, Seite, Signatur. Das iPad ist zurückgestellt</w:t>
+              <w:t xml:space="preserve">Fernwartung unter Windows: Menüpunkt, Dialog, Lizenzbedingung, Fernwartungsseite; Zuarbeit INEKON: Microsoft-Konto, Seite. Das iPad ist zurückgestellt</w:t>
             </w:r>
           </w:p>
         </w:tc>
@@ -11236,7 +11251,7 @@
                 <w:sz w:val="19"/>
                 <w:szCs w:val="19"/>
               </w:rPr>
-              <w:t xml:space="preserve">umgesetzt (11.10.2026, #985); offen beim Anwender: Fernwartungsseite, Server, signierter Client</w:t>
+              <w:t xml:space="preserve">umgesetzt (11.10.2026, #985); Nachzug Quick Assist (#998); offen beim Anwender: Microsoft-Konto des Supports, Fernwartungsseite als Anleitung</w:t>
             </w:r>
           </w:p>
         </w:tc>

</xml_diff>